<commit_message>
Modification to close issue #6
Update of User's Manual
</commit_message>
<xml_diff>
--- a/eclipse_project/LSPB UM.docx
+++ b/eclipse_project/LSPB UM.docx
@@ -6537,8 +6537,6 @@
           <w:t>t</w:t>
         </w:r>
       </w:ins>
-      <w:bookmarkStart w:id="34" w:name="_GoBack"/>
-      <w:bookmarkEnd w:id="34"/>
       <w:r>
         <w:rPr>
           <w:lang w:val="en-US"/>
@@ -6579,7 +6577,7 @@
           <v:shape id="_x0000_i1025" type="#_x0000_t75" style="width:77pt;height:50pt" o:ole="">
             <v:imagedata r:id="rId14" o:title=""/>
           </v:shape>
-          <o:OLEObject Type="Embed" ProgID="Package" ShapeID="_x0000_i1025" DrawAspect="Icon" ObjectID="_1847285013" r:id="rId15"/>
+          <o:OLEObject Type="Embed" ProgID="Package" ShapeID="_x0000_i1025" DrawAspect="Icon" ObjectID="_1847377058" r:id="rId15"/>
         </w:object>
       </w:r>
     </w:p>
@@ -7601,13 +7599,13 @@
           <w:lang w:val="en-US"/>
         </w:rPr>
       </w:pPr>
-      <w:ins w:id="35" w:author="Pascal Heude" w:date="2026-08-01T19:23:00Z">
+      <w:ins w:id="34" w:author="Pascal Heude" w:date="2026-08-01T19:23:00Z">
         <w:r>
           <w:rPr>
             <w:b/>
             <w:color w:val="0070C0"/>
             <w:lang w:val="en-US"/>
-            <w:rPrChange w:id="36" w:author="Pascal Heude" w:date="2026-08-01T19:24:00Z">
+            <w:rPrChange w:id="35" w:author="Pascal Heude" w:date="2026-08-01T19:24:00Z">
               <w:rPr>
                 <w:lang w:val="en-US"/>
               </w:rPr>
@@ -7622,7 +7620,7 @@
           <w:t xml:space="preserve">: </w:t>
         </w:r>
       </w:ins>
-      <w:del w:id="37" w:author="Pascal Heude" w:date="2026-08-03T17:57:00Z">
+      <w:del w:id="36" w:author="Pascal Heude" w:date="2026-08-03T17:57:00Z">
         <w:r>
           <w:rPr>
             <w:lang w:val="en-US"/>
@@ -7630,7 +7628,7 @@
           <w:delText>A</w:delText>
         </w:r>
       </w:del>
-      <w:ins w:id="38" w:author="Pascal Heude" w:date="2026-08-03T17:57:00Z">
+      <w:ins w:id="37" w:author="Pascal Heude" w:date="2026-08-03T17:57:00Z">
         <w:r>
           <w:rPr>
             <w:lang w:val="en-US"/>
@@ -9237,16 +9235,16 @@
       <w:pPr>
         <w:pStyle w:val="Titre3"/>
       </w:pPr>
-      <w:bookmarkStart w:id="39" w:name="_Tag_ARINC665_CONFIGURATION_FILE"/>
-      <w:bookmarkStart w:id="40" w:name="_Toc456106018"/>
+      <w:bookmarkStart w:id="38" w:name="_Tag_ARINC665_CONFIGURATION_FILE"/>
+      <w:bookmarkStart w:id="39" w:name="_Toc456106018"/>
+      <w:bookmarkEnd w:id="38"/>
+      <w:r>
+        <w:t xml:space="preserve">Tag </w:t>
+      </w:r>
+      <w:r>
+        <w:t>ARINC665_CONFIGURATION_FILE</w:t>
+      </w:r>
       <w:bookmarkEnd w:id="39"/>
-      <w:r>
-        <w:t xml:space="preserve">Tag </w:t>
-      </w:r>
-      <w:r>
-        <w:t>ARINC665_CONFIGURATION_FILE</w:t>
-      </w:r>
-      <w:bookmarkEnd w:id="40"/>
     </w:p>
     <w:p>
       <w:pPr>
@@ -9264,17 +9262,17 @@
     <w:p>
       <w:pPr>
         <w:rPr>
-          <w:moveTo w:id="41" w:author="Pascal Heude" w:date="2026-08-01T19:24:00Z"/>
-          <w:lang w:val="en-US"/>
-        </w:rPr>
-      </w:pPr>
-      <w:ins w:id="42" w:author="Pascal Heude" w:date="2026-08-01T19:24:00Z">
+          <w:moveTo w:id="40" w:author="Pascal Heude" w:date="2026-08-01T19:24:00Z"/>
+          <w:lang w:val="en-US"/>
+        </w:rPr>
+      </w:pPr>
+      <w:ins w:id="41" w:author="Pascal Heude" w:date="2026-08-01T19:24:00Z">
         <w:r>
           <w:rPr>
             <w:b/>
             <w:color w:val="0070C0"/>
             <w:lang w:val="en-US"/>
-            <w:rPrChange w:id="43" w:author="Pascal Heude" w:date="2026-08-01T19:25:00Z">
+            <w:rPrChange w:id="42" w:author="Pascal Heude" w:date="2026-08-01T19:25:00Z">
               <w:rPr>
                 <w:lang w:val="en-US"/>
               </w:rPr>
@@ -9283,13 +9281,13 @@
           <w:t>URQT</w:t>
         </w:r>
       </w:ins>
-      <w:ins w:id="44" w:author="Pascal Heude" w:date="2026-08-01T19:25:00Z">
+      <w:ins w:id="43" w:author="Pascal Heude" w:date="2026-08-01T19:25:00Z">
         <w:r>
           <w:rPr>
             <w:b/>
             <w:color w:val="0070C0"/>
             <w:lang w:val="en-US"/>
-            <w:rPrChange w:id="45" w:author="Pascal Heude" w:date="2026-08-01T19:25:00Z">
+            <w:rPrChange w:id="44" w:author="Pascal Heude" w:date="2026-08-01T19:25:00Z">
               <w:rPr>
                 <w:lang w:val="en-US"/>
               </w:rPr>
@@ -9304,9 +9302,9 @@
           <w:t xml:space="preserve">: </w:t>
         </w:r>
       </w:ins>
-      <w:moveToRangeStart w:id="46" w:author="Pascal Heude" w:date="2026-08-01T19:24:00Z" w:name="move236504710"/>
-      <w:moveTo w:id="47" w:author="Pascal Heude" w:date="2026-08-01T19:24:00Z">
-        <w:del w:id="48" w:author="Pascal Heude" w:date="2026-08-03T17:57:00Z">
+      <w:moveToRangeStart w:id="45" w:author="Pascal Heude" w:date="2026-08-01T19:24:00Z" w:name="move236504710"/>
+      <w:moveTo w:id="46" w:author="Pascal Heude" w:date="2026-08-01T19:24:00Z">
+        <w:del w:id="47" w:author="Pascal Heude" w:date="2026-08-03T17:57:00Z">
           <w:r>
             <w:rPr>
               <w:lang w:val="en-US"/>
@@ -9315,7 +9313,7 @@
           </w:r>
         </w:del>
       </w:moveTo>
-      <w:ins w:id="49" w:author="Pascal Heude" w:date="2026-08-03T17:57:00Z">
+      <w:ins w:id="48" w:author="Pascal Heude" w:date="2026-08-03T17:57:00Z">
         <w:r>
           <w:rPr>
             <w:lang w:val="en-US"/>
@@ -9323,14 +9321,14 @@
           <w:t>t</w:t>
         </w:r>
       </w:ins>
-      <w:moveTo w:id="50" w:author="Pascal Heude" w:date="2026-08-01T19:24:00Z">
+      <w:moveTo w:id="49" w:author="Pascal Heude" w:date="2026-08-01T19:24:00Z">
         <w:r>
           <w:rPr>
             <w:lang w:val="en-US"/>
           </w:rPr>
           <w:t xml:space="preserve">his tag </w:t>
         </w:r>
-        <w:del w:id="51" w:author="Pascal Heude" w:date="2026-08-01T19:25:00Z">
+        <w:del w:id="50" w:author="Pascal Heude" w:date="2026-08-01T19:25:00Z">
           <w:r>
             <w:rPr>
               <w:lang w:val="en-US"/>
@@ -9339,7 +9337,7 @@
           </w:r>
         </w:del>
       </w:moveTo>
-      <w:ins w:id="52" w:author="Pascal Heude" w:date="2026-08-01T19:25:00Z">
+      <w:ins w:id="51" w:author="Pascal Heude" w:date="2026-08-01T19:25:00Z">
         <w:r>
           <w:rPr>
             <w:lang w:val="en-US"/>
@@ -9347,7 +9345,7 @@
           <w:t>shall be</w:t>
         </w:r>
       </w:ins>
-      <w:moveTo w:id="53" w:author="Pascal Heude" w:date="2026-08-01T19:24:00Z">
+      <w:moveTo w:id="52" w:author="Pascal Heude" w:date="2026-08-01T19:24:00Z">
         <w:r>
           <w:rPr>
             <w:lang w:val="en-US"/>
@@ -9356,20 +9354,20 @@
         </w:r>
       </w:moveTo>
     </w:p>
-    <w:moveToRangeEnd w:id="46"/>
-    <w:p>
-      <w:pPr>
-        <w:rPr>
-          <w:lang w:val="en-US"/>
-        </w:rPr>
-      </w:pPr>
-      <w:ins w:id="54" w:author="Pascal Heude" w:date="2026-08-01T19:25:00Z">
+    <w:moveToRangeEnd w:id="45"/>
+    <w:p>
+      <w:pPr>
+        <w:rPr>
+          <w:lang w:val="en-US"/>
+        </w:rPr>
+      </w:pPr>
+      <w:ins w:id="53" w:author="Pascal Heude" w:date="2026-08-01T19:25:00Z">
         <w:r>
           <w:rPr>
             <w:b/>
             <w:color w:val="0070C0"/>
             <w:lang w:val="en-US"/>
-            <w:rPrChange w:id="55" w:author="Pascal Heude" w:date="2026-08-01T19:25:00Z">
+            <w:rPrChange w:id="54" w:author="Pascal Heude" w:date="2026-08-01T19:25:00Z">
               <w:rPr>
                 <w:lang w:val="en-US"/>
               </w:rPr>
@@ -9384,7 +9382,7 @@
           <w:t xml:space="preserve">: </w:t>
         </w:r>
       </w:ins>
-      <w:del w:id="56" w:author="Pascal Heude" w:date="2026-08-03T17:57:00Z">
+      <w:del w:id="55" w:author="Pascal Heude" w:date="2026-08-03T17:57:00Z">
         <w:r>
           <w:rPr>
             <w:lang w:val="en-US"/>
@@ -9392,7 +9390,7 @@
           <w:delText>T</w:delText>
         </w:r>
       </w:del>
-      <w:ins w:id="57" w:author="Pascal Heude" w:date="2026-08-03T17:57:00Z">
+      <w:ins w:id="56" w:author="Pascal Heude" w:date="2026-08-03T17:57:00Z">
         <w:r>
           <w:rPr>
             <w:lang w:val="en-US"/>
@@ -9512,12 +9510,12 @@
     <w:p>
       <w:pPr>
         <w:rPr>
-          <w:moveFrom w:id="58" w:author="Pascal Heude" w:date="2026-08-01T19:24:00Z"/>
-          <w:lang w:val="en-US"/>
-        </w:rPr>
-      </w:pPr>
-      <w:moveFromRangeStart w:id="59" w:author="Pascal Heude" w:date="2026-08-01T19:24:00Z" w:name="move236504710"/>
-      <w:moveFrom w:id="60" w:author="Pascal Heude" w:date="2026-08-01T19:24:00Z">
+          <w:moveFrom w:id="57" w:author="Pascal Heude" w:date="2026-08-01T19:24:00Z"/>
+          <w:lang w:val="en-US"/>
+        </w:rPr>
+      </w:pPr>
+      <w:moveFromRangeStart w:id="58" w:author="Pascal Heude" w:date="2026-08-01T19:24:00Z" w:name="move236504710"/>
+      <w:moveFrom w:id="59" w:author="Pascal Heude" w:date="2026-08-01T19:24:00Z">
         <w:r>
           <w:rPr>
             <w:lang w:val="en-US"/>
@@ -9526,7 +9524,7 @@
         </w:r>
       </w:moveFrom>
     </w:p>
-    <w:moveFromRangeEnd w:id="59"/>
+    <w:moveFromRangeEnd w:id="58"/>
     <w:p>
       <w:pPr>
         <w:rPr>
@@ -9713,16 +9711,16 @@
           <w:lang w:val="en-US"/>
         </w:rPr>
       </w:pPr>
-      <w:bookmarkStart w:id="61" w:name="_Tag_KEY"/>
-      <w:bookmarkStart w:id="62" w:name="_Toc456106019"/>
+      <w:bookmarkStart w:id="60" w:name="_Tag_KEY"/>
+      <w:bookmarkStart w:id="61" w:name="_Toc456106019"/>
+      <w:bookmarkEnd w:id="60"/>
+      <w:r>
+        <w:rPr>
+          <w:lang w:val="en-US"/>
+        </w:rPr>
+        <w:t>Tag KEY</w:t>
+      </w:r>
       <w:bookmarkEnd w:id="61"/>
-      <w:r>
-        <w:rPr>
-          <w:lang w:val="en-US"/>
-        </w:rPr>
-        <w:t>Tag KEY</w:t>
-      </w:r>
-      <w:bookmarkEnd w:id="62"/>
     </w:p>
     <w:p>
       <w:pPr>
@@ -9755,13 +9753,13 @@
           <w:lang w:val="en-US"/>
         </w:rPr>
       </w:pPr>
-      <w:ins w:id="63" w:author="Pascal Heude" w:date="2026-08-01T19:26:00Z">
+      <w:ins w:id="62" w:author="Pascal Heude" w:date="2026-08-01T19:26:00Z">
         <w:r>
           <w:rPr>
             <w:b/>
             <w:color w:val="0070C0"/>
             <w:lang w:val="en-US"/>
-            <w:rPrChange w:id="64" w:author="Pascal Heude" w:date="2026-08-01T19:26:00Z">
+            <w:rPrChange w:id="63" w:author="Pascal Heude" w:date="2026-08-01T19:26:00Z">
               <w:rPr>
                 <w:lang w:val="en-US"/>
               </w:rPr>
@@ -9776,7 +9774,7 @@
           <w:t xml:space="preserve">: </w:t>
         </w:r>
       </w:ins>
-      <w:del w:id="65" w:author="Pascal Heude" w:date="2026-08-03T17:57:00Z">
+      <w:del w:id="64" w:author="Pascal Heude" w:date="2026-08-03T17:57:00Z">
         <w:r>
           <w:rPr>
             <w:lang w:val="en-US"/>
@@ -9784,7 +9782,7 @@
           <w:delText>T</w:delText>
         </w:r>
       </w:del>
-      <w:ins w:id="66" w:author="Pascal Heude" w:date="2026-08-03T17:57:00Z">
+      <w:ins w:id="65" w:author="Pascal Heude" w:date="2026-08-03T17:57:00Z">
         <w:r>
           <w:rPr>
             <w:lang w:val="en-US"/>
@@ -9955,13 +9953,13 @@
       <w:pPr>
         <w:pStyle w:val="Titre3"/>
       </w:pPr>
-      <w:bookmarkStart w:id="67" w:name="_Tag_BATCH"/>
-      <w:bookmarkStart w:id="68" w:name="_Toc456106020"/>
+      <w:bookmarkStart w:id="66" w:name="_Tag_BATCH"/>
+      <w:bookmarkStart w:id="67" w:name="_Toc456106020"/>
+      <w:bookmarkEnd w:id="66"/>
+      <w:r>
+        <w:t>Tag BATCH</w:t>
+      </w:r>
       <w:bookmarkEnd w:id="67"/>
-      <w:r>
-        <w:t>Tag BATCH</w:t>
-      </w:r>
-      <w:bookmarkEnd w:id="68"/>
     </w:p>
     <w:p>
       <w:pPr>
@@ -9994,29 +9992,28 @@
           <w:lang w:val="en-US"/>
         </w:rPr>
       </w:pPr>
-      <w:ins w:id="69" w:author="Pascal Heude" w:date="2026-08-01T19:29:00Z">
+      <w:ins w:id="68" w:author="Pascal Heude" w:date="2026-08-01T19:29:00Z">
         <w:r>
           <w:rPr>
             <w:b/>
             <w:color w:val="0070C0"/>
             <w:lang w:val="en-US"/>
-            <w:rPrChange w:id="70" w:author="Pascal Heude" w:date="2026-08-01T19:30:00Z">
+            <w:rPrChange w:id="69" w:author="Pascal Heude" w:date="2026-08-01T19:30:00Z">
               <w:rPr>
                 <w:lang w:val="en-US"/>
               </w:rPr>
             </w:rPrChange>
           </w:rPr>
-          <w:lastRenderedPageBreak/>
           <w:t>URQT_</w:t>
         </w:r>
       </w:ins>
-      <w:ins w:id="71" w:author="Pascal Heude" w:date="2026-08-01T19:30:00Z">
+      <w:ins w:id="70" w:author="Pascal Heude" w:date="2026-08-01T19:30:00Z">
         <w:r>
           <w:rPr>
             <w:b/>
             <w:color w:val="0070C0"/>
             <w:lang w:val="en-US"/>
-            <w:rPrChange w:id="72" w:author="Pascal Heude" w:date="2026-08-01T19:30:00Z">
+            <w:rPrChange w:id="71" w:author="Pascal Heude" w:date="2026-08-01T19:30:00Z">
               <w:rPr>
                 <w:lang w:val="en-US"/>
               </w:rPr>
@@ -10039,7 +10036,7 @@
           <w:t xml:space="preserve">: </w:t>
         </w:r>
       </w:ins>
-      <w:del w:id="73" w:author="Pascal Heude" w:date="2026-08-03T17:57:00Z">
+      <w:del w:id="72" w:author="Pascal Heude" w:date="2026-08-03T17:57:00Z">
         <w:r>
           <w:rPr>
             <w:lang w:val="en-US"/>
@@ -10047,7 +10044,7 @@
           <w:delText>T</w:delText>
         </w:r>
       </w:del>
-      <w:ins w:id="74" w:author="Pascal Heude" w:date="2026-08-03T17:57:00Z">
+      <w:ins w:id="73" w:author="Pascal Heude" w:date="2026-08-03T17:57:00Z">
         <w:r>
           <w:rPr>
             <w:lang w:val="en-US"/>
@@ -10101,6 +10098,7 @@
         <w:rPr>
           <w:lang w:val="en-US"/>
         </w:rPr>
+        <w:lastRenderedPageBreak/>
         <w:t>NO : no files will be generated</w:t>
       </w:r>
     </w:p>
@@ -10269,13 +10267,13 @@
       <w:pPr>
         <w:pStyle w:val="Titre3"/>
       </w:pPr>
-      <w:bookmarkStart w:id="75" w:name="_Tag_CODE"/>
-      <w:bookmarkStart w:id="76" w:name="_Toc456106021"/>
+      <w:bookmarkStart w:id="74" w:name="_Tag_CODE"/>
+      <w:bookmarkStart w:id="75" w:name="_Toc456106021"/>
+      <w:bookmarkEnd w:id="74"/>
+      <w:r>
+        <w:t>Tag CODE</w:t>
+      </w:r>
       <w:bookmarkEnd w:id="75"/>
-      <w:r>
-        <w:t>Tag CODE</w:t>
-      </w:r>
-      <w:bookmarkEnd w:id="76"/>
     </w:p>
     <w:p>
       <w:pPr>
@@ -10293,12 +10291,12 @@
     <w:p>
       <w:pPr>
         <w:rPr>
-          <w:moveFrom w:id="77" w:author="Pascal Heude" w:date="2026-08-01T19:35:00Z"/>
-          <w:lang w:val="en-US"/>
-        </w:rPr>
-      </w:pPr>
-      <w:moveFromRangeStart w:id="78" w:author="Pascal Heude" w:date="2026-08-01T19:35:00Z" w:name="move236505319"/>
-      <w:moveFrom w:id="79" w:author="Pascal Heude" w:date="2026-08-01T19:35:00Z">
+          <w:moveFrom w:id="76" w:author="Pascal Heude" w:date="2026-08-01T19:35:00Z"/>
+          <w:lang w:val="en-US"/>
+        </w:rPr>
+      </w:pPr>
+      <w:moveFromRangeStart w:id="77" w:author="Pascal Heude" w:date="2026-08-01T19:35:00Z" w:name="move236505319"/>
+      <w:moveFrom w:id="78" w:author="Pascal Heude" w:date="2026-08-01T19:35:00Z">
         <w:r>
           <w:rPr>
             <w:lang w:val="en-US"/>
@@ -10331,20 +10329,20 @@
         </w:r>
       </w:moveFrom>
     </w:p>
-    <w:moveFromRangeEnd w:id="78"/>
-    <w:p>
-      <w:pPr>
-        <w:rPr>
-          <w:lang w:val="en-US"/>
-        </w:rPr>
-      </w:pPr>
-      <w:ins w:id="80" w:author="Pascal Heude" w:date="2026-08-01T19:35:00Z">
+    <w:moveFromRangeEnd w:id="77"/>
+    <w:p>
+      <w:pPr>
+        <w:rPr>
+          <w:lang w:val="en-US"/>
+        </w:rPr>
+      </w:pPr>
+      <w:ins w:id="79" w:author="Pascal Heude" w:date="2026-08-01T19:35:00Z">
         <w:r>
           <w:rPr>
             <w:b/>
             <w:color w:val="0070C0"/>
             <w:lang w:val="en-US"/>
-            <w:rPrChange w:id="81" w:author="Pascal Heude" w:date="2026-08-01T19:35:00Z">
+            <w:rPrChange w:id="80" w:author="Pascal Heude" w:date="2026-08-01T19:35:00Z">
               <w:rPr>
                 <w:lang w:val="en-US"/>
               </w:rPr>
@@ -10359,7 +10357,7 @@
           <w:t xml:space="preserve">: </w:t>
         </w:r>
       </w:ins>
-      <w:del w:id="82" w:author="Pascal Heude" w:date="2026-08-03T17:56:00Z">
+      <w:del w:id="81" w:author="Pascal Heude" w:date="2026-08-03T17:56:00Z">
         <w:r>
           <w:rPr>
             <w:lang w:val="en-US"/>
@@ -10367,7 +10365,7 @@
           <w:delText>T</w:delText>
         </w:r>
       </w:del>
-      <w:ins w:id="83" w:author="Pascal Heude" w:date="2026-08-03T17:56:00Z">
+      <w:ins w:id="82" w:author="Pascal Heude" w:date="2026-08-03T17:56:00Z">
         <w:r>
           <w:rPr>
             <w:lang w:val="en-US"/>
@@ -10381,7 +10379,7 @@
         </w:rPr>
         <w:t xml:space="preserve">his tag </w:t>
       </w:r>
-      <w:ins w:id="84" w:author="Pascal Heude" w:date="2026-08-01T19:35:00Z">
+      <w:ins w:id="83" w:author="Pascal Heude" w:date="2026-08-01T19:35:00Z">
         <w:r>
           <w:rPr>
             <w:lang w:val="en-US"/>
@@ -10389,7 +10387,7 @@
           <w:t xml:space="preserve">shall be </w:t>
         </w:r>
       </w:ins>
-      <w:del w:id="85" w:author="Pascal Heude" w:date="2026-08-01T19:35:00Z">
+      <w:del w:id="84" w:author="Pascal Heude" w:date="2026-08-01T19:35:00Z">
         <w:r>
           <w:rPr>
             <w:lang w:val="en-US"/>
@@ -10407,17 +10405,17 @@
     <w:p>
       <w:pPr>
         <w:rPr>
-          <w:moveTo w:id="86" w:author="Pascal Heude" w:date="2026-08-01T19:35:00Z"/>
-          <w:lang w:val="en-US"/>
-        </w:rPr>
-      </w:pPr>
-      <w:ins w:id="87" w:author="Pascal Heude" w:date="2026-08-01T19:35:00Z">
+          <w:moveTo w:id="85" w:author="Pascal Heude" w:date="2026-08-01T19:35:00Z"/>
+          <w:lang w:val="en-US"/>
+        </w:rPr>
+      </w:pPr>
+      <w:ins w:id="86" w:author="Pascal Heude" w:date="2026-08-01T19:35:00Z">
         <w:r>
           <w:rPr>
             <w:b/>
             <w:color w:val="0070C0"/>
             <w:lang w:val="en-US"/>
-            <w:rPrChange w:id="88" w:author="Pascal Heude" w:date="2026-08-01T19:35:00Z">
+            <w:rPrChange w:id="87" w:author="Pascal Heude" w:date="2026-08-01T19:35:00Z">
               <w:rPr>
                 <w:lang w:val="en-US"/>
               </w:rPr>
@@ -10432,9 +10430,9 @@
           <w:t xml:space="preserve">: </w:t>
         </w:r>
       </w:ins>
-      <w:moveToRangeStart w:id="89" w:author="Pascal Heude" w:date="2026-08-01T19:35:00Z" w:name="move236505319"/>
-      <w:moveTo w:id="90" w:author="Pascal Heude" w:date="2026-08-01T19:35:00Z">
-        <w:del w:id="91" w:author="Pascal Heude" w:date="2026-08-03T17:56:00Z">
+      <w:moveToRangeStart w:id="88" w:author="Pascal Heude" w:date="2026-08-01T19:35:00Z" w:name="move236505319"/>
+      <w:moveTo w:id="89" w:author="Pascal Heude" w:date="2026-08-01T19:35:00Z">
+        <w:del w:id="90" w:author="Pascal Heude" w:date="2026-08-03T17:56:00Z">
           <w:r>
             <w:rPr>
               <w:lang w:val="en-US"/>
@@ -10443,7 +10441,7 @@
           </w:r>
         </w:del>
       </w:moveTo>
-      <w:ins w:id="92" w:author="Pascal Heude" w:date="2026-08-03T17:56:00Z">
+      <w:ins w:id="91" w:author="Pascal Heude" w:date="2026-08-03T17:56:00Z">
         <w:r>
           <w:rPr>
             <w:lang w:val="en-US"/>
@@ -10451,7 +10449,7 @@
           <w:t>t</w:t>
         </w:r>
       </w:ins>
-      <w:moveTo w:id="93" w:author="Pascal Heude" w:date="2026-08-01T19:35:00Z">
+      <w:moveTo w:id="92" w:author="Pascal Heude" w:date="2026-08-01T19:35:00Z">
         <w:r>
           <w:rPr>
             <w:lang w:val="en-US"/>
@@ -10460,7 +10458,7 @@
         </w:r>
       </w:moveTo>
     </w:p>
-    <w:moveToRangeEnd w:id="89"/>
+    <w:moveToRangeEnd w:id="88"/>
     <w:p>
       <w:pPr>
         <w:rPr>
@@ -10518,13 +10516,13 @@
       <w:pPr>
         <w:pStyle w:val="Titre3"/>
       </w:pPr>
-      <w:bookmarkStart w:id="94" w:name="_Tag_LOAD"/>
-      <w:bookmarkStart w:id="95" w:name="_Toc456106022"/>
+      <w:bookmarkStart w:id="93" w:name="_Tag_LOAD"/>
+      <w:bookmarkStart w:id="94" w:name="_Toc456106022"/>
+      <w:bookmarkEnd w:id="93"/>
+      <w:r>
+        <w:t>Tag LOAD</w:t>
+      </w:r>
       <w:bookmarkEnd w:id="94"/>
-      <w:r>
-        <w:t>Tag LOAD</w:t>
-      </w:r>
-      <w:bookmarkEnd w:id="95"/>
     </w:p>
     <w:p>
       <w:pPr>
@@ -10542,17 +10540,17 @@
     <w:p>
       <w:pPr>
         <w:rPr>
-          <w:moveTo w:id="96" w:author="Pascal Heude" w:date="2026-08-01T19:35:00Z"/>
-          <w:lang w:val="en-US"/>
-        </w:rPr>
-      </w:pPr>
-      <w:ins w:id="97" w:author="Pascal Heude" w:date="2026-08-01T19:35:00Z">
+          <w:moveTo w:id="95" w:author="Pascal Heude" w:date="2026-08-01T19:35:00Z"/>
+          <w:lang w:val="en-US"/>
+        </w:rPr>
+      </w:pPr>
+      <w:ins w:id="96" w:author="Pascal Heude" w:date="2026-08-01T19:35:00Z">
         <w:r>
           <w:rPr>
             <w:b/>
             <w:color w:val="0070C0"/>
             <w:lang w:val="en-US"/>
-            <w:rPrChange w:id="98" w:author="Pascal Heude" w:date="2026-08-01T19:36:00Z">
+            <w:rPrChange w:id="97" w:author="Pascal Heude" w:date="2026-08-01T19:36:00Z">
               <w:rPr>
                 <w:lang w:val="en-US"/>
               </w:rPr>
@@ -10567,9 +10565,9 @@
           <w:t xml:space="preserve">: </w:t>
         </w:r>
       </w:ins>
-      <w:moveToRangeStart w:id="99" w:author="Pascal Heude" w:date="2026-08-01T19:35:00Z" w:name="move236505369"/>
-      <w:moveTo w:id="100" w:author="Pascal Heude" w:date="2026-08-01T19:35:00Z">
-        <w:del w:id="101" w:author="Pascal Heude" w:date="2026-08-03T17:56:00Z">
+      <w:moveToRangeStart w:id="98" w:author="Pascal Heude" w:date="2026-08-01T19:35:00Z" w:name="move236505369"/>
+      <w:moveTo w:id="99" w:author="Pascal Heude" w:date="2026-08-01T19:35:00Z">
+        <w:del w:id="100" w:author="Pascal Heude" w:date="2026-08-03T17:56:00Z">
           <w:r>
             <w:rPr>
               <w:lang w:val="en-US"/>
@@ -10578,7 +10576,7 @@
           </w:r>
         </w:del>
       </w:moveTo>
-      <w:ins w:id="102" w:author="Pascal Heude" w:date="2026-08-03T17:56:00Z">
+      <w:ins w:id="101" w:author="Pascal Heude" w:date="2026-08-03T17:56:00Z">
         <w:r>
           <w:rPr>
             <w:lang w:val="en-US"/>
@@ -10586,14 +10584,14 @@
           <w:t>t</w:t>
         </w:r>
       </w:ins>
-      <w:moveTo w:id="103" w:author="Pascal Heude" w:date="2026-08-01T19:35:00Z">
+      <w:moveTo w:id="102" w:author="Pascal Heude" w:date="2026-08-01T19:35:00Z">
         <w:r>
           <w:rPr>
             <w:lang w:val="en-US"/>
           </w:rPr>
           <w:t xml:space="preserve">his tag </w:t>
         </w:r>
-        <w:del w:id="104" w:author="Pascal Heude" w:date="2026-08-01T21:01:00Z">
+        <w:del w:id="103" w:author="Pascal Heude" w:date="2026-08-01T21:01:00Z">
           <w:r>
             <w:rPr>
               <w:lang w:val="en-US"/>
@@ -10602,7 +10600,7 @@
           </w:r>
         </w:del>
       </w:moveTo>
-      <w:ins w:id="105" w:author="Pascal Heude" w:date="2026-08-01T21:01:00Z">
+      <w:ins w:id="104" w:author="Pascal Heude" w:date="2026-08-01T21:01:00Z">
         <w:r>
           <w:rPr>
             <w:lang w:val="en-US"/>
@@ -10610,7 +10608,7 @@
           <w:t>shall be</w:t>
         </w:r>
       </w:ins>
-      <w:moveTo w:id="106" w:author="Pascal Heude" w:date="2026-08-01T19:35:00Z">
+      <w:moveTo w:id="105" w:author="Pascal Heude" w:date="2026-08-01T19:35:00Z">
         <w:r>
           <w:rPr>
             <w:lang w:val="en-US"/>
@@ -10619,20 +10617,20 @@
         </w:r>
       </w:moveTo>
     </w:p>
-    <w:moveToRangeEnd w:id="99"/>
-    <w:p>
-      <w:pPr>
-        <w:rPr>
-          <w:lang w:val="en-US"/>
-        </w:rPr>
-      </w:pPr>
-      <w:ins w:id="107" w:author="Pascal Heude" w:date="2026-08-01T19:36:00Z">
+    <w:moveToRangeEnd w:id="98"/>
+    <w:p>
+      <w:pPr>
+        <w:rPr>
+          <w:lang w:val="en-US"/>
+        </w:rPr>
+      </w:pPr>
+      <w:ins w:id="106" w:author="Pascal Heude" w:date="2026-08-01T19:36:00Z">
         <w:r>
           <w:rPr>
             <w:b/>
             <w:color w:val="0070C0"/>
             <w:lang w:val="en-US"/>
-            <w:rPrChange w:id="108" w:author="Pascal Heude" w:date="2026-08-01T19:36:00Z">
+            <w:rPrChange w:id="107" w:author="Pascal Heude" w:date="2026-08-01T19:36:00Z">
               <w:rPr>
                 <w:lang w:val="en-US"/>
               </w:rPr>
@@ -10647,7 +10645,7 @@
           <w:t xml:space="preserve">: </w:t>
         </w:r>
       </w:ins>
-      <w:del w:id="109" w:author="Pascal Heude" w:date="2026-08-03T17:56:00Z">
+      <w:del w:id="108" w:author="Pascal Heude" w:date="2026-08-03T17:56:00Z">
         <w:r>
           <w:rPr>
             <w:lang w:val="en-US"/>
@@ -10655,7 +10653,7 @@
           <w:delText>T</w:delText>
         </w:r>
       </w:del>
-      <w:ins w:id="110" w:author="Pascal Heude" w:date="2026-08-03T17:56:00Z">
+      <w:ins w:id="109" w:author="Pascal Heude" w:date="2026-08-03T17:56:00Z">
         <w:r>
           <w:rPr>
             <w:lang w:val="en-US"/>
@@ -10715,12 +10713,12 @@
     <w:p>
       <w:pPr>
         <w:rPr>
-          <w:moveFrom w:id="111" w:author="Pascal Heude" w:date="2026-08-01T19:35:00Z"/>
-          <w:lang w:val="en-US"/>
-        </w:rPr>
-      </w:pPr>
-      <w:moveFromRangeStart w:id="112" w:author="Pascal Heude" w:date="2026-08-01T19:35:00Z" w:name="move236505369"/>
-      <w:moveFrom w:id="113" w:author="Pascal Heude" w:date="2026-08-01T19:35:00Z">
+          <w:moveFrom w:id="110" w:author="Pascal Heude" w:date="2026-08-01T19:35:00Z"/>
+          <w:lang w:val="en-US"/>
+        </w:rPr>
+      </w:pPr>
+      <w:moveFromRangeStart w:id="111" w:author="Pascal Heude" w:date="2026-08-01T19:35:00Z" w:name="move236505369"/>
+      <w:moveFrom w:id="112" w:author="Pascal Heude" w:date="2026-08-01T19:35:00Z">
         <w:r>
           <w:rPr>
             <w:lang w:val="en-US"/>
@@ -10729,7 +10727,7 @@
         </w:r>
       </w:moveFrom>
     </w:p>
-    <w:moveFromRangeEnd w:id="112"/>
+    <w:moveFromRangeEnd w:id="111"/>
     <w:p>
       <w:pPr>
         <w:rPr>
@@ -10944,16 +10942,16 @@
           <w:lang w:val="en-US"/>
         </w:rPr>
       </w:pPr>
-      <w:bookmarkStart w:id="114" w:name="_Tag_PART_NUMBER"/>
-      <w:bookmarkStart w:id="115" w:name="_Toc456106023"/>
+      <w:bookmarkStart w:id="113" w:name="_Tag_PART_NUMBER"/>
+      <w:bookmarkStart w:id="114" w:name="_Toc456106023"/>
+      <w:bookmarkEnd w:id="113"/>
+      <w:r>
+        <w:rPr>
+          <w:lang w:val="en-US"/>
+        </w:rPr>
+        <w:t>Tag PART_NUMBER</w:t>
+      </w:r>
       <w:bookmarkEnd w:id="114"/>
-      <w:r>
-        <w:rPr>
-          <w:lang w:val="en-US"/>
-        </w:rPr>
-        <w:t>Tag PART_NUMBER</w:t>
-      </w:r>
-      <w:bookmarkEnd w:id="115"/>
     </w:p>
     <w:p>
       <w:pPr>
@@ -11028,17 +11026,17 @@
     <w:p>
       <w:pPr>
         <w:rPr>
-          <w:moveTo w:id="116" w:author="Pascal Heude" w:date="2026-08-01T19:36:00Z"/>
-          <w:lang w:val="en-US"/>
-        </w:rPr>
-      </w:pPr>
-      <w:ins w:id="117" w:author="Pascal Heude" w:date="2026-08-01T19:36:00Z">
+          <w:moveTo w:id="115" w:author="Pascal Heude" w:date="2026-08-01T19:36:00Z"/>
+          <w:lang w:val="en-US"/>
+        </w:rPr>
+      </w:pPr>
+      <w:ins w:id="116" w:author="Pascal Heude" w:date="2026-08-01T19:36:00Z">
         <w:r>
           <w:rPr>
             <w:b/>
             <w:color w:val="0070C0"/>
             <w:lang w:val="en-US"/>
-            <w:rPrChange w:id="118" w:author="Pascal Heude" w:date="2026-08-01T19:37:00Z">
+            <w:rPrChange w:id="117" w:author="Pascal Heude" w:date="2026-08-01T19:37:00Z">
               <w:rPr>
                 <w:lang w:val="en-US"/>
               </w:rPr>
@@ -11053,9 +11051,9 @@
           <w:t xml:space="preserve">: </w:t>
         </w:r>
       </w:ins>
-      <w:moveToRangeStart w:id="119" w:author="Pascal Heude" w:date="2026-08-01T19:36:00Z" w:name="move236505418"/>
-      <w:moveTo w:id="120" w:author="Pascal Heude" w:date="2026-08-01T19:36:00Z">
-        <w:del w:id="121" w:author="Pascal Heude" w:date="2026-08-03T17:56:00Z">
+      <w:moveToRangeStart w:id="118" w:author="Pascal Heude" w:date="2026-08-01T19:36:00Z" w:name="move236505418"/>
+      <w:moveTo w:id="119" w:author="Pascal Heude" w:date="2026-08-01T19:36:00Z">
+        <w:del w:id="120" w:author="Pascal Heude" w:date="2026-08-03T17:56:00Z">
           <w:r>
             <w:rPr>
               <w:lang w:val="en-US"/>
@@ -11064,7 +11062,7 @@
           </w:r>
         </w:del>
       </w:moveTo>
-      <w:ins w:id="122" w:author="Pascal Heude" w:date="2026-08-03T17:56:00Z">
+      <w:ins w:id="121" w:author="Pascal Heude" w:date="2026-08-03T17:56:00Z">
         <w:r>
           <w:rPr>
             <w:lang w:val="en-US"/>
@@ -11072,14 +11070,14 @@
           <w:t>t</w:t>
         </w:r>
       </w:ins>
-      <w:moveTo w:id="123" w:author="Pascal Heude" w:date="2026-08-01T19:36:00Z">
+      <w:moveTo w:id="122" w:author="Pascal Heude" w:date="2026-08-01T19:36:00Z">
         <w:r>
           <w:rPr>
             <w:lang w:val="en-US"/>
           </w:rPr>
           <w:t xml:space="preserve">his tag </w:t>
         </w:r>
-        <w:del w:id="124" w:author="Pascal Heude" w:date="2026-08-01T19:37:00Z">
+        <w:del w:id="123" w:author="Pascal Heude" w:date="2026-08-01T19:37:00Z">
           <w:r>
             <w:rPr>
               <w:lang w:val="en-US"/>
@@ -11088,7 +11086,7 @@
           </w:r>
         </w:del>
       </w:moveTo>
-      <w:ins w:id="125" w:author="Pascal Heude" w:date="2026-08-01T19:37:00Z">
+      <w:ins w:id="124" w:author="Pascal Heude" w:date="2026-08-01T19:37:00Z">
         <w:r>
           <w:rPr>
             <w:lang w:val="en-US"/>
@@ -11096,7 +11094,7 @@
           <w:t>shall be</w:t>
         </w:r>
       </w:ins>
-      <w:moveTo w:id="126" w:author="Pascal Heude" w:date="2026-08-01T19:36:00Z">
+      <w:moveTo w:id="125" w:author="Pascal Heude" w:date="2026-08-01T19:36:00Z">
         <w:r>
           <w:rPr>
             <w:lang w:val="en-US"/>
@@ -11105,20 +11103,20 @@
         </w:r>
       </w:moveTo>
     </w:p>
-    <w:moveToRangeEnd w:id="119"/>
-    <w:p>
-      <w:pPr>
-        <w:rPr>
-          <w:lang w:val="en-US"/>
-        </w:rPr>
-      </w:pPr>
-      <w:ins w:id="127" w:author="Pascal Heude" w:date="2026-08-01T19:36:00Z">
+    <w:moveToRangeEnd w:id="118"/>
+    <w:p>
+      <w:pPr>
+        <w:rPr>
+          <w:lang w:val="en-US"/>
+        </w:rPr>
+      </w:pPr>
+      <w:ins w:id="126" w:author="Pascal Heude" w:date="2026-08-01T19:36:00Z">
         <w:r>
           <w:rPr>
             <w:b/>
             <w:color w:val="0070C0"/>
             <w:lang w:val="en-US"/>
-            <w:rPrChange w:id="128" w:author="Pascal Heude" w:date="2026-08-01T19:37:00Z">
+            <w:rPrChange w:id="127" w:author="Pascal Heude" w:date="2026-08-01T19:37:00Z">
               <w:rPr>
                 <w:lang w:val="en-US"/>
               </w:rPr>
@@ -11133,7 +11131,7 @@
           <w:t xml:space="preserve">: </w:t>
         </w:r>
       </w:ins>
-      <w:del w:id="129" w:author="Pascal Heude" w:date="2026-08-03T17:56:00Z">
+      <w:del w:id="128" w:author="Pascal Heude" w:date="2026-08-03T17:56:00Z">
         <w:r>
           <w:rPr>
             <w:lang w:val="en-US"/>
@@ -11141,7 +11139,7 @@
           <w:delText>T</w:delText>
         </w:r>
       </w:del>
-      <w:ins w:id="130" w:author="Pascal Heude" w:date="2026-08-03T17:56:00Z">
+      <w:ins w:id="129" w:author="Pascal Heude" w:date="2026-08-03T17:56:00Z">
         <w:r>
           <w:rPr>
             <w:lang w:val="en-US"/>
@@ -11167,6 +11165,16 @@
         </w:rPr>
         <w:t xml:space="preserve">a list of </w:t>
       </w:r>
+      <w:ins w:id="130" w:author="Pascal Heude" w:date="2026-08-04T19:28:00Z">
+        <w:r>
+          <w:rPr>
+            <w:lang w:val="en-US"/>
+          </w:rPr>
+          <w:t xml:space="preserve">10 </w:t>
+        </w:r>
+      </w:ins>
+      <w:bookmarkStart w:id="131" w:name="_GoBack"/>
+      <w:bookmarkEnd w:id="131"/>
       <w:r>
         <w:rPr>
           <w:lang w:val="en-US"/>
@@ -11189,12 +11197,12 @@
     <w:p>
       <w:pPr>
         <w:rPr>
-          <w:moveFrom w:id="131" w:author="Pascal Heude" w:date="2026-08-01T19:36:00Z"/>
-          <w:lang w:val="en-US"/>
-        </w:rPr>
-      </w:pPr>
-      <w:moveFromRangeStart w:id="132" w:author="Pascal Heude" w:date="2026-08-01T19:36:00Z" w:name="move236505418"/>
-      <w:moveFrom w:id="133" w:author="Pascal Heude" w:date="2026-08-01T19:36:00Z">
+          <w:moveFrom w:id="132" w:author="Pascal Heude" w:date="2026-08-01T19:36:00Z"/>
+          <w:lang w:val="en-US"/>
+        </w:rPr>
+      </w:pPr>
+      <w:moveFromRangeStart w:id="133" w:author="Pascal Heude" w:date="2026-08-01T19:36:00Z" w:name="move236505418"/>
+      <w:moveFrom w:id="134" w:author="Pascal Heude" w:date="2026-08-01T19:36:00Z">
         <w:r>
           <w:rPr>
             <w:lang w:val="en-US"/>
@@ -11203,7 +11211,7 @@
         </w:r>
       </w:moveFrom>
     </w:p>
-    <w:moveFromRangeEnd w:id="132"/>
+    <w:moveFromRangeEnd w:id="133"/>
     <w:p>
       <w:pPr>
         <w:rPr>
@@ -11222,76 +11230,76 @@
           <w:u w:val="single"/>
           <w:lang w:val="en-US"/>
         </w:rPr>
+        <w:t>Example</w:t>
+      </w:r>
+      <w:r>
+        <w:rPr>
+          <w:lang w:val="en-US"/>
+        </w:rPr>
+        <w:t>:</w:t>
+      </w:r>
+    </w:p>
+    <w:p>
+      <w:pPr>
+        <w:rPr>
+          <w:lang w:val="en-US"/>
+        </w:rPr>
+      </w:pPr>
+      <w:r>
+        <w:rPr>
+          <w:lang w:val="en-US"/>
+        </w:rPr>
+        <w:t>&lt;PART_NUMBER&gt;</w:t>
+      </w:r>
+      <w:r>
+        <w:rPr>
+          <w:lang w:val="en-US"/>
+        </w:rPr>
+        <w:t>12345678</w:t>
+      </w:r>
+      <w:r>
+        <w:rPr>
+          <w:lang w:val="en-US"/>
+        </w:rPr>
+        <w:t>&lt;/PART_NUMBER&gt;</w:t>
+      </w:r>
+    </w:p>
+    <w:p>
+      <w:pPr>
+        <w:rPr>
+          <w:lang w:val="en-US"/>
+        </w:rPr>
+      </w:pPr>
+    </w:p>
+    <w:p>
+      <w:pPr>
+        <w:pStyle w:val="Titre3"/>
+        <w:rPr>
+          <w:lang w:val="en-US"/>
+        </w:rPr>
+      </w:pPr>
+      <w:bookmarkStart w:id="135" w:name="_Tag_TYPE_DESCRIPTION"/>
+      <w:bookmarkStart w:id="136" w:name="_Toc456106024"/>
+      <w:bookmarkEnd w:id="135"/>
+      <w:r>
+        <w:rPr>
+          <w:lang w:val="en-US"/>
+        </w:rPr>
+        <w:t>Tag TYPE_DESCRIPTION</w:t>
+      </w:r>
+      <w:bookmarkEnd w:id="136"/>
+    </w:p>
+    <w:p>
+      <w:pPr>
+        <w:rPr>
+          <w:lang w:val="en-US"/>
+        </w:rPr>
+      </w:pPr>
+      <w:r>
+        <w:rPr>
+          <w:lang w:val="en-US"/>
+        </w:rPr>
         <w:lastRenderedPageBreak/>
-        <w:t>Example</w:t>
-      </w:r>
-      <w:r>
-        <w:rPr>
-          <w:lang w:val="en-US"/>
-        </w:rPr>
-        <w:t>:</w:t>
-      </w:r>
-    </w:p>
-    <w:p>
-      <w:pPr>
-        <w:rPr>
-          <w:lang w:val="en-US"/>
-        </w:rPr>
-      </w:pPr>
-      <w:r>
-        <w:rPr>
-          <w:lang w:val="en-US"/>
-        </w:rPr>
-        <w:t>&lt;PART_NUMBER&gt;</w:t>
-      </w:r>
-      <w:r>
-        <w:rPr>
-          <w:lang w:val="en-US"/>
-        </w:rPr>
-        <w:t>12345678</w:t>
-      </w:r>
-      <w:r>
-        <w:rPr>
-          <w:lang w:val="en-US"/>
-        </w:rPr>
-        <w:t>&lt;/PART_NUMBER&gt;</w:t>
-      </w:r>
-    </w:p>
-    <w:p>
-      <w:pPr>
-        <w:rPr>
-          <w:lang w:val="en-US"/>
-        </w:rPr>
-      </w:pPr>
-    </w:p>
-    <w:p>
-      <w:pPr>
-        <w:pStyle w:val="Titre3"/>
-        <w:rPr>
-          <w:lang w:val="en-US"/>
-        </w:rPr>
-      </w:pPr>
-      <w:bookmarkStart w:id="134" w:name="_Tag_TYPE_DESCRIPTION"/>
-      <w:bookmarkStart w:id="135" w:name="_Toc456106024"/>
-      <w:bookmarkEnd w:id="134"/>
-      <w:r>
-        <w:rPr>
-          <w:lang w:val="en-US"/>
-        </w:rPr>
-        <w:t>Tag TYPE_DESCRIPTION</w:t>
-      </w:r>
-      <w:bookmarkEnd w:id="135"/>
-    </w:p>
-    <w:p>
-      <w:pPr>
-        <w:rPr>
-          <w:lang w:val="en-US"/>
-        </w:rPr>
-      </w:pPr>
-      <w:r>
-        <w:rPr>
-          <w:lang w:val="en-US"/>
-        </w:rPr>
         <w:t>This tag is used to indicate the load type description (see ref [3] §</w:t>
       </w:r>
       <w:r>
@@ -11338,13 +11346,13 @@
           <w:lang w:val="en-US"/>
         </w:rPr>
       </w:pPr>
-      <w:ins w:id="136" w:author="Pascal Heude" w:date="2026-08-01T19:37:00Z">
+      <w:ins w:id="137" w:author="Pascal Heude" w:date="2026-08-01T19:37:00Z">
         <w:r>
           <w:rPr>
             <w:b/>
             <w:color w:val="0070C0"/>
             <w:lang w:val="en-US"/>
-            <w:rPrChange w:id="137" w:author="Pascal Heude" w:date="2026-08-01T19:37:00Z">
+            <w:rPrChange w:id="138" w:author="Pascal Heude" w:date="2026-08-01T19:37:00Z">
               <w:rPr>
                 <w:lang w:val="en-US"/>
               </w:rPr>
@@ -11359,7 +11367,7 @@
           <w:t xml:space="preserve">: </w:t>
         </w:r>
       </w:ins>
-      <w:del w:id="138" w:author="Pascal Heude" w:date="2026-08-03T17:56:00Z">
+      <w:del w:id="139" w:author="Pascal Heude" w:date="2026-08-03T17:56:00Z">
         <w:r>
           <w:rPr>
             <w:lang w:val="en-US"/>
@@ -11367,7 +11375,7 @@
           <w:delText>T</w:delText>
         </w:r>
       </w:del>
-      <w:ins w:id="139" w:author="Pascal Heude" w:date="2026-08-03T17:56:00Z">
+      <w:ins w:id="140" w:author="Pascal Heude" w:date="2026-08-03T17:56:00Z">
         <w:r>
           <w:rPr>
             <w:lang w:val="en-US"/>
@@ -11387,7 +11395,7 @@
         </w:rPr>
         <w:t>letters</w:t>
       </w:r>
-      <w:ins w:id="140" w:author="Pascal Heude" w:date="2026-08-01T21:03:00Z">
+      <w:ins w:id="141" w:author="Pascal Heude" w:date="2026-08-01T21:03:00Z">
         <w:r>
           <w:rPr>
             <w:lang w:val="en-US"/>
@@ -11466,13 +11474,13 @@
           <w:lang w:val="en-US"/>
         </w:rPr>
       </w:pPr>
-      <w:ins w:id="141" w:author="Pascal Heude" w:date="2026-08-01T19:39:00Z">
+      <w:ins w:id="142" w:author="Pascal Heude" w:date="2026-08-01T19:39:00Z">
         <w:r>
           <w:rPr>
             <w:b/>
             <w:color w:val="0070C0"/>
             <w:lang w:val="en-US"/>
-            <w:rPrChange w:id="142" w:author="Pascal Heude" w:date="2026-08-01T19:39:00Z">
+            <w:rPrChange w:id="143" w:author="Pascal Heude" w:date="2026-08-01T19:39:00Z">
               <w:rPr>
                 <w:lang w:val="en-US"/>
               </w:rPr>
@@ -11487,7 +11495,7 @@
           <w:t xml:space="preserve">: </w:t>
         </w:r>
       </w:ins>
-      <w:ins w:id="143" w:author="Pascal Heude" w:date="2026-08-03T17:56:00Z">
+      <w:ins w:id="144" w:author="Pascal Heude" w:date="2026-08-03T17:56:00Z">
         <w:r>
           <w:rPr>
             <w:lang w:val="en-US"/>
@@ -11495,7 +11503,7 @@
           <w:t>i</w:t>
         </w:r>
       </w:ins>
-      <w:ins w:id="144" w:author="Pascal Heude" w:date="2026-08-01T19:39:00Z">
+      <w:ins w:id="145" w:author="Pascal Heude" w:date="2026-08-01T19:39:00Z">
         <w:r>
           <w:rPr>
             <w:lang w:val="en-US"/>
@@ -11503,7 +11511,7 @@
           <w:t xml:space="preserve">f used, </w:t>
         </w:r>
       </w:ins>
-      <w:del w:id="145" w:author="Pascal Heude" w:date="2026-08-01T19:39:00Z">
+      <w:del w:id="146" w:author="Pascal Heude" w:date="2026-08-01T19:39:00Z">
         <w:r>
           <w:rPr>
             <w:lang w:val="en-US"/>
@@ -11511,7 +11519,7 @@
           <w:delText>T</w:delText>
         </w:r>
       </w:del>
-      <w:ins w:id="146" w:author="Pascal Heude" w:date="2026-08-01T19:39:00Z">
+      <w:ins w:id="147" w:author="Pascal Heude" w:date="2026-08-01T19:39:00Z">
         <w:r>
           <w:rPr>
             <w:lang w:val="en-US"/>
@@ -11619,16 +11627,16 @@
           <w:lang w:val="en-US"/>
         </w:rPr>
       </w:pPr>
-      <w:bookmarkStart w:id="147" w:name="_Tag_INPUT_FILE"/>
-      <w:bookmarkStart w:id="148" w:name="_Toc456106025"/>
-      <w:bookmarkEnd w:id="147"/>
+      <w:bookmarkStart w:id="148" w:name="_Tag_INPUT_FILE"/>
+      <w:bookmarkStart w:id="149" w:name="_Toc456106025"/>
+      <w:bookmarkEnd w:id="148"/>
       <w:r>
         <w:rPr>
           <w:lang w:val="en-US"/>
         </w:rPr>
         <w:t>Tag INPUT_FILE</w:t>
       </w:r>
-      <w:bookmarkEnd w:id="148"/>
+      <w:bookmarkEnd w:id="149"/>
     </w:p>
     <w:p>
       <w:pPr>
@@ -11646,17 +11654,17 @@
     <w:p>
       <w:pPr>
         <w:rPr>
-          <w:moveTo w:id="149" w:author="Pascal Heude" w:date="2026-08-01T19:43:00Z"/>
-          <w:lang w:val="en-US"/>
-        </w:rPr>
-      </w:pPr>
-      <w:ins w:id="150" w:author="Pascal Heude" w:date="2026-08-01T19:43:00Z">
+          <w:moveTo w:id="150" w:author="Pascal Heude" w:date="2026-08-01T19:43:00Z"/>
+          <w:lang w:val="en-US"/>
+        </w:rPr>
+      </w:pPr>
+      <w:ins w:id="151" w:author="Pascal Heude" w:date="2026-08-01T19:43:00Z">
         <w:r>
           <w:rPr>
             <w:b/>
             <w:color w:val="0070C0"/>
             <w:lang w:val="en-US"/>
-            <w:rPrChange w:id="151" w:author="Pascal Heude" w:date="2026-08-01T19:43:00Z">
+            <w:rPrChange w:id="152" w:author="Pascal Heude" w:date="2026-08-01T19:43:00Z">
               <w:rPr>
                 <w:lang w:val="en-US"/>
               </w:rPr>
@@ -11671,9 +11679,9 @@
           <w:t xml:space="preserve">: </w:t>
         </w:r>
       </w:ins>
-      <w:moveToRangeStart w:id="152" w:author="Pascal Heude" w:date="2026-08-01T19:43:00Z" w:name="move236505798"/>
-      <w:moveTo w:id="153" w:author="Pascal Heude" w:date="2026-08-01T19:43:00Z">
-        <w:del w:id="154" w:author="Pascal Heude" w:date="2026-08-03T17:55:00Z">
+      <w:moveToRangeStart w:id="153" w:author="Pascal Heude" w:date="2026-08-01T19:43:00Z" w:name="move236505798"/>
+      <w:moveTo w:id="154" w:author="Pascal Heude" w:date="2026-08-01T19:43:00Z">
+        <w:del w:id="155" w:author="Pascal Heude" w:date="2026-08-03T17:55:00Z">
           <w:r>
             <w:rPr>
               <w:lang w:val="en-US"/>
@@ -11682,7 +11690,7 @@
           </w:r>
         </w:del>
       </w:moveTo>
-      <w:ins w:id="155" w:author="Pascal Heude" w:date="2026-08-03T17:55:00Z">
+      <w:ins w:id="156" w:author="Pascal Heude" w:date="2026-08-03T17:55:00Z">
         <w:r>
           <w:rPr>
             <w:lang w:val="en-US"/>
@@ -11690,14 +11698,14 @@
           <w:t>t</w:t>
         </w:r>
       </w:ins>
-      <w:moveTo w:id="156" w:author="Pascal Heude" w:date="2026-08-01T19:43:00Z">
+      <w:moveTo w:id="157" w:author="Pascal Heude" w:date="2026-08-01T19:43:00Z">
         <w:r>
           <w:rPr>
             <w:lang w:val="en-US"/>
           </w:rPr>
           <w:t xml:space="preserve">his tag </w:t>
         </w:r>
-        <w:del w:id="157" w:author="Pascal Heude" w:date="2026-08-01T19:43:00Z">
+        <w:del w:id="158" w:author="Pascal Heude" w:date="2026-08-01T19:43:00Z">
           <w:r>
             <w:rPr>
               <w:lang w:val="en-US"/>
@@ -11706,7 +11714,7 @@
           </w:r>
         </w:del>
       </w:moveTo>
-      <w:ins w:id="158" w:author="Pascal Heude" w:date="2026-08-01T19:43:00Z">
+      <w:ins w:id="159" w:author="Pascal Heude" w:date="2026-08-01T19:43:00Z">
         <w:r>
           <w:rPr>
             <w:lang w:val="en-US"/>
@@ -11714,7 +11722,7 @@
           <w:t>shall be</w:t>
         </w:r>
       </w:ins>
-      <w:moveTo w:id="159" w:author="Pascal Heude" w:date="2026-08-01T19:43:00Z">
+      <w:moveTo w:id="160" w:author="Pascal Heude" w:date="2026-08-01T19:43:00Z">
         <w:r>
           <w:rPr>
             <w:lang w:val="en-US"/>
@@ -11723,20 +11731,20 @@
         </w:r>
       </w:moveTo>
     </w:p>
-    <w:moveToRangeEnd w:id="152"/>
-    <w:p>
-      <w:pPr>
-        <w:rPr>
-          <w:lang w:val="en-US"/>
-        </w:rPr>
-      </w:pPr>
-      <w:ins w:id="160" w:author="Pascal Heude" w:date="2026-08-01T19:43:00Z">
+    <w:moveToRangeEnd w:id="153"/>
+    <w:p>
+      <w:pPr>
+        <w:rPr>
+          <w:lang w:val="en-US"/>
+        </w:rPr>
+      </w:pPr>
+      <w:ins w:id="161" w:author="Pascal Heude" w:date="2026-08-01T19:43:00Z">
         <w:r>
           <w:rPr>
             <w:b/>
             <w:color w:val="0070C0"/>
             <w:lang w:val="en-US"/>
-            <w:rPrChange w:id="161" w:author="Pascal Heude" w:date="2026-08-01T19:43:00Z">
+            <w:rPrChange w:id="162" w:author="Pascal Heude" w:date="2026-08-01T19:43:00Z">
               <w:rPr>
                 <w:lang w:val="en-US"/>
               </w:rPr>
@@ -11751,7 +11759,7 @@
           <w:t xml:space="preserve">: </w:t>
         </w:r>
       </w:ins>
-      <w:del w:id="162" w:author="Pascal Heude" w:date="2026-08-03T17:55:00Z">
+      <w:del w:id="163" w:author="Pascal Heude" w:date="2026-08-03T17:55:00Z">
         <w:r>
           <w:rPr>
             <w:lang w:val="en-US"/>
@@ -11759,7 +11767,7 @@
           <w:delText>T</w:delText>
         </w:r>
       </w:del>
-      <w:ins w:id="163" w:author="Pascal Heude" w:date="2026-08-03T17:55:00Z">
+      <w:ins w:id="164" w:author="Pascal Heude" w:date="2026-08-03T17:55:00Z">
         <w:r>
           <w:rPr>
             <w:lang w:val="en-US"/>
@@ -11783,12 +11791,12 @@
     <w:p>
       <w:pPr>
         <w:rPr>
-          <w:moveFrom w:id="164" w:author="Pascal Heude" w:date="2026-08-01T19:43:00Z"/>
-          <w:lang w:val="en-US"/>
-        </w:rPr>
-      </w:pPr>
-      <w:moveFromRangeStart w:id="165" w:author="Pascal Heude" w:date="2026-08-01T19:43:00Z" w:name="move236505798"/>
-      <w:moveFrom w:id="166" w:author="Pascal Heude" w:date="2026-08-01T19:43:00Z">
+          <w:moveFrom w:id="165" w:author="Pascal Heude" w:date="2026-08-01T19:43:00Z"/>
+          <w:lang w:val="en-US"/>
+        </w:rPr>
+      </w:pPr>
+      <w:moveFromRangeStart w:id="166" w:author="Pascal Heude" w:date="2026-08-01T19:43:00Z" w:name="move236505798"/>
+      <w:moveFrom w:id="167" w:author="Pascal Heude" w:date="2026-08-01T19:43:00Z">
         <w:r>
           <w:rPr>
             <w:lang w:val="en-US"/>
@@ -11797,7 +11805,7 @@
         </w:r>
       </w:moveFrom>
     </w:p>
-    <w:moveFromRangeEnd w:id="165"/>
+    <w:moveFromRangeEnd w:id="166"/>
     <w:p>
       <w:pPr>
         <w:rPr>
@@ -11961,13 +11969,13 @@
           <w:lang w:val="en-US"/>
         </w:rPr>
       </w:pPr>
-      <w:ins w:id="167" w:author="Pascal Heude" w:date="2026-08-01T19:44:00Z">
+      <w:ins w:id="168" w:author="Pascal Heude" w:date="2026-08-01T19:44:00Z">
         <w:r>
           <w:rPr>
             <w:b/>
             <w:color w:val="0070C0"/>
             <w:lang w:val="en-US"/>
-            <w:rPrChange w:id="168" w:author="Pascal Heude" w:date="2026-08-01T19:45:00Z">
+            <w:rPrChange w:id="169" w:author="Pascal Heude" w:date="2026-08-01T19:45:00Z">
               <w:rPr>
                 <w:lang w:val="en-US"/>
               </w:rPr>
@@ -11982,7 +11990,7 @@
           <w:t xml:space="preserve">: </w:t>
         </w:r>
       </w:ins>
-      <w:ins w:id="169" w:author="Pascal Heude" w:date="2026-08-03T17:55:00Z">
+      <w:ins w:id="170" w:author="Pascal Heude" w:date="2026-08-03T17:55:00Z">
         <w:r>
           <w:rPr>
             <w:lang w:val="en-US"/>
@@ -11990,7 +11998,7 @@
           <w:t>i</w:t>
         </w:r>
       </w:ins>
-      <w:ins w:id="170" w:author="Pascal Heude" w:date="2026-08-01T19:44:00Z">
+      <w:ins w:id="171" w:author="Pascal Heude" w:date="2026-08-01T19:44:00Z">
         <w:r>
           <w:rPr>
             <w:lang w:val="en-US"/>
@@ -11998,7 +12006,7 @@
           <w:t>f used, t</w:t>
         </w:r>
       </w:ins>
-      <w:del w:id="171" w:author="Pascal Heude" w:date="2026-08-01T19:44:00Z">
+      <w:del w:id="172" w:author="Pascal Heude" w:date="2026-08-01T19:44:00Z">
         <w:r>
           <w:rPr>
             <w:lang w:val="en-US"/>
@@ -12012,7 +12020,7 @@
         </w:rPr>
         <w:t xml:space="preserve">he content </w:t>
       </w:r>
-      <w:ins w:id="172" w:author="Pascal Heude" w:date="2026-08-02T11:01:00Z">
+      <w:ins w:id="173" w:author="Pascal Heude" w:date="2026-08-02T11:01:00Z">
         <w:r>
           <w:rPr>
             <w:lang w:val="en-US"/>
@@ -12020,7 +12028,7 @@
           <w:t>shall be</w:t>
         </w:r>
       </w:ins>
-      <w:del w:id="173" w:author="Pascal Heude" w:date="2026-08-02T11:01:00Z">
+      <w:del w:id="174" w:author="Pascal Heude" w:date="2026-08-02T11:01:00Z">
         <w:r>
           <w:rPr>
             <w:lang w:val="en-US"/>
@@ -12146,9 +12154,9 @@
       <w:pPr>
         <w:pStyle w:val="Titre3"/>
       </w:pPr>
-      <w:bookmarkStart w:id="174" w:name="_Tag_SPLIT_SIZE"/>
-      <w:bookmarkStart w:id="175" w:name="_Toc456106026"/>
-      <w:bookmarkEnd w:id="174"/>
+      <w:bookmarkStart w:id="175" w:name="_Tag_SPLIT_SIZE"/>
+      <w:bookmarkStart w:id="176" w:name="_Toc456106026"/>
+      <w:bookmarkEnd w:id="175"/>
       <w:r>
         <w:rPr>
           <w:lang w:val="en-US"/>
@@ -12158,19 +12166,18 @@
       <w:r>
         <w:t>SIZE</w:t>
       </w:r>
-      <w:bookmarkEnd w:id="175"/>
-    </w:p>
-    <w:p>
-      <w:pPr>
-        <w:rPr>
-          <w:lang w:val="en-US"/>
-        </w:rPr>
-      </w:pPr>
-      <w:r>
-        <w:rPr>
-          <w:lang w:val="en-US"/>
-        </w:rPr>
-        <w:lastRenderedPageBreak/>
+      <w:bookmarkEnd w:id="176"/>
+    </w:p>
+    <w:p>
+      <w:pPr>
+        <w:rPr>
+          <w:lang w:val="en-US"/>
+        </w:rPr>
+      </w:pPr>
+      <w:r>
+        <w:rPr>
+          <w:lang w:val="en-US"/>
+        </w:rPr>
         <w:t xml:space="preserve">This tag is to indicate the </w:t>
       </w:r>
       <w:r>
@@ -12224,13 +12231,13 @@
           <w:lang w:val="en-US"/>
         </w:rPr>
       </w:pPr>
-      <w:ins w:id="176" w:author="Pascal Heude" w:date="2026-08-01T19:45:00Z">
+      <w:ins w:id="177" w:author="Pascal Heude" w:date="2026-08-01T19:45:00Z">
         <w:r>
           <w:rPr>
             <w:b/>
             <w:color w:val="0070C0"/>
             <w:lang w:val="en-US"/>
-            <w:rPrChange w:id="177" w:author="Pascal Heude" w:date="2026-08-01T19:46:00Z">
+            <w:rPrChange w:id="178" w:author="Pascal Heude" w:date="2026-08-01T19:46:00Z">
               <w:rPr>
                 <w:lang w:val="en-US"/>
               </w:rPr>
@@ -12239,13 +12246,13 @@
           <w:t>U</w:t>
         </w:r>
       </w:ins>
-      <w:ins w:id="178" w:author="Pascal Heude" w:date="2026-08-01T19:46:00Z">
+      <w:ins w:id="179" w:author="Pascal Heude" w:date="2026-08-01T19:46:00Z">
         <w:r>
           <w:rPr>
             <w:b/>
             <w:color w:val="0070C0"/>
             <w:lang w:val="en-US"/>
-            <w:rPrChange w:id="179" w:author="Pascal Heude" w:date="2026-08-01T19:46:00Z">
+            <w:rPrChange w:id="180" w:author="Pascal Heude" w:date="2026-08-01T19:46:00Z">
               <w:rPr>
                 <w:lang w:val="en-US"/>
               </w:rPr>
@@ -12260,7 +12267,7 @@
           <w:t xml:space="preserve">: </w:t>
         </w:r>
       </w:ins>
-      <w:ins w:id="180" w:author="Pascal Heude" w:date="2026-08-03T17:55:00Z">
+      <w:ins w:id="181" w:author="Pascal Heude" w:date="2026-08-03T17:55:00Z">
         <w:r>
           <w:rPr>
             <w:lang w:val="en-US"/>
@@ -12268,7 +12275,7 @@
           <w:t>i</w:t>
         </w:r>
       </w:ins>
-      <w:ins w:id="181" w:author="Pascal Heude" w:date="2026-08-01T19:46:00Z">
+      <w:ins w:id="182" w:author="Pascal Heude" w:date="2026-08-01T19:46:00Z">
         <w:r>
           <w:rPr>
             <w:lang w:val="en-US"/>
@@ -12276,7 +12283,7 @@
           <w:t>f used, t</w:t>
         </w:r>
       </w:ins>
-      <w:del w:id="182" w:author="Pascal Heude" w:date="2026-08-01T19:46:00Z">
+      <w:del w:id="183" w:author="Pascal Heude" w:date="2026-08-01T19:46:00Z">
         <w:r>
           <w:rPr>
             <w:lang w:val="en-US"/>
@@ -12391,6 +12398,7 @@
         <w:rPr>
           <w:lang w:val="en-US"/>
         </w:rPr>
+        <w:lastRenderedPageBreak/>
         <w:t>&lt;SPLIT_SIZE&gt;10000&lt;/SPLIT_SIZE&gt;</w:t>
       </w:r>
     </w:p>
@@ -12405,13 +12413,13 @@
       <w:pPr>
         <w:pStyle w:val="Titre3"/>
       </w:pPr>
-      <w:bookmarkStart w:id="183" w:name="_Tag_DIRECTORY"/>
-      <w:bookmarkStart w:id="184" w:name="_Toc456106027"/>
-      <w:bookmarkEnd w:id="183"/>
+      <w:bookmarkStart w:id="184" w:name="_Tag_DIRECTORY"/>
+      <w:bookmarkStart w:id="185" w:name="_Toc456106027"/>
+      <w:bookmarkEnd w:id="184"/>
       <w:r>
         <w:t>Tag DIRECTORY</w:t>
       </w:r>
-      <w:bookmarkEnd w:id="184"/>
+      <w:bookmarkEnd w:id="185"/>
     </w:p>
     <w:p>
       <w:pPr>
@@ -12429,17 +12437,17 @@
     <w:p>
       <w:pPr>
         <w:rPr>
-          <w:moveTo w:id="185" w:author="Pascal Heude" w:date="2026-08-01T19:46:00Z"/>
-          <w:lang w:val="en-US"/>
-        </w:rPr>
-      </w:pPr>
-      <w:ins w:id="186" w:author="Pascal Heude" w:date="2026-08-01T19:46:00Z">
+          <w:moveTo w:id="186" w:author="Pascal Heude" w:date="2026-08-01T19:46:00Z"/>
+          <w:lang w:val="en-US"/>
+        </w:rPr>
+      </w:pPr>
+      <w:ins w:id="187" w:author="Pascal Heude" w:date="2026-08-01T19:46:00Z">
         <w:r>
           <w:rPr>
             <w:b/>
             <w:color w:val="0070C0"/>
             <w:lang w:val="en-US"/>
-            <w:rPrChange w:id="187" w:author="Pascal Heude" w:date="2026-08-01T19:46:00Z">
+            <w:rPrChange w:id="188" w:author="Pascal Heude" w:date="2026-08-01T19:46:00Z">
               <w:rPr>
                 <w:lang w:val="en-US"/>
               </w:rPr>
@@ -12454,7 +12462,7 @@
           <w:t xml:space="preserve">: </w:t>
         </w:r>
       </w:ins>
-      <w:ins w:id="188" w:author="Pascal Heude" w:date="2026-08-03T17:54:00Z">
+      <w:ins w:id="189" w:author="Pascal Heude" w:date="2026-08-03T17:54:00Z">
         <w:r>
           <w:rPr>
             <w:lang w:val="en-US"/>
@@ -12462,9 +12470,9 @@
           <w:t>t</w:t>
         </w:r>
       </w:ins>
-      <w:moveToRangeStart w:id="189" w:author="Pascal Heude" w:date="2026-08-01T19:46:00Z" w:name="move236506022"/>
-      <w:moveTo w:id="190" w:author="Pascal Heude" w:date="2026-08-01T19:46:00Z">
-        <w:del w:id="191" w:author="Pascal Heude" w:date="2026-08-03T17:54:00Z">
+      <w:moveToRangeStart w:id="190" w:author="Pascal Heude" w:date="2026-08-01T19:46:00Z" w:name="move236506022"/>
+      <w:moveTo w:id="191" w:author="Pascal Heude" w:date="2026-08-01T19:46:00Z">
+        <w:del w:id="192" w:author="Pascal Heude" w:date="2026-08-03T17:54:00Z">
           <w:r>
             <w:rPr>
               <w:lang w:val="en-US"/>
@@ -12478,7 +12486,7 @@
           </w:rPr>
           <w:t xml:space="preserve">his tag </w:t>
         </w:r>
-        <w:del w:id="192" w:author="Pascal Heude" w:date="2026-08-01T19:47:00Z">
+        <w:del w:id="193" w:author="Pascal Heude" w:date="2026-08-01T19:47:00Z">
           <w:r>
             <w:rPr>
               <w:lang w:val="en-US"/>
@@ -12487,7 +12495,7 @@
           </w:r>
         </w:del>
       </w:moveTo>
-      <w:ins w:id="193" w:author="Pascal Heude" w:date="2026-08-01T19:47:00Z">
+      <w:ins w:id="194" w:author="Pascal Heude" w:date="2026-08-01T19:47:00Z">
         <w:r>
           <w:rPr>
             <w:lang w:val="en-US"/>
@@ -12495,7 +12503,7 @@
           <w:t>shall be</w:t>
         </w:r>
       </w:ins>
-      <w:moveTo w:id="194" w:author="Pascal Heude" w:date="2026-08-01T19:46:00Z">
+      <w:moveTo w:id="195" w:author="Pascal Heude" w:date="2026-08-01T19:46:00Z">
         <w:r>
           <w:rPr>
             <w:lang w:val="en-US"/>
@@ -12504,14 +12512,14 @@
         </w:r>
       </w:moveTo>
     </w:p>
-    <w:moveToRangeEnd w:id="189"/>
-    <w:p>
-      <w:pPr>
-        <w:rPr>
-          <w:lang w:val="en-US"/>
-        </w:rPr>
-      </w:pPr>
-      <w:ins w:id="195" w:author="Pascal Heude" w:date="2026-08-01T19:47:00Z">
+    <w:moveToRangeEnd w:id="190"/>
+    <w:p>
+      <w:pPr>
+        <w:rPr>
+          <w:lang w:val="en-US"/>
+        </w:rPr>
+      </w:pPr>
+      <w:ins w:id="196" w:author="Pascal Heude" w:date="2026-08-01T19:47:00Z">
         <w:r>
           <w:rPr>
             <w:b/>
@@ -12535,7 +12543,7 @@
           <w:t>: t</w:t>
         </w:r>
       </w:ins>
-      <w:del w:id="196" w:author="Pascal Heude" w:date="2026-08-01T19:47:00Z">
+      <w:del w:id="197" w:author="Pascal Heude" w:date="2026-08-01T19:47:00Z">
         <w:r>
           <w:rPr>
             <w:lang w:val="en-US"/>
@@ -12573,7 +12581,7 @@
         </w:rPr>
         <w:t xml:space="preserve"> relative </w:t>
       </w:r>
-      <w:del w:id="197" w:author="Pascal Heude" w:date="2026-07-29T22:51:00Z">
+      <w:del w:id="198" w:author="Pascal Heude" w:date="2026-07-29T22:51:00Z">
         <w:r>
           <w:rPr>
             <w:lang w:val="en-US"/>
@@ -12591,12 +12599,12 @@
     <w:p>
       <w:pPr>
         <w:rPr>
-          <w:moveFrom w:id="198" w:author="Pascal Heude" w:date="2026-08-01T19:46:00Z"/>
-          <w:lang w:val="en-US"/>
-        </w:rPr>
-      </w:pPr>
-      <w:moveFromRangeStart w:id="199" w:author="Pascal Heude" w:date="2026-08-01T19:46:00Z" w:name="move236506022"/>
-      <w:moveFrom w:id="200" w:author="Pascal Heude" w:date="2026-08-01T19:46:00Z">
+          <w:moveFrom w:id="199" w:author="Pascal Heude" w:date="2026-08-01T19:46:00Z"/>
+          <w:lang w:val="en-US"/>
+        </w:rPr>
+      </w:pPr>
+      <w:moveFromRangeStart w:id="200" w:author="Pascal Heude" w:date="2026-08-01T19:46:00Z" w:name="move236506022"/>
+      <w:moveFrom w:id="201" w:author="Pascal Heude" w:date="2026-08-01T19:46:00Z">
         <w:r>
           <w:rPr>
             <w:lang w:val="en-US"/>
@@ -12605,7 +12613,7 @@
         </w:r>
       </w:moveFrom>
     </w:p>
-    <w:moveFromRangeEnd w:id="199"/>
+    <w:moveFromRangeEnd w:id="200"/>
     <w:p>
       <w:pPr>
         <w:rPr>
@@ -12618,7 +12626,7 @@
         </w:rPr>
         <w:t xml:space="preserve">If the directory does not exist, it </w:t>
       </w:r>
-      <w:del w:id="201" w:author="Pascal Heude" w:date="2026-07-29T22:52:00Z">
+      <w:del w:id="202" w:author="Pascal Heude" w:date="2026-07-29T22:52:00Z">
         <w:r>
           <w:rPr>
             <w:lang w:val="en-US"/>
@@ -12626,7 +12634,7 @@
           <w:delText xml:space="preserve">shall </w:delText>
         </w:r>
       </w:del>
-      <w:ins w:id="202" w:author="Pascal Heude" w:date="2026-07-29T22:52:00Z">
+      <w:ins w:id="203" w:author="Pascal Heude" w:date="2026-07-29T22:52:00Z">
         <w:r>
           <w:rPr>
             <w:lang w:val="en-US"/>
@@ -12646,7 +12654,7 @@
         </w:rPr>
         <w:t xml:space="preserve">already </w:t>
       </w:r>
-      <w:del w:id="203" w:author="Pascal Heude" w:date="2026-07-29T22:52:00Z">
+      <w:del w:id="204" w:author="Pascal Heude" w:date="2026-07-29T22:52:00Z">
         <w:r>
           <w:rPr>
             <w:lang w:val="en-US"/>
@@ -12660,7 +12668,7 @@
         </w:rPr>
         <w:t>files</w:t>
       </w:r>
-      <w:ins w:id="204" w:author="Pascal Heude" w:date="2026-07-29T22:52:00Z">
+      <w:ins w:id="205" w:author="Pascal Heude" w:date="2026-07-29T22:52:00Z">
         <w:r>
           <w:rPr>
             <w:lang w:val="en-US"/>
@@ -12674,7 +12682,7 @@
         </w:rPr>
         <w:t xml:space="preserve">, </w:t>
       </w:r>
-      <w:del w:id="205" w:author="Pascal Heude" w:date="2026-07-29T22:52:00Z">
+      <w:del w:id="206" w:author="Pascal Heude" w:date="2026-07-29T22:52:00Z">
         <w:r>
           <w:rPr>
             <w:lang w:val="en-US"/>
@@ -12700,7 +12708,7 @@
           <w:delText>Generate</w:delText>
         </w:r>
       </w:del>
-      <w:ins w:id="206" w:author="Pascal Heude" w:date="2026-07-29T22:52:00Z">
+      <w:ins w:id="207" w:author="Pascal Heude" w:date="2026-07-29T22:52:00Z">
         <w:r>
           <w:rPr>
             <w:lang w:val="en-US"/>
@@ -12766,13 +12774,13 @@
       <w:pPr>
         <w:pStyle w:val="Titre3"/>
       </w:pPr>
-      <w:bookmarkStart w:id="207" w:name="_Tag_THW_ID_LIST"/>
-      <w:bookmarkStart w:id="208" w:name="_Toc456106028"/>
-      <w:bookmarkEnd w:id="207"/>
+      <w:bookmarkStart w:id="208" w:name="_Tag_THW_ID_LIST"/>
+      <w:bookmarkStart w:id="209" w:name="_Toc456106028"/>
+      <w:bookmarkEnd w:id="208"/>
       <w:r>
         <w:t>Tag THW_ID_LIST</w:t>
       </w:r>
-      <w:bookmarkEnd w:id="208"/>
+      <w:bookmarkEnd w:id="209"/>
     </w:p>
     <w:p>
       <w:pPr>
@@ -12865,8 +12873,8 @@
           <w:lang w:val="en-US"/>
         </w:rPr>
       </w:pPr>
-      <w:bookmarkStart w:id="209" w:name="_Tag_THW_ID"/>
-      <w:bookmarkEnd w:id="209"/>
+      <w:bookmarkStart w:id="210" w:name="_Tag_THW_ID"/>
+      <w:bookmarkEnd w:id="210"/>
       <w:r>
         <w:rPr>
           <w:lang w:val="en-US"/>
@@ -12901,11 +12909,11 @@
     <w:p>
       <w:pPr>
         <w:rPr>
-          <w:moveTo w:id="210" w:author="Pascal Heude" w:date="2026-08-01T19:48:00Z"/>
-          <w:lang w:val="en-US"/>
-        </w:rPr>
-      </w:pPr>
-      <w:ins w:id="211" w:author="Pascal Heude" w:date="2026-08-01T19:48:00Z">
+          <w:moveTo w:id="211" w:author="Pascal Heude" w:date="2026-08-01T19:48:00Z"/>
+          <w:lang w:val="en-US"/>
+        </w:rPr>
+      </w:pPr>
+      <w:ins w:id="212" w:author="Pascal Heude" w:date="2026-08-01T19:48:00Z">
         <w:r>
           <w:rPr>
             <w:b/>
@@ -12929,9 +12937,9 @@
           <w:t xml:space="preserve">: </w:t>
         </w:r>
       </w:ins>
-      <w:moveToRangeStart w:id="212" w:author="Pascal Heude" w:date="2026-08-01T19:48:00Z" w:name="move236506110"/>
-      <w:moveTo w:id="213" w:author="Pascal Heude" w:date="2026-08-01T19:48:00Z">
-        <w:del w:id="214" w:author="Pascal Heude" w:date="2026-08-01T19:48:00Z">
+      <w:moveToRangeStart w:id="213" w:author="Pascal Heude" w:date="2026-08-01T19:48:00Z" w:name="move236506110"/>
+      <w:moveTo w:id="214" w:author="Pascal Heude" w:date="2026-08-01T19:48:00Z">
+        <w:del w:id="215" w:author="Pascal Heude" w:date="2026-08-01T19:48:00Z">
           <w:r>
             <w:rPr>
               <w:lang w:val="en-US"/>
@@ -12940,7 +12948,7 @@
           </w:r>
         </w:del>
       </w:moveTo>
-      <w:ins w:id="215" w:author="Pascal Heude" w:date="2026-08-01T19:48:00Z">
+      <w:ins w:id="216" w:author="Pascal Heude" w:date="2026-08-01T19:48:00Z">
         <w:r>
           <w:rPr>
             <w:lang w:val="en-US"/>
@@ -12948,14 +12956,14 @@
           <w:t>t</w:t>
         </w:r>
       </w:ins>
-      <w:moveTo w:id="216" w:author="Pascal Heude" w:date="2026-08-01T19:48:00Z">
+      <w:moveTo w:id="217" w:author="Pascal Heude" w:date="2026-08-01T19:48:00Z">
         <w:r>
           <w:rPr>
             <w:lang w:val="en-US"/>
           </w:rPr>
           <w:t xml:space="preserve">he attribute </w:t>
         </w:r>
-        <w:del w:id="217" w:author="Pascal Heude" w:date="2026-08-01T19:48:00Z">
+        <w:del w:id="218" w:author="Pascal Heude" w:date="2026-08-01T19:48:00Z">
           <w:r>
             <w:rPr>
               <w:lang w:val="en-US"/>
@@ -12964,7 +12972,7 @@
           </w:r>
         </w:del>
       </w:moveTo>
-      <w:ins w:id="218" w:author="Pascal Heude" w:date="2026-08-01T19:48:00Z">
+      <w:ins w:id="219" w:author="Pascal Heude" w:date="2026-08-01T19:48:00Z">
         <w:r>
           <w:rPr>
             <w:lang w:val="en-US"/>
@@ -12972,7 +12980,7 @@
           <w:t>shall be</w:t>
         </w:r>
       </w:ins>
-      <w:moveTo w:id="219" w:author="Pascal Heude" w:date="2026-08-01T19:48:00Z">
+      <w:moveTo w:id="220" w:author="Pascal Heude" w:date="2026-08-01T19:48:00Z">
         <w:r>
           <w:rPr>
             <w:lang w:val="en-US"/>
@@ -12981,14 +12989,14 @@
         </w:r>
       </w:moveTo>
     </w:p>
-    <w:moveToRangeEnd w:id="212"/>
-    <w:p>
-      <w:pPr>
-        <w:rPr>
-          <w:lang w:val="en-US"/>
-        </w:rPr>
-      </w:pPr>
-      <w:ins w:id="220" w:author="Pascal Heude" w:date="2026-08-01T19:48:00Z">
+    <w:moveToRangeEnd w:id="213"/>
+    <w:p>
+      <w:pPr>
+        <w:rPr>
+          <w:lang w:val="en-US"/>
+        </w:rPr>
+      </w:pPr>
+      <w:ins w:id="221" w:author="Pascal Heude" w:date="2026-08-01T19:48:00Z">
         <w:r>
           <w:rPr>
             <w:b/>
@@ -13012,7 +13020,7 @@
           <w:t xml:space="preserve">: </w:t>
         </w:r>
       </w:ins>
-      <w:del w:id="221" w:author="Pascal Heude" w:date="2026-08-03T17:54:00Z">
+      <w:del w:id="222" w:author="Pascal Heude" w:date="2026-08-03T17:54:00Z">
         <w:r>
           <w:rPr>
             <w:lang w:val="en-US"/>
@@ -13020,7 +13028,7 @@
           <w:delText>T</w:delText>
         </w:r>
       </w:del>
-      <w:ins w:id="222" w:author="Pascal Heude" w:date="2026-08-03T17:54:00Z">
+      <w:ins w:id="223" w:author="Pascal Heude" w:date="2026-08-03T17:54:00Z">
         <w:r>
           <w:rPr>
             <w:lang w:val="en-US"/>
@@ -13044,12 +13052,12 @@
     <w:p>
       <w:pPr>
         <w:rPr>
-          <w:moveFrom w:id="223" w:author="Pascal Heude" w:date="2026-08-01T19:48:00Z"/>
-          <w:lang w:val="en-US"/>
-        </w:rPr>
-      </w:pPr>
-      <w:moveFromRangeStart w:id="224" w:author="Pascal Heude" w:date="2026-08-01T19:48:00Z" w:name="move236506110"/>
-      <w:moveFrom w:id="225" w:author="Pascal Heude" w:date="2026-08-01T19:48:00Z">
+          <w:moveFrom w:id="224" w:author="Pascal Heude" w:date="2026-08-01T19:48:00Z"/>
+          <w:lang w:val="en-US"/>
+        </w:rPr>
+      </w:pPr>
+      <w:moveFromRangeStart w:id="225" w:author="Pascal Heude" w:date="2026-08-01T19:48:00Z" w:name="move236506110"/>
+      <w:moveFrom w:id="226" w:author="Pascal Heude" w:date="2026-08-01T19:48:00Z">
         <w:r>
           <w:rPr>
             <w:lang w:val="en-US"/>
@@ -13064,7 +13072,7 @@
         </w:r>
       </w:moveFrom>
     </w:p>
-    <w:moveFromRangeEnd w:id="224"/>
+    <w:moveFromRangeEnd w:id="225"/>
     <w:p>
       <w:pPr>
         <w:rPr>
@@ -13140,13 +13148,13 @@
       <w:pPr>
         <w:pStyle w:val="Titre3"/>
       </w:pPr>
-      <w:bookmarkStart w:id="226" w:name="_Tag_THW_ID_1"/>
-      <w:bookmarkStart w:id="227" w:name="_Toc456106029"/>
-      <w:bookmarkEnd w:id="226"/>
+      <w:bookmarkStart w:id="227" w:name="_Tag_THW_ID_1"/>
+      <w:bookmarkStart w:id="228" w:name="_Toc456106029"/>
+      <w:bookmarkEnd w:id="227"/>
       <w:r>
         <w:t>Tag THW_ID</w:t>
       </w:r>
-      <w:bookmarkEnd w:id="227"/>
+      <w:bookmarkEnd w:id="228"/>
     </w:p>
     <w:p>
       <w:pPr>
@@ -13200,17 +13208,17 @@
     <w:p>
       <w:pPr>
         <w:rPr>
-          <w:moveTo w:id="228" w:author="Pascal Heude" w:date="2026-08-01T21:11:00Z"/>
-          <w:lang w:val="en-US"/>
-        </w:rPr>
-      </w:pPr>
-      <w:ins w:id="229" w:author="Pascal Heude" w:date="2026-08-01T21:11:00Z">
+          <w:moveTo w:id="229" w:author="Pascal Heude" w:date="2026-08-01T21:11:00Z"/>
+          <w:lang w:val="en-US"/>
+        </w:rPr>
+      </w:pPr>
+      <w:ins w:id="230" w:author="Pascal Heude" w:date="2026-08-01T21:11:00Z">
         <w:r>
           <w:rPr>
             <w:b/>
             <w:color w:val="0070C0"/>
             <w:lang w:val="en-US"/>
-            <w:rPrChange w:id="230" w:author="Pascal Heude" w:date="2026-08-01T21:11:00Z">
+            <w:rPrChange w:id="231" w:author="Pascal Heude" w:date="2026-08-01T21:11:00Z">
               <w:rPr>
                 <w:lang w:val="en-US"/>
               </w:rPr>
@@ -13225,9 +13233,9 @@
           <w:t xml:space="preserve">: </w:t>
         </w:r>
       </w:ins>
-      <w:moveToRangeStart w:id="231" w:author="Pascal Heude" w:date="2026-08-01T21:11:00Z" w:name="move236511099"/>
-      <w:moveTo w:id="232" w:author="Pascal Heude" w:date="2026-08-01T21:11:00Z">
-        <w:del w:id="233" w:author="Pascal Heude" w:date="2026-08-03T17:54:00Z">
+      <w:moveToRangeStart w:id="232" w:author="Pascal Heude" w:date="2026-08-01T21:11:00Z" w:name="move236511099"/>
+      <w:moveTo w:id="233" w:author="Pascal Heude" w:date="2026-08-01T21:11:00Z">
+        <w:del w:id="234" w:author="Pascal Heude" w:date="2026-08-03T17:54:00Z">
           <w:r>
             <w:rPr>
               <w:lang w:val="en-US"/>
@@ -13236,7 +13244,7 @@
           </w:r>
         </w:del>
       </w:moveTo>
-      <w:ins w:id="234" w:author="Pascal Heude" w:date="2026-08-03T17:54:00Z">
+      <w:ins w:id="235" w:author="Pascal Heude" w:date="2026-08-03T17:54:00Z">
         <w:r>
           <w:rPr>
             <w:lang w:val="en-US"/>
@@ -13244,14 +13252,14 @@
           <w:t>t</w:t>
         </w:r>
       </w:ins>
-      <w:moveTo w:id="235" w:author="Pascal Heude" w:date="2026-08-01T21:11:00Z">
+      <w:moveTo w:id="236" w:author="Pascal Heude" w:date="2026-08-01T21:11:00Z">
         <w:r>
           <w:rPr>
             <w:lang w:val="en-US"/>
           </w:rPr>
           <w:t xml:space="preserve">his tag </w:t>
         </w:r>
-        <w:del w:id="236" w:author="Pascal Heude" w:date="2026-08-01T21:12:00Z">
+        <w:del w:id="237" w:author="Pascal Heude" w:date="2026-08-01T21:12:00Z">
           <w:r>
             <w:rPr>
               <w:lang w:val="en-US"/>
@@ -13260,7 +13268,7 @@
           </w:r>
         </w:del>
       </w:moveTo>
-      <w:ins w:id="237" w:author="Pascal Heude" w:date="2026-08-01T21:12:00Z">
+      <w:ins w:id="238" w:author="Pascal Heude" w:date="2026-08-01T21:12:00Z">
         <w:r>
           <w:rPr>
             <w:lang w:val="en-US"/>
@@ -13268,7 +13276,7 @@
           <w:t>shall be</w:t>
         </w:r>
       </w:ins>
-      <w:moveTo w:id="238" w:author="Pascal Heude" w:date="2026-08-01T21:11:00Z">
+      <w:moveTo w:id="239" w:author="Pascal Heude" w:date="2026-08-01T21:11:00Z">
         <w:r>
           <w:rPr>
             <w:lang w:val="en-US"/>
@@ -13318,20 +13326,20 @@
         </w:r>
       </w:moveTo>
     </w:p>
-    <w:moveToRangeEnd w:id="231"/>
-    <w:p>
-      <w:pPr>
-        <w:rPr>
-          <w:lang w:val="en-US"/>
-        </w:rPr>
-      </w:pPr>
-      <w:ins w:id="239" w:author="Pascal Heude" w:date="2026-08-01T21:11:00Z">
+    <w:moveToRangeEnd w:id="232"/>
+    <w:p>
+      <w:pPr>
+        <w:rPr>
+          <w:lang w:val="en-US"/>
+        </w:rPr>
+      </w:pPr>
+      <w:ins w:id="240" w:author="Pascal Heude" w:date="2026-08-01T21:11:00Z">
         <w:r>
           <w:rPr>
             <w:b/>
             <w:color w:val="0070C0"/>
             <w:lang w:val="en-US"/>
-            <w:rPrChange w:id="240" w:author="Pascal Heude" w:date="2026-08-01T21:11:00Z">
+            <w:rPrChange w:id="241" w:author="Pascal Heude" w:date="2026-08-01T21:11:00Z">
               <w:rPr>
                 <w:lang w:val="en-US"/>
               </w:rPr>
@@ -13346,7 +13354,7 @@
           <w:t xml:space="preserve">: </w:t>
         </w:r>
       </w:ins>
-      <w:ins w:id="241" w:author="Pascal Heude" w:date="2026-08-03T17:54:00Z">
+      <w:ins w:id="242" w:author="Pascal Heude" w:date="2026-08-03T17:54:00Z">
         <w:r>
           <w:rPr>
             <w:lang w:val="en-US"/>
@@ -13354,7 +13362,7 @@
           <w:t>t</w:t>
         </w:r>
       </w:ins>
-      <w:del w:id="242" w:author="Pascal Heude" w:date="2026-08-03T17:54:00Z">
+      <w:del w:id="243" w:author="Pascal Heude" w:date="2026-08-03T17:54:00Z">
         <w:r>
           <w:rPr>
             <w:lang w:val="en-US"/>
@@ -13372,12 +13380,12 @@
     <w:p>
       <w:pPr>
         <w:rPr>
-          <w:moveFrom w:id="243" w:author="Pascal Heude" w:date="2026-08-01T21:11:00Z"/>
-          <w:lang w:val="en-US"/>
-        </w:rPr>
-      </w:pPr>
-      <w:moveFromRangeStart w:id="244" w:author="Pascal Heude" w:date="2026-08-01T21:11:00Z" w:name="move236511099"/>
-      <w:moveFrom w:id="245" w:author="Pascal Heude" w:date="2026-08-01T21:11:00Z">
+          <w:moveFrom w:id="244" w:author="Pascal Heude" w:date="2026-08-01T21:11:00Z"/>
+          <w:lang w:val="en-US"/>
+        </w:rPr>
+      </w:pPr>
+      <w:moveFromRangeStart w:id="245" w:author="Pascal Heude" w:date="2026-08-01T21:11:00Z" w:name="move236511099"/>
+      <w:moveFrom w:id="246" w:author="Pascal Heude" w:date="2026-08-01T21:11:00Z">
         <w:r>
           <w:rPr>
             <w:lang w:val="en-US"/>
@@ -13439,7 +13447,7 @@
         </w:r>
       </w:moveFrom>
     </w:p>
-    <w:moveFromRangeEnd w:id="244"/>
+    <w:moveFromRangeEnd w:id="245"/>
     <w:p>
       <w:pPr>
         <w:rPr>
@@ -13583,7 +13591,6 @@
         <w:rPr>
           <w:lang w:val="en-US"/>
         </w:rPr>
-        <w:lastRenderedPageBreak/>
         <w:t>&lt;THW_ID&gt;THW ID2&lt;/THW_ID&gt;</w:t>
       </w:r>
     </w:p>
@@ -13618,13 +13625,13 @@
       <w:pPr>
         <w:pStyle w:val="Titre3"/>
       </w:pPr>
-      <w:bookmarkStart w:id="246" w:name="_Tag_SUPPORT_FILE_LIST"/>
-      <w:bookmarkStart w:id="247" w:name="_Toc456106030"/>
-      <w:bookmarkEnd w:id="246"/>
+      <w:bookmarkStart w:id="247" w:name="_Tag_SUPPORT_FILE_LIST"/>
+      <w:bookmarkStart w:id="248" w:name="_Toc456106030"/>
+      <w:bookmarkEnd w:id="247"/>
       <w:r>
         <w:t>Tag SUPPORT_FILE_LIST</w:t>
       </w:r>
-      <w:bookmarkEnd w:id="247"/>
+      <w:bookmarkEnd w:id="248"/>
     </w:p>
     <w:p>
       <w:pPr>
@@ -13654,20 +13661,20 @@
     <w:p>
       <w:pPr>
         <w:rPr>
-          <w:moveTo w:id="248" w:author="Pascal Heude" w:date="2026-08-03T17:51:00Z"/>
+          <w:moveTo w:id="249" w:author="Pascal Heude" w:date="2026-08-03T17:51:00Z"/>
           <w:b/>
           <w:color w:val="0070C0"/>
           <w:lang w:val="en-US"/>
-          <w:rPrChange w:id="249" w:author="Pascal Heude" w:date="2026-08-03T17:52:00Z">
+          <w:rPrChange w:id="250" w:author="Pascal Heude" w:date="2026-08-03T17:52:00Z">
             <w:rPr>
-              <w:moveTo w:id="250" w:author="Pascal Heude" w:date="2026-08-03T17:51:00Z"/>
+              <w:moveTo w:id="251" w:author="Pascal Heude" w:date="2026-08-03T17:51:00Z"/>
               <w:lang w:val="en-US"/>
             </w:rPr>
           </w:rPrChange>
         </w:rPr>
       </w:pPr>
-      <w:moveToRangeStart w:id="251" w:author="Pascal Heude" w:date="2026-08-03T17:51:00Z" w:name="move236671916"/>
-      <w:moveTo w:id="252" w:author="Pascal Heude" w:date="2026-08-03T17:51:00Z">
+      <w:moveToRangeStart w:id="252" w:author="Pascal Heude" w:date="2026-08-03T17:51:00Z" w:name="move236671916"/>
+      <w:moveTo w:id="253" w:author="Pascal Heude" w:date="2026-08-03T17:51:00Z">
         <w:r>
           <w:rPr>
             <w:lang w:val="en-US"/>
@@ -13676,20 +13683,20 @@
         </w:r>
       </w:moveTo>
     </w:p>
-    <w:moveToRangeEnd w:id="251"/>
-    <w:p>
-      <w:pPr>
-        <w:rPr>
-          <w:lang w:val="en-US"/>
-        </w:rPr>
-      </w:pPr>
-      <w:ins w:id="253" w:author="Pascal Heude" w:date="2026-08-03T17:51:00Z">
+    <w:moveToRangeEnd w:id="252"/>
+    <w:p>
+      <w:pPr>
+        <w:rPr>
+          <w:lang w:val="en-US"/>
+        </w:rPr>
+      </w:pPr>
+      <w:ins w:id="254" w:author="Pascal Heude" w:date="2026-08-03T17:51:00Z">
         <w:r>
           <w:rPr>
             <w:b/>
             <w:color w:val="0070C0"/>
             <w:lang w:val="en-US"/>
-            <w:rPrChange w:id="254" w:author="Pascal Heude" w:date="2026-08-03T17:52:00Z">
+            <w:rPrChange w:id="255" w:author="Pascal Heude" w:date="2026-08-03T17:52:00Z">
               <w:rPr>
                 <w:lang w:val="en-US"/>
               </w:rPr>
@@ -13704,7 +13711,7 @@
           <w:t xml:space="preserve">: </w:t>
         </w:r>
       </w:ins>
-      <w:del w:id="255" w:author="Pascal Heude" w:date="2026-08-03T17:54:00Z">
+      <w:del w:id="256" w:author="Pascal Heude" w:date="2026-08-03T17:54:00Z">
         <w:r>
           <w:rPr>
             <w:lang w:val="en-US"/>
@@ -13712,7 +13719,7 @@
           <w:delText>T</w:delText>
         </w:r>
       </w:del>
-      <w:ins w:id="256" w:author="Pascal Heude" w:date="2026-08-03T17:54:00Z">
+      <w:ins w:id="257" w:author="Pascal Heude" w:date="2026-08-03T17:54:00Z">
         <w:r>
           <w:rPr>
             <w:lang w:val="en-US"/>
@@ -13745,12 +13752,12 @@
     <w:p>
       <w:pPr>
         <w:rPr>
-          <w:moveFrom w:id="257" w:author="Pascal Heude" w:date="2026-08-03T17:51:00Z"/>
-          <w:lang w:val="en-US"/>
-        </w:rPr>
-      </w:pPr>
-      <w:moveFromRangeStart w:id="258" w:author="Pascal Heude" w:date="2026-08-03T17:51:00Z" w:name="move236671916"/>
-      <w:moveFrom w:id="259" w:author="Pascal Heude" w:date="2026-08-03T17:51:00Z">
+          <w:moveFrom w:id="258" w:author="Pascal Heude" w:date="2026-08-03T17:51:00Z"/>
+          <w:lang w:val="en-US"/>
+        </w:rPr>
+      </w:pPr>
+      <w:moveFromRangeStart w:id="259" w:author="Pascal Heude" w:date="2026-08-03T17:51:00Z" w:name="move236671916"/>
+      <w:moveFrom w:id="260" w:author="Pascal Heude" w:date="2026-08-03T17:51:00Z">
         <w:r>
           <w:rPr>
             <w:lang w:val="en-US"/>
@@ -13759,24 +13766,25 @@
         </w:r>
       </w:moveFrom>
     </w:p>
-    <w:moveFromRangeEnd w:id="258"/>
-    <w:p>
-      <w:pPr>
-        <w:rPr>
-          <w:lang w:val="en-US"/>
-        </w:rPr>
-      </w:pPr>
-    </w:p>
-    <w:p>
-      <w:pPr>
-        <w:rPr>
-          <w:lang w:val="en-US"/>
-        </w:rPr>
-      </w:pPr>
-      <w:r>
-        <w:rPr>
-          <w:lang w:val="en-US"/>
-        </w:rPr>
+    <w:moveFromRangeEnd w:id="259"/>
+    <w:p>
+      <w:pPr>
+        <w:rPr>
+          <w:lang w:val="en-US"/>
+        </w:rPr>
+      </w:pPr>
+    </w:p>
+    <w:p>
+      <w:pPr>
+        <w:rPr>
+          <w:lang w:val="en-US"/>
+        </w:rPr>
+      </w:pPr>
+      <w:r>
+        <w:rPr>
+          <w:lang w:val="en-US"/>
+        </w:rPr>
+        <w:lastRenderedPageBreak/>
         <w:t xml:space="preserve">The attribute </w:t>
       </w:r>
       <w:r>
@@ -13936,11 +13944,11 @@
     <w:p>
       <w:pPr>
         <w:rPr>
-          <w:moveTo w:id="260" w:author="Pascal Heude" w:date="2026-08-01T21:12:00Z"/>
-          <w:lang w:val="en-US"/>
-        </w:rPr>
-      </w:pPr>
-      <w:ins w:id="261" w:author="Pascal Heude" w:date="2026-08-01T21:13:00Z">
+          <w:moveTo w:id="261" w:author="Pascal Heude" w:date="2026-08-01T21:12:00Z"/>
+          <w:lang w:val="en-US"/>
+        </w:rPr>
+      </w:pPr>
+      <w:ins w:id="262" w:author="Pascal Heude" w:date="2026-08-01T21:13:00Z">
         <w:r>
           <w:rPr>
             <w:b/>
@@ -13950,7 +13958,7 @@
           <w:t>URQT_</w:t>
         </w:r>
       </w:ins>
-      <w:ins w:id="262" w:author="Pascal Heude" w:date="2026-08-01T22:10:00Z">
+      <w:ins w:id="263" w:author="Pascal Heude" w:date="2026-08-01T22:10:00Z">
         <w:r>
           <w:rPr>
             <w:b/>
@@ -13960,7 +13968,7 @@
           <w:t>2</w:t>
         </w:r>
       </w:ins>
-      <w:ins w:id="263" w:author="Pascal Heude" w:date="2026-08-03T17:52:00Z">
+      <w:ins w:id="264" w:author="Pascal Heude" w:date="2026-08-03T17:52:00Z">
         <w:r>
           <w:rPr>
             <w:b/>
@@ -13970,9 +13978,9 @@
           <w:t>6</w:t>
         </w:r>
       </w:ins>
-      <w:moveToRangeStart w:id="264" w:author="Pascal Heude" w:date="2026-08-01T21:12:00Z" w:name="move236511174"/>
-      <w:moveTo w:id="265" w:author="Pascal Heude" w:date="2026-08-01T21:12:00Z">
-        <w:del w:id="266" w:author="Pascal Heude" w:date="2026-08-01T21:13:00Z">
+      <w:moveToRangeStart w:id="265" w:author="Pascal Heude" w:date="2026-08-01T21:12:00Z" w:name="move236511174"/>
+      <w:moveTo w:id="266" w:author="Pascal Heude" w:date="2026-08-01T21:12:00Z">
+        <w:del w:id="267" w:author="Pascal Heude" w:date="2026-08-01T21:13:00Z">
           <w:r>
             <w:rPr>
               <w:lang w:val="en-US"/>
@@ -13981,7 +13989,7 @@
           </w:r>
         </w:del>
       </w:moveTo>
-      <w:ins w:id="267" w:author="Pascal Heude" w:date="2026-08-01T21:13:00Z">
+      <w:ins w:id="268" w:author="Pascal Heude" w:date="2026-08-01T21:13:00Z">
         <w:r>
           <w:rPr>
             <w:lang w:val="en-US"/>
@@ -13989,14 +13997,14 @@
           <w:t>: t</w:t>
         </w:r>
       </w:ins>
-      <w:moveTo w:id="268" w:author="Pascal Heude" w:date="2026-08-01T21:12:00Z">
+      <w:moveTo w:id="269" w:author="Pascal Heude" w:date="2026-08-01T21:12:00Z">
         <w:r>
           <w:rPr>
             <w:lang w:val="en-US"/>
           </w:rPr>
           <w:t xml:space="preserve">he attribute </w:t>
         </w:r>
-        <w:del w:id="269" w:author="Pascal Heude" w:date="2026-08-01T21:13:00Z">
+        <w:del w:id="270" w:author="Pascal Heude" w:date="2026-08-01T21:13:00Z">
           <w:r>
             <w:rPr>
               <w:lang w:val="en-US"/>
@@ -14005,7 +14013,7 @@
           </w:r>
         </w:del>
       </w:moveTo>
-      <w:ins w:id="270" w:author="Pascal Heude" w:date="2026-08-01T21:13:00Z">
+      <w:ins w:id="271" w:author="Pascal Heude" w:date="2026-08-01T21:13:00Z">
         <w:r>
           <w:rPr>
             <w:lang w:val="en-US"/>
@@ -14013,7 +14021,7 @@
           <w:t>shall be</w:t>
         </w:r>
       </w:ins>
-      <w:moveTo w:id="271" w:author="Pascal Heude" w:date="2026-08-01T21:12:00Z">
+      <w:moveTo w:id="272" w:author="Pascal Heude" w:date="2026-08-01T21:12:00Z">
         <w:r>
           <w:rPr>
             <w:lang w:val="en-US"/>
@@ -14022,20 +14030,20 @@
         </w:r>
       </w:moveTo>
     </w:p>
-    <w:moveToRangeEnd w:id="264"/>
-    <w:p>
-      <w:pPr>
-        <w:rPr>
-          <w:lang w:val="en-US"/>
-        </w:rPr>
-      </w:pPr>
-      <w:ins w:id="272" w:author="Pascal Heude" w:date="2026-08-01T21:12:00Z">
+    <w:moveToRangeEnd w:id="265"/>
+    <w:p>
+      <w:pPr>
+        <w:rPr>
+          <w:lang w:val="en-US"/>
+        </w:rPr>
+      </w:pPr>
+      <w:ins w:id="273" w:author="Pascal Heude" w:date="2026-08-01T21:12:00Z">
         <w:r>
           <w:rPr>
             <w:b/>
             <w:color w:val="0070C0"/>
             <w:lang w:val="en-US"/>
-            <w:rPrChange w:id="273" w:author="Pascal Heude" w:date="2026-08-01T21:13:00Z">
+            <w:rPrChange w:id="274" w:author="Pascal Heude" w:date="2026-08-01T21:13:00Z">
               <w:rPr>
                 <w:lang w:val="en-US"/>
               </w:rPr>
@@ -14044,7 +14052,7 @@
           <w:t>URQT_2</w:t>
         </w:r>
       </w:ins>
-      <w:ins w:id="274" w:author="Pascal Heude" w:date="2026-08-01T22:10:00Z">
+      <w:ins w:id="275" w:author="Pascal Heude" w:date="2026-08-01T22:10:00Z">
         <w:r>
           <w:rPr>
             <w:b/>
@@ -14054,7 +14062,7 @@
           <w:t>7</w:t>
         </w:r>
       </w:ins>
-      <w:ins w:id="275" w:author="Pascal Heude" w:date="2026-08-01T21:12:00Z">
+      <w:ins w:id="276" w:author="Pascal Heude" w:date="2026-08-01T21:12:00Z">
         <w:r>
           <w:rPr>
             <w:lang w:val="en-US"/>
@@ -14062,7 +14070,7 @@
           <w:t xml:space="preserve">: </w:t>
         </w:r>
       </w:ins>
-      <w:ins w:id="276" w:author="Pascal Heude" w:date="2026-08-03T17:54:00Z">
+      <w:ins w:id="277" w:author="Pascal Heude" w:date="2026-08-03T17:54:00Z">
         <w:r>
           <w:rPr>
             <w:lang w:val="en-US"/>
@@ -14070,7 +14078,7 @@
           <w:t>t</w:t>
         </w:r>
       </w:ins>
-      <w:del w:id="277" w:author="Pascal Heude" w:date="2026-08-03T17:54:00Z">
+      <w:del w:id="278" w:author="Pascal Heude" w:date="2026-08-03T17:54:00Z">
         <w:r>
           <w:rPr>
             <w:lang w:val="en-US"/>
@@ -14088,12 +14096,12 @@
     <w:p>
       <w:pPr>
         <w:rPr>
-          <w:moveFrom w:id="278" w:author="Pascal Heude" w:date="2026-08-01T21:12:00Z"/>
-          <w:lang w:val="en-US"/>
-        </w:rPr>
-      </w:pPr>
-      <w:moveFromRangeStart w:id="279" w:author="Pascal Heude" w:date="2026-08-01T21:12:00Z" w:name="move236511174"/>
-      <w:moveFrom w:id="280" w:author="Pascal Heude" w:date="2026-08-01T21:12:00Z">
+          <w:moveFrom w:id="279" w:author="Pascal Heude" w:date="2026-08-01T21:12:00Z"/>
+          <w:lang w:val="en-US"/>
+        </w:rPr>
+      </w:pPr>
+      <w:moveFromRangeStart w:id="280" w:author="Pascal Heude" w:date="2026-08-01T21:12:00Z" w:name="move236511174"/>
+      <w:moveFrom w:id="281" w:author="Pascal Heude" w:date="2026-08-01T21:12:00Z">
         <w:r>
           <w:rPr>
             <w:lang w:val="en-US"/>
@@ -14102,7 +14110,7 @@
         </w:r>
       </w:moveFrom>
     </w:p>
-    <w:moveFromRangeEnd w:id="279"/>
+    <w:moveFromRangeEnd w:id="280"/>
     <w:p>
       <w:pPr>
         <w:rPr>
@@ -14202,13 +14210,13 @@
       <w:pPr>
         <w:pStyle w:val="Titre3"/>
       </w:pPr>
-      <w:bookmarkStart w:id="281" w:name="_Tag_SUPPORT_FILE"/>
-      <w:bookmarkStart w:id="282" w:name="_Toc456106031"/>
-      <w:bookmarkEnd w:id="281"/>
+      <w:bookmarkStart w:id="282" w:name="_Tag_SUPPORT_FILE"/>
+      <w:bookmarkStart w:id="283" w:name="_Toc456106031"/>
+      <w:bookmarkEnd w:id="282"/>
       <w:r>
         <w:t>Tag SUPPORT_FILE</w:t>
       </w:r>
-      <w:bookmarkEnd w:id="282"/>
+      <w:bookmarkEnd w:id="283"/>
     </w:p>
     <w:p>
       <w:pPr>
@@ -14244,11 +14252,11 @@
     <w:p>
       <w:pPr>
         <w:rPr>
-          <w:ins w:id="283" w:author="Pascal Heude" w:date="2026-07-29T22:59:00Z"/>
-          <w:lang w:val="en-US"/>
-        </w:rPr>
-      </w:pPr>
-      <w:ins w:id="284" w:author="Pascal Heude" w:date="2026-08-01T21:16:00Z">
+          <w:ins w:id="284" w:author="Pascal Heude" w:date="2026-07-29T22:59:00Z"/>
+          <w:lang w:val="en-US"/>
+        </w:rPr>
+      </w:pPr>
+      <w:ins w:id="285" w:author="Pascal Heude" w:date="2026-08-01T21:16:00Z">
         <w:r>
           <w:rPr>
             <w:b/>
@@ -14258,7 +14266,7 @@
           <w:t>URQT_2</w:t>
         </w:r>
       </w:ins>
-      <w:ins w:id="285" w:author="Pascal Heude" w:date="2026-08-01T22:11:00Z">
+      <w:ins w:id="286" w:author="Pascal Heude" w:date="2026-08-01T22:11:00Z">
         <w:r>
           <w:rPr>
             <w:b/>
@@ -14268,7 +14276,7 @@
           <w:t>8</w:t>
         </w:r>
       </w:ins>
-      <w:ins w:id="286" w:author="Pascal Heude" w:date="2026-08-01T21:16:00Z">
+      <w:ins w:id="287" w:author="Pascal Heude" w:date="2026-08-01T21:16:00Z">
         <w:r>
           <w:rPr>
             <w:lang w:val="en-US"/>
@@ -14276,7 +14284,7 @@
           <w:t xml:space="preserve">: </w:t>
         </w:r>
       </w:ins>
-      <w:ins w:id="287" w:author="Pascal Heude" w:date="2026-08-03T17:54:00Z">
+      <w:ins w:id="288" w:author="Pascal Heude" w:date="2026-08-03T17:54:00Z">
         <w:r>
           <w:rPr>
             <w:lang w:val="en-US"/>
@@ -14284,7 +14292,7 @@
           <w:t>t</w:t>
         </w:r>
       </w:ins>
-      <w:del w:id="288" w:author="Pascal Heude" w:date="2026-08-03T17:54:00Z">
+      <w:del w:id="289" w:author="Pascal Heude" w:date="2026-08-03T17:54:00Z">
         <w:r>
           <w:rPr>
             <w:lang w:val="en-US"/>
@@ -14298,7 +14306,7 @@
         </w:rPr>
         <w:t xml:space="preserve">he content shall be a </w:t>
       </w:r>
-      <w:del w:id="289" w:author="Pascal Heude" w:date="2026-08-01T21:16:00Z">
+      <w:del w:id="290" w:author="Pascal Heude" w:date="2026-08-01T21:16:00Z">
         <w:r>
           <w:rPr>
             <w:lang w:val="en-US"/>
@@ -14306,7 +14314,7 @@
           <w:delText>list of characters</w:delText>
         </w:r>
       </w:del>
-      <w:ins w:id="290" w:author="Pascal Heude" w:date="2026-08-01T21:16:00Z">
+      <w:ins w:id="291" w:author="Pascal Heude" w:date="2026-08-01T21:16:00Z">
         <w:r>
           <w:rPr>
             <w:lang w:val="en-US"/>
@@ -14314,7 +14322,7 @@
           <w:t>readable fil</w:t>
         </w:r>
       </w:ins>
-      <w:ins w:id="291" w:author="Pascal Heude" w:date="2026-08-01T21:17:00Z">
+      <w:ins w:id="292" w:author="Pascal Heude" w:date="2026-08-01T21:17:00Z">
         <w:r>
           <w:rPr>
             <w:lang w:val="en-US"/>
@@ -14328,7 +14336,7 @@
         </w:rPr>
         <w:t>.</w:t>
       </w:r>
-      <w:ins w:id="292" w:author="Pascal Heude" w:date="2026-07-29T23:20:00Z">
+      <w:ins w:id="293" w:author="Pascal Heude" w:date="2026-07-29T23:20:00Z">
         <w:r>
           <w:rPr>
             <w:lang w:val="en-US"/>
@@ -14336,7 +14344,7 @@
           <w:t xml:space="preserve"> The name of support file shall not be identical to the name of data files (</w:t>
         </w:r>
       </w:ins>
-      <w:ins w:id="293" w:author="Pascal Heude" w:date="2026-07-29T23:22:00Z">
+      <w:ins w:id="294" w:author="Pascal Heude" w:date="2026-07-29T23:22:00Z">
         <w:r>
           <w:rPr>
             <w:lang w:val="en-US"/>
@@ -14367,7 +14375,7 @@
         </w:rPr>
         <w:fldChar w:fldCharType="separate"/>
       </w:r>
-      <w:ins w:id="294" w:author="Pascal Heude" w:date="2026-07-29T23:22:00Z">
+      <w:ins w:id="295" w:author="Pascal Heude" w:date="2026-07-29T23:22:00Z">
         <w:r>
           <w:rPr>
             <w:lang w:val="en-US"/>
@@ -14381,7 +14389,7 @@
           <w:fldChar w:fldCharType="end"/>
         </w:r>
       </w:ins>
-      <w:ins w:id="295" w:author="Pascal Heude" w:date="2026-07-29T23:23:00Z">
+      <w:ins w:id="296" w:author="Pascal Heude" w:date="2026-07-29T23:23:00Z">
         <w:r>
           <w:rPr>
             <w:lang w:val="en-US"/>
@@ -14389,7 +14397,7 @@
           <w:t>)</w:t>
         </w:r>
       </w:ins>
-      <w:ins w:id="296" w:author="Pascal Heude" w:date="2026-07-29T23:22:00Z">
+      <w:ins w:id="297" w:author="Pascal Heude" w:date="2026-07-29T23:22:00Z">
         <w:r>
           <w:rPr>
             <w:lang w:val="en-US"/>
@@ -14404,7 +14412,7 @@
           <w:lang w:val="en-US"/>
         </w:rPr>
       </w:pPr>
-      <w:ins w:id="297" w:author="Pascal Heude" w:date="2026-07-29T22:59:00Z">
+      <w:ins w:id="298" w:author="Pascal Heude" w:date="2026-07-29T22:59:00Z">
         <w:r>
           <w:rPr>
             <w:lang w:val="en-US"/>
@@ -14412,7 +14420,7 @@
           <w:t xml:space="preserve">The support files will be copied in the directory provided by the tag </w:t>
         </w:r>
       </w:ins>
-      <w:ins w:id="298" w:author="Pascal Heude" w:date="2026-07-29T23:02:00Z">
+      <w:ins w:id="299" w:author="Pascal Heude" w:date="2026-07-29T23:02:00Z">
         <w:r>
           <w:rPr>
             <w:lang w:val="en-US"/>
@@ -14445,7 +14453,7 @@
           <w:fldChar w:fldCharType="end"/>
         </w:r>
       </w:ins>
-      <w:ins w:id="299" w:author="Pascal Heude" w:date="2026-07-29T23:24:00Z">
+      <w:ins w:id="300" w:author="Pascal Heude" w:date="2026-07-29T23:24:00Z">
         <w:r>
           <w:rPr>
             <w:lang w:val="en-US"/>
@@ -14453,7 +14461,7 @@
           <w:t>, with the dat</w:t>
         </w:r>
       </w:ins>
-      <w:ins w:id="300" w:author="Pascal Heude" w:date="2026-07-29T23:26:00Z">
+      <w:ins w:id="301" w:author="Pascal Heude" w:date="2026-07-29T23:26:00Z">
         <w:r>
           <w:rPr>
             <w:lang w:val="en-US"/>
@@ -14461,7 +14469,7 @@
           <w:t>a</w:t>
         </w:r>
       </w:ins>
-      <w:ins w:id="301" w:author="Pascal Heude" w:date="2026-07-29T23:24:00Z">
+      <w:ins w:id="302" w:author="Pascal Heude" w:date="2026-07-29T23:24:00Z">
         <w:r>
           <w:rPr>
             <w:lang w:val="en-US"/>
@@ -14469,7 +14477,7 @@
           <w:t xml:space="preserve"> files</w:t>
         </w:r>
       </w:ins>
-      <w:ins w:id="302" w:author="Pascal Heude" w:date="2026-07-29T23:01:00Z">
+      <w:ins w:id="303" w:author="Pascal Heude" w:date="2026-07-29T23:01:00Z">
         <w:r>
           <w:rPr>
             <w:lang w:val="en-US"/>
@@ -14484,7 +14492,7 @@
           <w:lang w:val="en-US"/>
         </w:rPr>
       </w:pPr>
-      <w:ins w:id="303" w:author="Pascal Heude" w:date="2026-08-01T21:17:00Z">
+      <w:ins w:id="304" w:author="Pascal Heude" w:date="2026-08-01T21:17:00Z">
         <w:r>
           <w:rPr>
             <w:b/>
@@ -14494,7 +14502,7 @@
           <w:t>URQT_2</w:t>
         </w:r>
       </w:ins>
-      <w:ins w:id="304" w:author="Pascal Heude" w:date="2026-08-01T22:11:00Z">
+      <w:ins w:id="305" w:author="Pascal Heude" w:date="2026-08-01T22:11:00Z">
         <w:r>
           <w:rPr>
             <w:b/>
@@ -14504,7 +14512,7 @@
           <w:t>9</w:t>
         </w:r>
       </w:ins>
-      <w:ins w:id="305" w:author="Pascal Heude" w:date="2026-08-01T21:17:00Z">
+      <w:ins w:id="306" w:author="Pascal Heude" w:date="2026-08-01T21:17:00Z">
         <w:r>
           <w:rPr>
             <w:lang w:val="en-US"/>
@@ -14512,7 +14520,7 @@
           <w:t xml:space="preserve">: </w:t>
         </w:r>
       </w:ins>
-      <w:del w:id="306" w:author="Pascal Heude" w:date="2026-08-03T17:54:00Z">
+      <w:del w:id="307" w:author="Pascal Heude" w:date="2026-08-03T17:54:00Z">
         <w:r>
           <w:rPr>
             <w:lang w:val="en-US"/>
@@ -14520,7 +14528,7 @@
           <w:delText>T</w:delText>
         </w:r>
       </w:del>
-      <w:ins w:id="307" w:author="Pascal Heude" w:date="2026-08-03T17:54:00Z">
+      <w:ins w:id="308" w:author="Pascal Heude" w:date="2026-08-03T17:54:00Z">
         <w:r>
           <w:rPr>
             <w:lang w:val="en-US"/>
@@ -14743,7 +14751,7 @@
         </w:rPr>
         <w:t>&lt;SUPPORT_FILE&gt;c:\temp\</w:t>
       </w:r>
-      <w:del w:id="308" w:author="Pascal Heude" w:date="2026-07-29T22:54:00Z">
+      <w:del w:id="309" w:author="Pascal Heude" w:date="2026-07-29T22:54:00Z">
         <w:r>
           <w:rPr>
             <w:lang w:val="en-US"/>
@@ -14751,7 +14759,7 @@
           <w:delText>file1</w:delText>
         </w:r>
       </w:del>
-      <w:ins w:id="309" w:author="Pascal Heude" w:date="2026-07-29T22:54:00Z">
+      <w:ins w:id="310" w:author="Pascal Heude" w:date="2026-07-29T22:54:00Z">
         <w:r>
           <w:rPr>
             <w:lang w:val="en-US"/>
@@ -14809,25 +14817,24 @@
       <w:pPr>
         <w:pStyle w:val="Titre3"/>
       </w:pPr>
-      <w:bookmarkStart w:id="310" w:name="_Tag_USER_DATA"/>
-      <w:bookmarkStart w:id="311" w:name="_Toc456106032"/>
-      <w:bookmarkEnd w:id="310"/>
+      <w:bookmarkStart w:id="311" w:name="_Tag_USER_DATA"/>
+      <w:bookmarkStart w:id="312" w:name="_Toc456106032"/>
+      <w:bookmarkEnd w:id="311"/>
       <w:r>
         <w:t>Tag USER_DATA</w:t>
       </w:r>
-      <w:bookmarkEnd w:id="311"/>
-    </w:p>
-    <w:p>
-      <w:pPr>
-        <w:rPr>
-          <w:lang w:val="en-US"/>
-        </w:rPr>
-      </w:pPr>
-      <w:r>
-        <w:rPr>
-          <w:lang w:val="en-US"/>
-        </w:rPr>
-        <w:lastRenderedPageBreak/>
+      <w:bookmarkEnd w:id="312"/>
+    </w:p>
+    <w:p>
+      <w:pPr>
+        <w:rPr>
+          <w:lang w:val="en-US"/>
+        </w:rPr>
+      </w:pPr>
+      <w:r>
+        <w:rPr>
+          <w:lang w:val="en-US"/>
+        </w:rPr>
         <w:t xml:space="preserve">This tag is used to include the </w:t>
       </w:r>
       <w:r>
@@ -14892,7 +14899,7 @@
           <w:lang w:val="en-US"/>
         </w:rPr>
       </w:pPr>
-      <w:ins w:id="312" w:author="Pascal Heude" w:date="2026-08-01T21:19:00Z">
+      <w:ins w:id="313" w:author="Pascal Heude" w:date="2026-08-01T21:19:00Z">
         <w:r>
           <w:rPr>
             <w:b/>
@@ -14902,7 +14909,7 @@
           <w:t>URQT_</w:t>
         </w:r>
       </w:ins>
-      <w:ins w:id="313" w:author="Pascal Heude" w:date="2026-08-01T22:11:00Z">
+      <w:ins w:id="314" w:author="Pascal Heude" w:date="2026-08-01T22:11:00Z">
         <w:r>
           <w:rPr>
             <w:b/>
@@ -14912,7 +14919,7 @@
           <w:t>30</w:t>
         </w:r>
       </w:ins>
-      <w:ins w:id="314" w:author="Pascal Heude" w:date="2026-08-01T21:19:00Z">
+      <w:ins w:id="315" w:author="Pascal Heude" w:date="2026-08-01T21:19:00Z">
         <w:r>
           <w:rPr>
             <w:lang w:val="en-US"/>
@@ -14920,7 +14927,7 @@
           <w:t xml:space="preserve">: </w:t>
         </w:r>
       </w:ins>
-      <w:del w:id="315" w:author="Pascal Heude" w:date="2026-08-03T17:54:00Z">
+      <w:del w:id="316" w:author="Pascal Heude" w:date="2026-08-03T17:54:00Z">
         <w:r>
           <w:rPr>
             <w:lang w:val="en-US"/>
@@ -14928,7 +14935,7 @@
           <w:delText>T</w:delText>
         </w:r>
       </w:del>
-      <w:ins w:id="316" w:author="Pascal Heude" w:date="2026-08-03T17:54:00Z">
+      <w:ins w:id="317" w:author="Pascal Heude" w:date="2026-08-03T17:54:00Z">
         <w:r>
           <w:rPr>
             <w:lang w:val="en-US"/>
@@ -14991,18 +14998,18 @@
           <w:lang w:val="en-US"/>
         </w:rPr>
       </w:pPr>
-      <w:bookmarkStart w:id="317" w:name="_Tag_USER_DATA_FILE"/>
-      <w:bookmarkEnd w:id="317"/>
+      <w:bookmarkStart w:id="318" w:name="_Tag_USER_DATA_FILE"/>
+      <w:bookmarkEnd w:id="318"/>
     </w:p>
     <w:p>
       <w:pPr>
         <w:pStyle w:val="Titre3"/>
       </w:pPr>
-      <w:bookmarkStart w:id="318" w:name="_Toc456106033"/>
+      <w:bookmarkStart w:id="319" w:name="_Toc456106033"/>
       <w:r>
         <w:t>Tag USER_DATA_FILE</w:t>
       </w:r>
-      <w:bookmarkEnd w:id="318"/>
+      <w:bookmarkEnd w:id="319"/>
     </w:p>
     <w:p>
       <w:pPr>
@@ -15036,13 +15043,14 @@
           <w:lang w:val="en-US"/>
         </w:rPr>
       </w:pPr>
-      <w:ins w:id="319" w:author="Pascal Heude" w:date="2026-08-01T21:20:00Z">
+      <w:ins w:id="320" w:author="Pascal Heude" w:date="2026-08-01T21:20:00Z">
         <w:r>
           <w:rPr>
             <w:b/>
             <w:color w:val="0070C0"/>
             <w:lang w:val="en-US"/>
           </w:rPr>
+          <w:lastRenderedPageBreak/>
           <w:t>URQT_</w:t>
         </w:r>
         <w:r>
@@ -15054,7 +15062,7 @@
           <w:t>3</w:t>
         </w:r>
       </w:ins>
-      <w:ins w:id="320" w:author="Pascal Heude" w:date="2026-08-01T22:11:00Z">
+      <w:ins w:id="321" w:author="Pascal Heude" w:date="2026-08-01T22:11:00Z">
         <w:r>
           <w:rPr>
             <w:b/>
@@ -15064,7 +15072,7 @@
           <w:t>1</w:t>
         </w:r>
       </w:ins>
-      <w:ins w:id="321" w:author="Pascal Heude" w:date="2026-08-01T21:20:00Z">
+      <w:ins w:id="322" w:author="Pascal Heude" w:date="2026-08-01T21:20:00Z">
         <w:r>
           <w:rPr>
             <w:lang w:val="en-US"/>
@@ -15072,7 +15080,7 @@
           <w:t xml:space="preserve">: </w:t>
         </w:r>
       </w:ins>
-      <w:ins w:id="322" w:author="Pascal Heude" w:date="2026-08-03T17:55:00Z">
+      <w:ins w:id="323" w:author="Pascal Heude" w:date="2026-08-03T17:55:00Z">
         <w:r>
           <w:rPr>
             <w:lang w:val="en-US"/>
@@ -15080,7 +15088,7 @@
           <w:t>i</w:t>
         </w:r>
       </w:ins>
-      <w:ins w:id="323" w:author="Pascal Heude" w:date="2026-08-01T21:20:00Z">
+      <w:ins w:id="324" w:author="Pascal Heude" w:date="2026-08-01T21:20:00Z">
         <w:r>
           <w:rPr>
             <w:lang w:val="en-US"/>
@@ -15088,7 +15096,7 @@
           <w:t>f used, t</w:t>
         </w:r>
       </w:ins>
-      <w:del w:id="324" w:author="Pascal Heude" w:date="2026-08-01T21:20:00Z">
+      <w:del w:id="325" w:author="Pascal Heude" w:date="2026-08-01T21:20:00Z">
         <w:r>
           <w:rPr>
             <w:lang w:val="en-US"/>
@@ -15102,7 +15110,7 @@
         </w:rPr>
         <w:t xml:space="preserve">he content shall be </w:t>
       </w:r>
-      <w:ins w:id="325" w:author="Pascal Heude" w:date="2026-08-01T21:20:00Z">
+      <w:ins w:id="326" w:author="Pascal Heude" w:date="2026-08-01T21:20:00Z">
         <w:r>
           <w:rPr>
             <w:lang w:val="en-US"/>
@@ -15110,7 +15118,7 @@
           <w:t>a readable filename, including or not a path, absolute or relative.</w:t>
         </w:r>
       </w:ins>
-      <w:del w:id="326" w:author="Pascal Heude" w:date="2026-08-01T21:20:00Z">
+      <w:del w:id="327" w:author="Pascal Heude" w:date="2026-08-01T21:20:00Z">
         <w:r>
           <w:rPr>
             <w:lang w:val="en-US"/>
@@ -15270,13 +15278,13 @@
       <w:pPr>
         <w:pStyle w:val="Titre3"/>
       </w:pPr>
-      <w:bookmarkStart w:id="327" w:name="_Tag_USER_DATA_TEXT"/>
-      <w:bookmarkStart w:id="328" w:name="_Toc456106034"/>
-      <w:bookmarkEnd w:id="327"/>
+      <w:bookmarkStart w:id="328" w:name="_Tag_USER_DATA_TEXT"/>
+      <w:bookmarkStart w:id="329" w:name="_Toc456106034"/>
+      <w:bookmarkEnd w:id="328"/>
       <w:r>
         <w:t>Tag USER_DATA_TEXT</w:t>
       </w:r>
-      <w:bookmarkEnd w:id="328"/>
+      <w:bookmarkEnd w:id="329"/>
     </w:p>
     <w:p>
       <w:pPr>
@@ -15310,7 +15318,7 @@
           <w:lang w:val="en-US"/>
         </w:rPr>
       </w:pPr>
-      <w:ins w:id="329" w:author="Pascal Heude" w:date="2026-08-01T21:21:00Z">
+      <w:ins w:id="330" w:author="Pascal Heude" w:date="2026-08-01T21:21:00Z">
         <w:r>
           <w:rPr>
             <w:b/>
@@ -15328,7 +15336,7 @@
           <w:t>3</w:t>
         </w:r>
       </w:ins>
-      <w:ins w:id="330" w:author="Pascal Heude" w:date="2026-08-01T22:11:00Z">
+      <w:ins w:id="331" w:author="Pascal Heude" w:date="2026-08-01T22:11:00Z">
         <w:r>
           <w:rPr>
             <w:b/>
@@ -15338,7 +15346,7 @@
           <w:t>2</w:t>
         </w:r>
       </w:ins>
-      <w:ins w:id="331" w:author="Pascal Heude" w:date="2026-08-01T21:21:00Z">
+      <w:ins w:id="332" w:author="Pascal Heude" w:date="2026-08-01T21:21:00Z">
         <w:r>
           <w:rPr>
             <w:lang w:val="en-US"/>
@@ -15346,7 +15354,7 @@
           <w:t xml:space="preserve">: </w:t>
         </w:r>
       </w:ins>
-      <w:ins w:id="332" w:author="Pascal Heude" w:date="2026-08-03T17:55:00Z">
+      <w:ins w:id="333" w:author="Pascal Heude" w:date="2026-08-03T17:55:00Z">
         <w:r>
           <w:rPr>
             <w:lang w:val="en-US"/>
@@ -15354,7 +15362,7 @@
           <w:t>i</w:t>
         </w:r>
       </w:ins>
-      <w:ins w:id="333" w:author="Pascal Heude" w:date="2026-08-01T21:21:00Z">
+      <w:ins w:id="334" w:author="Pascal Heude" w:date="2026-08-01T21:21:00Z">
         <w:r>
           <w:rPr>
             <w:lang w:val="en-US"/>
@@ -15362,7 +15370,7 @@
           <w:t xml:space="preserve">f used, </w:t>
         </w:r>
       </w:ins>
-      <w:del w:id="334" w:author="Pascal Heude" w:date="2026-08-01T21:21:00Z">
+      <w:del w:id="335" w:author="Pascal Heude" w:date="2026-08-01T21:21:00Z">
         <w:r>
           <w:rPr>
             <w:lang w:val="en-US"/>
@@ -15370,7 +15378,7 @@
           <w:delText>T</w:delText>
         </w:r>
       </w:del>
-      <w:ins w:id="335" w:author="Pascal Heude" w:date="2026-08-01T21:21:00Z">
+      <w:ins w:id="336" w:author="Pascal Heude" w:date="2026-08-01T21:21:00Z">
         <w:r>
           <w:rPr>
             <w:lang w:val="en-US"/>
@@ -15448,11 +15456,11 @@
       <w:pPr>
         <w:pStyle w:val="Titre3"/>
       </w:pPr>
-      <w:bookmarkStart w:id="336" w:name="_Toc456106035"/>
+      <w:bookmarkStart w:id="337" w:name="_Toc456106035"/>
       <w:r>
         <w:t>Tag USER_DATA_BCC</w:t>
       </w:r>
-      <w:bookmarkEnd w:id="336"/>
+      <w:bookmarkEnd w:id="337"/>
     </w:p>
     <w:p>
       <w:pPr>
@@ -15492,13 +15500,13 @@
       <w:pPr>
         <w:pStyle w:val="Titre3"/>
       </w:pPr>
-      <w:bookmarkStart w:id="337" w:name="_Tag_MEDIA"/>
-      <w:bookmarkStart w:id="338" w:name="_Toc456106036"/>
-      <w:bookmarkEnd w:id="337"/>
+      <w:bookmarkStart w:id="338" w:name="_Tag_MEDIA"/>
+      <w:bookmarkStart w:id="339" w:name="_Toc456106036"/>
+      <w:bookmarkEnd w:id="338"/>
       <w:r>
         <w:t>Tag MEDIA</w:t>
       </w:r>
-      <w:bookmarkEnd w:id="338"/>
+      <w:bookmarkEnd w:id="339"/>
     </w:p>
     <w:p>
       <w:pPr>
@@ -15633,14 +15641,14 @@
           <w:lang w:val="en-US"/>
         </w:rPr>
       </w:pPr>
-      <w:bookmarkStart w:id="339" w:name="_Toc456106037"/>
+      <w:bookmarkStart w:id="340" w:name="_Toc456106037"/>
       <w:r>
         <w:rPr>
           <w:lang w:val="en-US"/>
         </w:rPr>
         <w:t>LIMITATIONS</w:t>
       </w:r>
-      <w:bookmarkEnd w:id="339"/>
+      <w:bookmarkEnd w:id="340"/>
     </w:p>
     <w:p>
       <w:pPr>
@@ -15666,12 +15674,11 @@
       <w:pPr>
         <w:pStyle w:val="Titre2"/>
       </w:pPr>
-      <w:bookmarkStart w:id="340" w:name="_Toc456106038"/>
-      <w:r>
-        <w:lastRenderedPageBreak/>
+      <w:bookmarkStart w:id="341" w:name="_Toc456106038"/>
+      <w:r>
         <w:t>ARINC665-1</w:t>
       </w:r>
-      <w:bookmarkEnd w:id="340"/>
+      <w:bookmarkEnd w:id="341"/>
     </w:p>
     <w:p>
       <w:pPr>
@@ -15733,21 +15740,21 @@
       <w:pPr>
         <w:pStyle w:val="Titre2"/>
       </w:pPr>
-      <w:bookmarkStart w:id="341" w:name="_Toc456106039"/>
+      <w:bookmarkStart w:id="342" w:name="_Toc456106039"/>
       <w:r>
         <w:t>ARINC665-2</w:t>
       </w:r>
-      <w:bookmarkEnd w:id="341"/>
+      <w:bookmarkEnd w:id="342"/>
     </w:p>
     <w:p>
       <w:pPr>
         <w:pStyle w:val="Titre3"/>
       </w:pPr>
-      <w:bookmarkStart w:id="342" w:name="_Toc456106040"/>
+      <w:bookmarkStart w:id="343" w:name="_Toc456106040"/>
       <w:r>
         <w:t>General</w:t>
       </w:r>
-      <w:bookmarkEnd w:id="342"/>
+      <w:bookmarkEnd w:id="343"/>
     </w:p>
     <w:p>
       <w:pPr>
@@ -15788,6 +15795,7 @@
         <w:rPr>
           <w:lang w:val="en-US"/>
         </w:rPr>
+        <w:lastRenderedPageBreak/>
         <w:t>It’s not possible to have several integrity checks in case of several support files.</w:t>
       </w:r>
       <w:r>
@@ -15805,14 +15813,14 @@
           <w:numId w:val="22"/>
         </w:numPr>
         <w:rPr>
-          <w:ins w:id="343" w:author="Pascal Heude" w:date="2026-08-03T17:45:00Z"/>
-          <w:lang w:val="en-US"/>
-        </w:rPr>
-        <w:pPrChange w:id="344" w:author="Pascal Heude" w:date="2026-08-03T17:46:00Z">
+          <w:ins w:id="344" w:author="Pascal Heude" w:date="2026-08-03T17:45:00Z"/>
+          <w:lang w:val="en-US"/>
+        </w:rPr>
+        <w:pPrChange w:id="345" w:author="Pascal Heude" w:date="2026-08-03T17:46:00Z">
           <w:pPr/>
         </w:pPrChange>
       </w:pPr>
-      <w:ins w:id="345" w:author="Pascal Heude" w:date="2026-08-03T17:45:00Z">
+      <w:ins w:id="346" w:author="Pascal Heude" w:date="2026-08-03T17:45:00Z">
         <w:r>
           <w:rPr>
             <w:lang w:val="en-US"/>
@@ -15832,11 +15840,11 @@
       <w:pPr>
         <w:pStyle w:val="Titre3"/>
       </w:pPr>
-      <w:bookmarkStart w:id="346" w:name="_Toc456106041"/>
+      <w:bookmarkStart w:id="347" w:name="_Toc456106041"/>
       <w:r>
         <w:t>Data files</w:t>
       </w:r>
-      <w:bookmarkEnd w:id="346"/>
+      <w:bookmarkEnd w:id="347"/>
     </w:p>
     <w:p>
       <w:pPr>
@@ -15874,14 +15882,14 @@
       <w:pPr>
         <w:pStyle w:val="Titre3"/>
       </w:pPr>
-      <w:bookmarkStart w:id="347" w:name="_Toc456106042"/>
+      <w:bookmarkStart w:id="348" w:name="_Toc456106042"/>
       <w:r>
         <w:t>List</w:t>
       </w:r>
       <w:r>
         <w:t>-of-Files file</w:t>
       </w:r>
-      <w:bookmarkEnd w:id="347"/>
+      <w:bookmarkEnd w:id="348"/>
     </w:p>
     <w:p>
       <w:pPr>
@@ -15960,11 +15968,11 @@
       <w:pPr>
         <w:pStyle w:val="Titre3"/>
       </w:pPr>
-      <w:bookmarkStart w:id="348" w:name="_Toc456106043"/>
+      <w:bookmarkStart w:id="349" w:name="_Toc456106043"/>
       <w:r>
         <w:t>List-of-Loads file</w:t>
       </w:r>
-      <w:bookmarkEnd w:id="348"/>
+      <w:bookmarkEnd w:id="349"/>
     </w:p>
     <w:p>
       <w:pPr>
@@ -16055,11 +16063,11 @@
       <w:pPr>
         <w:pStyle w:val="Titre3"/>
       </w:pPr>
-      <w:bookmarkStart w:id="349" w:name="_Toc456106044"/>
+      <w:bookmarkStart w:id="350" w:name="_Toc456106044"/>
       <w:r>
         <w:t>List-of-Batch file</w:t>
       </w:r>
-      <w:bookmarkEnd w:id="349"/>
+      <w:bookmarkEnd w:id="350"/>
     </w:p>
     <w:p>
       <w:pPr>
@@ -16228,11 +16236,11 @@
       <w:pPr>
         <w:pStyle w:val="Titre3"/>
       </w:pPr>
-      <w:bookmarkStart w:id="350" w:name="_Toc456106045"/>
+      <w:bookmarkStart w:id="351" w:name="_Toc456106045"/>
       <w:r>
         <w:t>Batch file</w:t>
       </w:r>
-      <w:bookmarkEnd w:id="350"/>
+      <w:bookmarkEnd w:id="351"/>
     </w:p>
     <w:p>
       <w:pPr>
@@ -16273,21 +16281,21 @@
       <w:pPr>
         <w:pStyle w:val="Titre2"/>
       </w:pPr>
-      <w:bookmarkStart w:id="351" w:name="_Toc456106046"/>
+      <w:bookmarkStart w:id="352" w:name="_Toc456106046"/>
       <w:r>
         <w:t>ARINC665-3</w:t>
       </w:r>
-      <w:bookmarkEnd w:id="351"/>
+      <w:bookmarkEnd w:id="352"/>
     </w:p>
     <w:p>
       <w:pPr>
         <w:pStyle w:val="Titre3"/>
       </w:pPr>
-      <w:bookmarkStart w:id="352" w:name="_Toc456106047"/>
+      <w:bookmarkStart w:id="353" w:name="_Toc456106047"/>
       <w:r>
         <w:t>General</w:t>
       </w:r>
-      <w:bookmarkEnd w:id="352"/>
+      <w:bookmarkEnd w:id="353"/>
     </w:p>
     <w:p>
       <w:pPr>
@@ -16348,11 +16356,11 @@
       <w:pPr>
         <w:pStyle w:val="Titre3"/>
       </w:pPr>
-      <w:bookmarkStart w:id="353" w:name="_Toc456106048"/>
+      <w:bookmarkStart w:id="354" w:name="_Toc456106048"/>
       <w:r>
         <w:t>Header file</w:t>
       </w:r>
-      <w:bookmarkEnd w:id="353"/>
+      <w:bookmarkEnd w:id="354"/>
     </w:p>
     <w:p>
       <w:pPr>
@@ -16369,7 +16377,6 @@
         <w:rPr>
           <w:lang w:val="en-US"/>
         </w:rPr>
-        <w:lastRenderedPageBreak/>
         <w:t>Only MD5 and SHA-1 integrity check algorithms are supported</w:t>
       </w:r>
     </w:p>
@@ -16462,11 +16469,11 @@
       <w:pPr>
         <w:pStyle w:val="Titre3"/>
       </w:pPr>
-      <w:bookmarkStart w:id="354" w:name="_Toc456106049"/>
+      <w:bookmarkStart w:id="355" w:name="_Toc456106049"/>
       <w:r>
         <w:t>Data files</w:t>
       </w:r>
-      <w:bookmarkEnd w:id="354"/>
+      <w:bookmarkEnd w:id="355"/>
     </w:p>
     <w:p>
       <w:pPr>
@@ -16501,6 +16508,7 @@
         <w:rPr>
           <w:lang w:val="en-US"/>
         </w:rPr>
+        <w:lastRenderedPageBreak/>
         <w:t>The maximum number of data files is 9999</w:t>
       </w:r>
       <w:r>
@@ -16522,14 +16530,14 @@
       <w:pPr>
         <w:pStyle w:val="Titre3"/>
       </w:pPr>
-      <w:bookmarkStart w:id="355" w:name="_Toc456106050"/>
+      <w:bookmarkStart w:id="356" w:name="_Toc456106050"/>
       <w:r>
         <w:t>List</w:t>
       </w:r>
       <w:r>
         <w:t>-of-Files file</w:t>
       </w:r>
-      <w:bookmarkEnd w:id="355"/>
+      <w:bookmarkEnd w:id="356"/>
     </w:p>
     <w:p>
       <w:pPr>
@@ -16704,11 +16712,11 @@
       <w:pPr>
         <w:pStyle w:val="Titre3"/>
       </w:pPr>
-      <w:bookmarkStart w:id="356" w:name="_Toc456106051"/>
+      <w:bookmarkStart w:id="357" w:name="_Toc456106051"/>
       <w:r>
         <w:t>List-of-Loads file</w:t>
       </w:r>
-      <w:bookmarkEnd w:id="356"/>
+      <w:bookmarkEnd w:id="357"/>
     </w:p>
     <w:p>
       <w:pPr>
@@ -16871,11 +16879,11 @@
       <w:pPr>
         <w:pStyle w:val="Titre3"/>
       </w:pPr>
-      <w:bookmarkStart w:id="357" w:name="_Toc456106052"/>
+      <w:bookmarkStart w:id="358" w:name="_Toc456106052"/>
       <w:r>
         <w:t>List-of-Batch file</w:t>
       </w:r>
-      <w:bookmarkEnd w:id="357"/>
+      <w:bookmarkEnd w:id="358"/>
     </w:p>
     <w:p>
       <w:pPr>
@@ -17002,11 +17010,11 @@
       <w:pPr>
         <w:pStyle w:val="Titre3"/>
       </w:pPr>
-      <w:bookmarkStart w:id="358" w:name="_Toc456106053"/>
+      <w:bookmarkStart w:id="359" w:name="_Toc456106053"/>
       <w:r>
         <w:t>Batch file</w:t>
       </w:r>
-      <w:bookmarkEnd w:id="358"/>
+      <w:bookmarkEnd w:id="359"/>
     </w:p>
     <w:p>
       <w:pPr>
@@ -17066,14 +17074,14 @@
           <w:lang w:val="en-US"/>
         </w:rPr>
       </w:pPr>
-      <w:bookmarkStart w:id="359" w:name="_Toc456106054"/>
+      <w:bookmarkStart w:id="360" w:name="_Toc456106054"/>
       <w:r>
         <w:rPr>
           <w:lang w:val="en-US"/>
         </w:rPr>
         <w:t>LOAD STRUCTURE</w:t>
       </w:r>
-      <w:bookmarkEnd w:id="359"/>
+      <w:bookmarkEnd w:id="360"/>
     </w:p>
     <w:p>
       <w:pPr>
@@ -17105,7 +17113,7 @@
         </w:rPr>
         <w:t>FILES.LUM</w:t>
       </w:r>
-      <w:ins w:id="360" w:author="Pascal Heude" w:date="2026-08-03T17:42:00Z">
+      <w:ins w:id="361" w:author="Pascal Heude" w:date="2026-08-03T17:42:00Z">
         <w:r>
           <w:rPr>
             <w:lang w:val="en-US"/>
@@ -17120,7 +17128,7 @@
           <w:fldChar w:fldCharType="begin"/>
         </w:r>
       </w:ins>
-      <w:ins w:id="361" w:author="Pascal Heude" w:date="2026-08-03T17:43:00Z">
+      <w:ins w:id="362" w:author="Pascal Heude" w:date="2026-08-03T17:43:00Z">
         <w:r>
           <w:rPr>
             <w:rStyle w:val="Lienhypertexte"/>
@@ -17128,46 +17136,26 @@
           </w:rPr>
           <w:instrText>HYPERLINK  \l "_Tag_MEDIA"</w:instrText>
         </w:r>
+      </w:ins>
+      <w:ins w:id="363" w:author="Pascal Heude" w:date="2026-08-03T17:42:00Z">
         <w:r>
           <w:rPr>
             <w:rStyle w:val="Lienhypertexte"/>
             <w:lang w:val="en-US"/>
           </w:rPr>
+          <w:fldChar w:fldCharType="separate"/>
         </w:r>
       </w:ins>
-      <w:ins w:id="362" w:author="Pascal Heude" w:date="2026-08-03T17:42:00Z">
+      <w:ins w:id="364" w:author="Pascal Heude" w:date="2026-08-03T17:43:00Z">
         <w:r>
           <w:rPr>
             <w:rStyle w:val="Lienhypertexte"/>
             <w:lang w:val="en-US"/>
           </w:rPr>
-          <w:fldChar w:fldCharType="separate"/>
+          <w:t>MEDIA</w:t>
         </w:r>
       </w:ins>
-      <w:ins w:id="363" w:author="Pascal Heude" w:date="2026-08-03T17:43:00Z">
-        <w:r>
-          <w:rPr>
-            <w:rStyle w:val="Lienhypertexte"/>
-            <w:lang w:val="en-US"/>
-          </w:rPr>
-          <w:t>ME</w:t>
-        </w:r>
-        <w:r>
-          <w:rPr>
-            <w:rStyle w:val="Lienhypertexte"/>
-            <w:lang w:val="en-US"/>
-          </w:rPr>
-          <w:t>D</w:t>
-        </w:r>
-        <w:r>
-          <w:rPr>
-            <w:rStyle w:val="Lienhypertexte"/>
-            <w:lang w:val="en-US"/>
-          </w:rPr>
-          <w:t>IA</w:t>
-        </w:r>
-      </w:ins>
-      <w:ins w:id="364" w:author="Pascal Heude" w:date="2026-08-03T17:42:00Z">
+      <w:ins w:id="365" w:author="Pascal Heude" w:date="2026-08-03T17:42:00Z">
         <w:r>
           <w:rPr>
             <w:rStyle w:val="Lienhypertexte"/>
@@ -17200,7 +17188,7 @@
         </w:rPr>
         <w:t>LOADS.LUM</w:t>
       </w:r>
-      <w:ins w:id="365" w:author="Pascal Heude" w:date="2026-08-03T17:44:00Z">
+      <w:ins w:id="366" w:author="Pascal Heude" w:date="2026-08-03T17:44:00Z">
         <w:r>
           <w:rPr>
             <w:lang w:val="en-US"/>
@@ -17220,12 +17208,6 @@
             <w:lang w:val="en-US"/>
           </w:rPr>
           <w:instrText>HYPERLINK  \l "_Tag_MEDIA"</w:instrText>
-        </w:r>
-        <w:r>
-          <w:rPr>
-            <w:rStyle w:val="Lienhypertexte"/>
-            <w:lang w:val="en-US"/>
-          </w:rPr>
         </w:r>
         <w:r>
           <w:rPr>
@@ -17286,7 +17268,7 @@
         </w:rPr>
         <w:fldChar w:fldCharType="begin"/>
       </w:r>
-      <w:ins w:id="366" w:author="Pascal Heude" w:date="2026-08-03T17:44:00Z">
+      <w:ins w:id="367" w:author="Pascal Heude" w:date="2026-08-03T17:44:00Z">
         <w:r>
           <w:rPr>
             <w:rStyle w:val="Lienhypertexte"/>
@@ -17295,7 +17277,7 @@
           <w:instrText>HYPERLINK  \l "_Tag_MEDIA"</w:instrText>
         </w:r>
       </w:ins>
-      <w:del w:id="367" w:author="Pascal Heude" w:date="2026-08-03T17:44:00Z">
+      <w:del w:id="368" w:author="Pascal Heude" w:date="2026-08-03T17:44:00Z">
         <w:r>
           <w:rPr>
             <w:rStyle w:val="Lienhypertexte"/>
@@ -17304,14 +17286,6 @@
           <w:delInstrText xml:space="preserve"> HYPERLINK \l "_Tag_BATCH" </w:delInstrText>
         </w:r>
       </w:del>
-      <w:ins w:id="368" w:author="Pascal Heude" w:date="2026-08-03T17:44:00Z">
-        <w:r>
-          <w:rPr>
-            <w:rStyle w:val="Lienhypertexte"/>
-            <w:lang w:val="en-US"/>
-          </w:rPr>
-        </w:r>
-      </w:ins>
       <w:r>
         <w:rPr>
           <w:rStyle w:val="Lienhypertexte"/>
@@ -17502,7 +17476,6 @@
       </w:pPr>
       <w:bookmarkStart w:id="373" w:name="_Toc456106056"/>
       <w:r>
-        <w:lastRenderedPageBreak/>
         <w:t>Header file</w:t>
       </w:r>
       <w:bookmarkEnd w:id="373"/>
@@ -17618,6 +17591,7 @@
         <w:rPr>
           <w:lang w:val="en-US"/>
         </w:rPr>
+        <w:lastRenderedPageBreak/>
         <w:t>The name of the data files is built</w:t>
       </w:r>
       <w:r>
@@ -17905,7 +17879,7 @@
       <w:rPr>
         <w:noProof/>
       </w:rPr>
-      <w:t>18</w:t>
+      <w:t>11</w:t>
     </w:r>
     <w:r>
       <w:fldChar w:fldCharType="end"/>
@@ -22324,7 +22298,7 @@
 </file>
 
 <file path=customXml/itemProps1.xml><?xml version="1.0" encoding="utf-8"?>
-<ds:datastoreItem xmlns:ds="http://schemas.openxmlformats.org/officeDocument/2006/customXml" ds:itemID="{A0E4107D-F7A3-4BD2-9CD4-3D12916E641D}">
+<ds:datastoreItem xmlns:ds="http://schemas.openxmlformats.org/officeDocument/2006/customXml" ds:itemID="{418ACE4E-FE3B-4222-954F-8B6FB3B3C39D}">
   <ds:schemaRefs>
     <ds:schemaRef ds:uri="http://schemas.openxmlformats.org/officeDocument/2006/bibliography"/>
   </ds:schemaRefs>

</xml_diff>

<commit_message>
Update of User's Manual (Word and pdf).
</commit_message>
<xml_diff>
--- a/eclipse_project/LSPB UM.docx
+++ b/eclipse_project/LSPB UM.docx
@@ -6577,7 +6577,7 @@
           <v:shape id="_x0000_i1025" type="#_x0000_t75" style="width:77pt;height:50pt" o:ole="">
             <v:imagedata r:id="rId14" o:title=""/>
           </v:shape>
-          <o:OLEObject Type="Embed" ProgID="Package" ShapeID="_x0000_i1025" DrawAspect="Icon" ObjectID="_1847377058" r:id="rId15"/>
+          <o:OLEObject Type="Embed" ProgID="Package" ShapeID="_x0000_i1025" DrawAspect="Icon" ObjectID="_1847475331" r:id="rId15"/>
         </w:object>
       </w:r>
     </w:p>
@@ -11173,8 +11173,6 @@
           <w:t xml:space="preserve">10 </w:t>
         </w:r>
       </w:ins>
-      <w:bookmarkStart w:id="131" w:name="_GoBack"/>
-      <w:bookmarkEnd w:id="131"/>
       <w:r>
         <w:rPr>
           <w:lang w:val="en-US"/>
@@ -11197,12 +11195,12 @@
     <w:p>
       <w:pPr>
         <w:rPr>
-          <w:moveFrom w:id="132" w:author="Pascal Heude" w:date="2026-08-01T19:36:00Z"/>
-          <w:lang w:val="en-US"/>
-        </w:rPr>
-      </w:pPr>
-      <w:moveFromRangeStart w:id="133" w:author="Pascal Heude" w:date="2026-08-01T19:36:00Z" w:name="move236505418"/>
-      <w:moveFrom w:id="134" w:author="Pascal Heude" w:date="2026-08-01T19:36:00Z">
+          <w:moveFrom w:id="131" w:author="Pascal Heude" w:date="2026-08-01T19:36:00Z"/>
+          <w:lang w:val="en-US"/>
+        </w:rPr>
+      </w:pPr>
+      <w:moveFromRangeStart w:id="132" w:author="Pascal Heude" w:date="2026-08-01T19:36:00Z" w:name="move236505418"/>
+      <w:moveFrom w:id="133" w:author="Pascal Heude" w:date="2026-08-01T19:36:00Z">
         <w:r>
           <w:rPr>
             <w:lang w:val="en-US"/>
@@ -11211,7 +11209,7 @@
         </w:r>
       </w:moveFrom>
     </w:p>
-    <w:moveFromRangeEnd w:id="133"/>
+    <w:moveFromRangeEnd w:id="132"/>
     <w:p>
       <w:pPr>
         <w:rPr>
@@ -11278,16 +11276,16 @@
           <w:lang w:val="en-US"/>
         </w:rPr>
       </w:pPr>
-      <w:bookmarkStart w:id="135" w:name="_Tag_TYPE_DESCRIPTION"/>
-      <w:bookmarkStart w:id="136" w:name="_Toc456106024"/>
+      <w:bookmarkStart w:id="134" w:name="_Tag_TYPE_DESCRIPTION"/>
+      <w:bookmarkStart w:id="135" w:name="_Toc456106024"/>
+      <w:bookmarkEnd w:id="134"/>
+      <w:r>
+        <w:rPr>
+          <w:lang w:val="en-US"/>
+        </w:rPr>
+        <w:t>Tag TYPE_DESCRIPTION</w:t>
+      </w:r>
       <w:bookmarkEnd w:id="135"/>
-      <w:r>
-        <w:rPr>
-          <w:lang w:val="en-US"/>
-        </w:rPr>
-        <w:t>Tag TYPE_DESCRIPTION</w:t>
-      </w:r>
-      <w:bookmarkEnd w:id="136"/>
     </w:p>
     <w:p>
       <w:pPr>
@@ -11346,13 +11344,13 @@
           <w:lang w:val="en-US"/>
         </w:rPr>
       </w:pPr>
-      <w:ins w:id="137" w:author="Pascal Heude" w:date="2026-08-01T19:37:00Z">
+      <w:ins w:id="136" w:author="Pascal Heude" w:date="2026-08-01T19:37:00Z">
         <w:r>
           <w:rPr>
             <w:b/>
             <w:color w:val="0070C0"/>
             <w:lang w:val="en-US"/>
-            <w:rPrChange w:id="138" w:author="Pascal Heude" w:date="2026-08-01T19:37:00Z">
+            <w:rPrChange w:id="137" w:author="Pascal Heude" w:date="2026-08-01T19:37:00Z">
               <w:rPr>
                 <w:lang w:val="en-US"/>
               </w:rPr>
@@ -11367,7 +11365,7 @@
           <w:t xml:space="preserve">: </w:t>
         </w:r>
       </w:ins>
-      <w:del w:id="139" w:author="Pascal Heude" w:date="2026-08-03T17:56:00Z">
+      <w:del w:id="138" w:author="Pascal Heude" w:date="2026-08-03T17:56:00Z">
         <w:r>
           <w:rPr>
             <w:lang w:val="en-US"/>
@@ -11375,7 +11373,7 @@
           <w:delText>T</w:delText>
         </w:r>
       </w:del>
-      <w:ins w:id="140" w:author="Pascal Heude" w:date="2026-08-03T17:56:00Z">
+      <w:ins w:id="139" w:author="Pascal Heude" w:date="2026-08-03T17:56:00Z">
         <w:r>
           <w:rPr>
             <w:lang w:val="en-US"/>
@@ -11395,7 +11393,7 @@
         </w:rPr>
         <w:t>letters</w:t>
       </w:r>
-      <w:ins w:id="141" w:author="Pascal Heude" w:date="2026-08-01T21:03:00Z">
+      <w:ins w:id="140" w:author="Pascal Heude" w:date="2026-08-01T21:03:00Z">
         <w:r>
           <w:rPr>
             <w:lang w:val="en-US"/>
@@ -11474,13 +11472,13 @@
           <w:lang w:val="en-US"/>
         </w:rPr>
       </w:pPr>
-      <w:ins w:id="142" w:author="Pascal Heude" w:date="2026-08-01T19:39:00Z">
+      <w:ins w:id="141" w:author="Pascal Heude" w:date="2026-08-01T19:39:00Z">
         <w:r>
           <w:rPr>
             <w:b/>
             <w:color w:val="0070C0"/>
             <w:lang w:val="en-US"/>
-            <w:rPrChange w:id="143" w:author="Pascal Heude" w:date="2026-08-01T19:39:00Z">
+            <w:rPrChange w:id="142" w:author="Pascal Heude" w:date="2026-08-01T19:39:00Z">
               <w:rPr>
                 <w:lang w:val="en-US"/>
               </w:rPr>
@@ -11495,7 +11493,7 @@
           <w:t xml:space="preserve">: </w:t>
         </w:r>
       </w:ins>
-      <w:ins w:id="144" w:author="Pascal Heude" w:date="2026-08-03T17:56:00Z">
+      <w:ins w:id="143" w:author="Pascal Heude" w:date="2026-08-03T17:56:00Z">
         <w:r>
           <w:rPr>
             <w:lang w:val="en-US"/>
@@ -11503,7 +11501,7 @@
           <w:t>i</w:t>
         </w:r>
       </w:ins>
-      <w:ins w:id="145" w:author="Pascal Heude" w:date="2026-08-01T19:39:00Z">
+      <w:ins w:id="144" w:author="Pascal Heude" w:date="2026-08-01T19:39:00Z">
         <w:r>
           <w:rPr>
             <w:lang w:val="en-US"/>
@@ -11511,7 +11509,7 @@
           <w:t xml:space="preserve">f used, </w:t>
         </w:r>
       </w:ins>
-      <w:del w:id="146" w:author="Pascal Heude" w:date="2026-08-01T19:39:00Z">
+      <w:del w:id="145" w:author="Pascal Heude" w:date="2026-08-01T19:39:00Z">
         <w:r>
           <w:rPr>
             <w:lang w:val="en-US"/>
@@ -11519,7 +11517,7 @@
           <w:delText>T</w:delText>
         </w:r>
       </w:del>
-      <w:ins w:id="147" w:author="Pascal Heude" w:date="2026-08-01T19:39:00Z">
+      <w:ins w:id="146" w:author="Pascal Heude" w:date="2026-08-01T19:39:00Z">
         <w:r>
           <w:rPr>
             <w:lang w:val="en-US"/>
@@ -11627,16 +11625,16 @@
           <w:lang w:val="en-US"/>
         </w:rPr>
       </w:pPr>
-      <w:bookmarkStart w:id="148" w:name="_Tag_INPUT_FILE"/>
-      <w:bookmarkStart w:id="149" w:name="_Toc456106025"/>
+      <w:bookmarkStart w:id="147" w:name="_Tag_INPUT_FILE"/>
+      <w:bookmarkStart w:id="148" w:name="_Toc456106025"/>
+      <w:bookmarkEnd w:id="147"/>
+      <w:r>
+        <w:rPr>
+          <w:lang w:val="en-US"/>
+        </w:rPr>
+        <w:t>Tag INPUT_FILE</w:t>
+      </w:r>
       <w:bookmarkEnd w:id="148"/>
-      <w:r>
-        <w:rPr>
-          <w:lang w:val="en-US"/>
-        </w:rPr>
-        <w:t>Tag INPUT_FILE</w:t>
-      </w:r>
-      <w:bookmarkEnd w:id="149"/>
     </w:p>
     <w:p>
       <w:pPr>
@@ -11654,17 +11652,17 @@
     <w:p>
       <w:pPr>
         <w:rPr>
-          <w:moveTo w:id="150" w:author="Pascal Heude" w:date="2026-08-01T19:43:00Z"/>
-          <w:lang w:val="en-US"/>
-        </w:rPr>
-      </w:pPr>
-      <w:ins w:id="151" w:author="Pascal Heude" w:date="2026-08-01T19:43:00Z">
+          <w:moveTo w:id="149" w:author="Pascal Heude" w:date="2026-08-01T19:43:00Z"/>
+          <w:lang w:val="en-US"/>
+        </w:rPr>
+      </w:pPr>
+      <w:ins w:id="150" w:author="Pascal Heude" w:date="2026-08-01T19:43:00Z">
         <w:r>
           <w:rPr>
             <w:b/>
             <w:color w:val="0070C0"/>
             <w:lang w:val="en-US"/>
-            <w:rPrChange w:id="152" w:author="Pascal Heude" w:date="2026-08-01T19:43:00Z">
+            <w:rPrChange w:id="151" w:author="Pascal Heude" w:date="2026-08-01T19:43:00Z">
               <w:rPr>
                 <w:lang w:val="en-US"/>
               </w:rPr>
@@ -11679,9 +11677,9 @@
           <w:t xml:space="preserve">: </w:t>
         </w:r>
       </w:ins>
-      <w:moveToRangeStart w:id="153" w:author="Pascal Heude" w:date="2026-08-01T19:43:00Z" w:name="move236505798"/>
-      <w:moveTo w:id="154" w:author="Pascal Heude" w:date="2026-08-01T19:43:00Z">
-        <w:del w:id="155" w:author="Pascal Heude" w:date="2026-08-03T17:55:00Z">
+      <w:moveToRangeStart w:id="152" w:author="Pascal Heude" w:date="2026-08-01T19:43:00Z" w:name="move236505798"/>
+      <w:moveTo w:id="153" w:author="Pascal Heude" w:date="2026-08-01T19:43:00Z">
+        <w:del w:id="154" w:author="Pascal Heude" w:date="2026-08-03T17:55:00Z">
           <w:r>
             <w:rPr>
               <w:lang w:val="en-US"/>
@@ -11690,7 +11688,7 @@
           </w:r>
         </w:del>
       </w:moveTo>
-      <w:ins w:id="156" w:author="Pascal Heude" w:date="2026-08-03T17:55:00Z">
+      <w:ins w:id="155" w:author="Pascal Heude" w:date="2026-08-03T17:55:00Z">
         <w:r>
           <w:rPr>
             <w:lang w:val="en-US"/>
@@ -11698,14 +11696,14 @@
           <w:t>t</w:t>
         </w:r>
       </w:ins>
-      <w:moveTo w:id="157" w:author="Pascal Heude" w:date="2026-08-01T19:43:00Z">
+      <w:moveTo w:id="156" w:author="Pascal Heude" w:date="2026-08-01T19:43:00Z">
         <w:r>
           <w:rPr>
             <w:lang w:val="en-US"/>
           </w:rPr>
           <w:t xml:space="preserve">his tag </w:t>
         </w:r>
-        <w:del w:id="158" w:author="Pascal Heude" w:date="2026-08-01T19:43:00Z">
+        <w:del w:id="157" w:author="Pascal Heude" w:date="2026-08-01T19:43:00Z">
           <w:r>
             <w:rPr>
               <w:lang w:val="en-US"/>
@@ -11714,7 +11712,7 @@
           </w:r>
         </w:del>
       </w:moveTo>
-      <w:ins w:id="159" w:author="Pascal Heude" w:date="2026-08-01T19:43:00Z">
+      <w:ins w:id="158" w:author="Pascal Heude" w:date="2026-08-01T19:43:00Z">
         <w:r>
           <w:rPr>
             <w:lang w:val="en-US"/>
@@ -11722,7 +11720,7 @@
           <w:t>shall be</w:t>
         </w:r>
       </w:ins>
-      <w:moveTo w:id="160" w:author="Pascal Heude" w:date="2026-08-01T19:43:00Z">
+      <w:moveTo w:id="159" w:author="Pascal Heude" w:date="2026-08-01T19:43:00Z">
         <w:r>
           <w:rPr>
             <w:lang w:val="en-US"/>
@@ -11731,20 +11729,20 @@
         </w:r>
       </w:moveTo>
     </w:p>
-    <w:moveToRangeEnd w:id="153"/>
-    <w:p>
-      <w:pPr>
-        <w:rPr>
-          <w:lang w:val="en-US"/>
-        </w:rPr>
-      </w:pPr>
-      <w:ins w:id="161" w:author="Pascal Heude" w:date="2026-08-01T19:43:00Z">
+    <w:moveToRangeEnd w:id="152"/>
+    <w:p>
+      <w:pPr>
+        <w:rPr>
+          <w:lang w:val="en-US"/>
+        </w:rPr>
+      </w:pPr>
+      <w:ins w:id="160" w:author="Pascal Heude" w:date="2026-08-01T19:43:00Z">
         <w:r>
           <w:rPr>
             <w:b/>
             <w:color w:val="0070C0"/>
             <w:lang w:val="en-US"/>
-            <w:rPrChange w:id="162" w:author="Pascal Heude" w:date="2026-08-01T19:43:00Z">
+            <w:rPrChange w:id="161" w:author="Pascal Heude" w:date="2026-08-01T19:43:00Z">
               <w:rPr>
                 <w:lang w:val="en-US"/>
               </w:rPr>
@@ -11759,7 +11757,7 @@
           <w:t xml:space="preserve">: </w:t>
         </w:r>
       </w:ins>
-      <w:del w:id="163" w:author="Pascal Heude" w:date="2026-08-03T17:55:00Z">
+      <w:del w:id="162" w:author="Pascal Heude" w:date="2026-08-03T17:55:00Z">
         <w:r>
           <w:rPr>
             <w:lang w:val="en-US"/>
@@ -11767,7 +11765,7 @@
           <w:delText>T</w:delText>
         </w:r>
       </w:del>
-      <w:ins w:id="164" w:author="Pascal Heude" w:date="2026-08-03T17:55:00Z">
+      <w:ins w:id="163" w:author="Pascal Heude" w:date="2026-08-03T17:55:00Z">
         <w:r>
           <w:rPr>
             <w:lang w:val="en-US"/>
@@ -11791,12 +11789,12 @@
     <w:p>
       <w:pPr>
         <w:rPr>
-          <w:moveFrom w:id="165" w:author="Pascal Heude" w:date="2026-08-01T19:43:00Z"/>
-          <w:lang w:val="en-US"/>
-        </w:rPr>
-      </w:pPr>
-      <w:moveFromRangeStart w:id="166" w:author="Pascal Heude" w:date="2026-08-01T19:43:00Z" w:name="move236505798"/>
-      <w:moveFrom w:id="167" w:author="Pascal Heude" w:date="2026-08-01T19:43:00Z">
+          <w:moveFrom w:id="164" w:author="Pascal Heude" w:date="2026-08-01T19:43:00Z"/>
+          <w:lang w:val="en-US"/>
+        </w:rPr>
+      </w:pPr>
+      <w:moveFromRangeStart w:id="165" w:author="Pascal Heude" w:date="2026-08-01T19:43:00Z" w:name="move236505798"/>
+      <w:moveFrom w:id="166" w:author="Pascal Heude" w:date="2026-08-01T19:43:00Z">
         <w:r>
           <w:rPr>
             <w:lang w:val="en-US"/>
@@ -11805,7 +11803,7 @@
         </w:r>
       </w:moveFrom>
     </w:p>
-    <w:moveFromRangeEnd w:id="166"/>
+    <w:moveFromRangeEnd w:id="165"/>
     <w:p>
       <w:pPr>
         <w:rPr>
@@ -11969,13 +11967,13 @@
           <w:lang w:val="en-US"/>
         </w:rPr>
       </w:pPr>
-      <w:ins w:id="168" w:author="Pascal Heude" w:date="2026-08-01T19:44:00Z">
+      <w:ins w:id="167" w:author="Pascal Heude" w:date="2026-08-01T19:44:00Z">
         <w:r>
           <w:rPr>
             <w:b/>
             <w:color w:val="0070C0"/>
             <w:lang w:val="en-US"/>
-            <w:rPrChange w:id="169" w:author="Pascal Heude" w:date="2026-08-01T19:45:00Z">
+            <w:rPrChange w:id="168" w:author="Pascal Heude" w:date="2026-08-01T19:45:00Z">
               <w:rPr>
                 <w:lang w:val="en-US"/>
               </w:rPr>
@@ -11990,7 +11988,7 @@
           <w:t xml:space="preserve">: </w:t>
         </w:r>
       </w:ins>
-      <w:ins w:id="170" w:author="Pascal Heude" w:date="2026-08-03T17:55:00Z">
+      <w:ins w:id="169" w:author="Pascal Heude" w:date="2026-08-03T17:55:00Z">
         <w:r>
           <w:rPr>
             <w:lang w:val="en-US"/>
@@ -11998,7 +11996,7 @@
           <w:t>i</w:t>
         </w:r>
       </w:ins>
-      <w:ins w:id="171" w:author="Pascal Heude" w:date="2026-08-01T19:44:00Z">
+      <w:ins w:id="170" w:author="Pascal Heude" w:date="2026-08-01T19:44:00Z">
         <w:r>
           <w:rPr>
             <w:lang w:val="en-US"/>
@@ -12006,7 +12004,7 @@
           <w:t>f used, t</w:t>
         </w:r>
       </w:ins>
-      <w:del w:id="172" w:author="Pascal Heude" w:date="2026-08-01T19:44:00Z">
+      <w:del w:id="171" w:author="Pascal Heude" w:date="2026-08-01T19:44:00Z">
         <w:r>
           <w:rPr>
             <w:lang w:val="en-US"/>
@@ -12020,7 +12018,7 @@
         </w:rPr>
         <w:t xml:space="preserve">he content </w:t>
       </w:r>
-      <w:ins w:id="173" w:author="Pascal Heude" w:date="2026-08-02T11:01:00Z">
+      <w:ins w:id="172" w:author="Pascal Heude" w:date="2026-08-02T11:01:00Z">
         <w:r>
           <w:rPr>
             <w:lang w:val="en-US"/>
@@ -12028,7 +12026,7 @@
           <w:t>shall be</w:t>
         </w:r>
       </w:ins>
-      <w:del w:id="174" w:author="Pascal Heude" w:date="2026-08-02T11:01:00Z">
+      <w:del w:id="173" w:author="Pascal Heude" w:date="2026-08-02T11:01:00Z">
         <w:r>
           <w:rPr>
             <w:lang w:val="en-US"/>
@@ -12154,19 +12152,19 @@
       <w:pPr>
         <w:pStyle w:val="Titre3"/>
       </w:pPr>
-      <w:bookmarkStart w:id="175" w:name="_Tag_SPLIT_SIZE"/>
-      <w:bookmarkStart w:id="176" w:name="_Toc456106026"/>
+      <w:bookmarkStart w:id="174" w:name="_Tag_SPLIT_SIZE"/>
+      <w:bookmarkStart w:id="175" w:name="_Toc456106026"/>
+      <w:bookmarkEnd w:id="174"/>
+      <w:r>
+        <w:rPr>
+          <w:lang w:val="en-US"/>
+        </w:rPr>
+        <w:t>Tag SPLIT_</w:t>
+      </w:r>
+      <w:r>
+        <w:t>SIZE</w:t>
+      </w:r>
       <w:bookmarkEnd w:id="175"/>
-      <w:r>
-        <w:rPr>
-          <w:lang w:val="en-US"/>
-        </w:rPr>
-        <w:t>Tag SPLIT_</w:t>
-      </w:r>
-      <w:r>
-        <w:t>SIZE</w:t>
-      </w:r>
-      <w:bookmarkEnd w:id="176"/>
     </w:p>
     <w:p>
       <w:pPr>
@@ -12231,13 +12229,13 @@
           <w:lang w:val="en-US"/>
         </w:rPr>
       </w:pPr>
-      <w:ins w:id="177" w:author="Pascal Heude" w:date="2026-08-01T19:45:00Z">
+      <w:ins w:id="176" w:author="Pascal Heude" w:date="2026-08-01T19:45:00Z">
         <w:r>
           <w:rPr>
             <w:b/>
             <w:color w:val="0070C0"/>
             <w:lang w:val="en-US"/>
-            <w:rPrChange w:id="178" w:author="Pascal Heude" w:date="2026-08-01T19:46:00Z">
+            <w:rPrChange w:id="177" w:author="Pascal Heude" w:date="2026-08-01T19:46:00Z">
               <w:rPr>
                 <w:lang w:val="en-US"/>
               </w:rPr>
@@ -12246,13 +12244,13 @@
           <w:t>U</w:t>
         </w:r>
       </w:ins>
-      <w:ins w:id="179" w:author="Pascal Heude" w:date="2026-08-01T19:46:00Z">
+      <w:ins w:id="178" w:author="Pascal Heude" w:date="2026-08-01T19:46:00Z">
         <w:r>
           <w:rPr>
             <w:b/>
             <w:color w:val="0070C0"/>
             <w:lang w:val="en-US"/>
-            <w:rPrChange w:id="180" w:author="Pascal Heude" w:date="2026-08-01T19:46:00Z">
+            <w:rPrChange w:id="179" w:author="Pascal Heude" w:date="2026-08-01T19:46:00Z">
               <w:rPr>
                 <w:lang w:val="en-US"/>
               </w:rPr>
@@ -12267,7 +12265,7 @@
           <w:t xml:space="preserve">: </w:t>
         </w:r>
       </w:ins>
-      <w:ins w:id="181" w:author="Pascal Heude" w:date="2026-08-03T17:55:00Z">
+      <w:ins w:id="180" w:author="Pascal Heude" w:date="2026-08-03T17:55:00Z">
         <w:r>
           <w:rPr>
             <w:lang w:val="en-US"/>
@@ -12275,7 +12273,7 @@
           <w:t>i</w:t>
         </w:r>
       </w:ins>
-      <w:ins w:id="182" w:author="Pascal Heude" w:date="2026-08-01T19:46:00Z">
+      <w:ins w:id="181" w:author="Pascal Heude" w:date="2026-08-01T19:46:00Z">
         <w:r>
           <w:rPr>
             <w:lang w:val="en-US"/>
@@ -12283,7 +12281,7 @@
           <w:t>f used, t</w:t>
         </w:r>
       </w:ins>
-      <w:del w:id="183" w:author="Pascal Heude" w:date="2026-08-01T19:46:00Z">
+      <w:del w:id="182" w:author="Pascal Heude" w:date="2026-08-01T19:46:00Z">
         <w:r>
           <w:rPr>
             <w:lang w:val="en-US"/>
@@ -12413,13 +12411,13 @@
       <w:pPr>
         <w:pStyle w:val="Titre3"/>
       </w:pPr>
-      <w:bookmarkStart w:id="184" w:name="_Tag_DIRECTORY"/>
-      <w:bookmarkStart w:id="185" w:name="_Toc456106027"/>
+      <w:bookmarkStart w:id="183" w:name="_Tag_DIRECTORY"/>
+      <w:bookmarkStart w:id="184" w:name="_Toc456106027"/>
+      <w:bookmarkEnd w:id="183"/>
+      <w:r>
+        <w:t>Tag DIRECTORY</w:t>
+      </w:r>
       <w:bookmarkEnd w:id="184"/>
-      <w:r>
-        <w:t>Tag DIRECTORY</w:t>
-      </w:r>
-      <w:bookmarkEnd w:id="185"/>
     </w:p>
     <w:p>
       <w:pPr>
@@ -12437,17 +12435,17 @@
     <w:p>
       <w:pPr>
         <w:rPr>
-          <w:moveTo w:id="186" w:author="Pascal Heude" w:date="2026-08-01T19:46:00Z"/>
-          <w:lang w:val="en-US"/>
-        </w:rPr>
-      </w:pPr>
-      <w:ins w:id="187" w:author="Pascal Heude" w:date="2026-08-01T19:46:00Z">
+          <w:moveTo w:id="185" w:author="Pascal Heude" w:date="2026-08-01T19:46:00Z"/>
+          <w:lang w:val="en-US"/>
+        </w:rPr>
+      </w:pPr>
+      <w:ins w:id="186" w:author="Pascal Heude" w:date="2026-08-01T19:46:00Z">
         <w:r>
           <w:rPr>
             <w:b/>
             <w:color w:val="0070C0"/>
             <w:lang w:val="en-US"/>
-            <w:rPrChange w:id="188" w:author="Pascal Heude" w:date="2026-08-01T19:46:00Z">
+            <w:rPrChange w:id="187" w:author="Pascal Heude" w:date="2026-08-01T19:46:00Z">
               <w:rPr>
                 <w:lang w:val="en-US"/>
               </w:rPr>
@@ -12462,7 +12460,7 @@
           <w:t xml:space="preserve">: </w:t>
         </w:r>
       </w:ins>
-      <w:ins w:id="189" w:author="Pascal Heude" w:date="2026-08-03T17:54:00Z">
+      <w:ins w:id="188" w:author="Pascal Heude" w:date="2026-08-03T17:54:00Z">
         <w:r>
           <w:rPr>
             <w:lang w:val="en-US"/>
@@ -12470,9 +12468,9 @@
           <w:t>t</w:t>
         </w:r>
       </w:ins>
-      <w:moveToRangeStart w:id="190" w:author="Pascal Heude" w:date="2026-08-01T19:46:00Z" w:name="move236506022"/>
-      <w:moveTo w:id="191" w:author="Pascal Heude" w:date="2026-08-01T19:46:00Z">
-        <w:del w:id="192" w:author="Pascal Heude" w:date="2026-08-03T17:54:00Z">
+      <w:moveToRangeStart w:id="189" w:author="Pascal Heude" w:date="2026-08-01T19:46:00Z" w:name="move236506022"/>
+      <w:moveTo w:id="190" w:author="Pascal Heude" w:date="2026-08-01T19:46:00Z">
+        <w:del w:id="191" w:author="Pascal Heude" w:date="2026-08-03T17:54:00Z">
           <w:r>
             <w:rPr>
               <w:lang w:val="en-US"/>
@@ -12486,7 +12484,7 @@
           </w:rPr>
           <w:t xml:space="preserve">his tag </w:t>
         </w:r>
-        <w:del w:id="193" w:author="Pascal Heude" w:date="2026-08-01T19:47:00Z">
+        <w:del w:id="192" w:author="Pascal Heude" w:date="2026-08-01T19:47:00Z">
           <w:r>
             <w:rPr>
               <w:lang w:val="en-US"/>
@@ -12495,7 +12493,7 @@
           </w:r>
         </w:del>
       </w:moveTo>
-      <w:ins w:id="194" w:author="Pascal Heude" w:date="2026-08-01T19:47:00Z">
+      <w:ins w:id="193" w:author="Pascal Heude" w:date="2026-08-01T19:47:00Z">
         <w:r>
           <w:rPr>
             <w:lang w:val="en-US"/>
@@ -12503,7 +12501,7 @@
           <w:t>shall be</w:t>
         </w:r>
       </w:ins>
-      <w:moveTo w:id="195" w:author="Pascal Heude" w:date="2026-08-01T19:46:00Z">
+      <w:moveTo w:id="194" w:author="Pascal Heude" w:date="2026-08-01T19:46:00Z">
         <w:r>
           <w:rPr>
             <w:lang w:val="en-US"/>
@@ -12512,14 +12510,14 @@
         </w:r>
       </w:moveTo>
     </w:p>
-    <w:moveToRangeEnd w:id="190"/>
-    <w:p>
-      <w:pPr>
-        <w:rPr>
-          <w:lang w:val="en-US"/>
-        </w:rPr>
-      </w:pPr>
-      <w:ins w:id="196" w:author="Pascal Heude" w:date="2026-08-01T19:47:00Z">
+    <w:moveToRangeEnd w:id="189"/>
+    <w:p>
+      <w:pPr>
+        <w:rPr>
+          <w:lang w:val="en-US"/>
+        </w:rPr>
+      </w:pPr>
+      <w:ins w:id="195" w:author="Pascal Heude" w:date="2026-08-01T19:47:00Z">
         <w:r>
           <w:rPr>
             <w:b/>
@@ -12543,7 +12541,7 @@
           <w:t>: t</w:t>
         </w:r>
       </w:ins>
-      <w:del w:id="197" w:author="Pascal Heude" w:date="2026-08-01T19:47:00Z">
+      <w:del w:id="196" w:author="Pascal Heude" w:date="2026-08-01T19:47:00Z">
         <w:r>
           <w:rPr>
             <w:lang w:val="en-US"/>
@@ -12581,7 +12579,7 @@
         </w:rPr>
         <w:t xml:space="preserve"> relative </w:t>
       </w:r>
-      <w:del w:id="198" w:author="Pascal Heude" w:date="2026-07-29T22:51:00Z">
+      <w:del w:id="197" w:author="Pascal Heude" w:date="2026-07-29T22:51:00Z">
         <w:r>
           <w:rPr>
             <w:lang w:val="en-US"/>
@@ -12599,12 +12597,12 @@
     <w:p>
       <w:pPr>
         <w:rPr>
-          <w:moveFrom w:id="199" w:author="Pascal Heude" w:date="2026-08-01T19:46:00Z"/>
-          <w:lang w:val="en-US"/>
-        </w:rPr>
-      </w:pPr>
-      <w:moveFromRangeStart w:id="200" w:author="Pascal Heude" w:date="2026-08-01T19:46:00Z" w:name="move236506022"/>
-      <w:moveFrom w:id="201" w:author="Pascal Heude" w:date="2026-08-01T19:46:00Z">
+          <w:moveFrom w:id="198" w:author="Pascal Heude" w:date="2026-08-01T19:46:00Z"/>
+          <w:lang w:val="en-US"/>
+        </w:rPr>
+      </w:pPr>
+      <w:moveFromRangeStart w:id="199" w:author="Pascal Heude" w:date="2026-08-01T19:46:00Z" w:name="move236506022"/>
+      <w:moveFrom w:id="200" w:author="Pascal Heude" w:date="2026-08-01T19:46:00Z">
         <w:r>
           <w:rPr>
             <w:lang w:val="en-US"/>
@@ -12613,7 +12611,7 @@
         </w:r>
       </w:moveFrom>
     </w:p>
-    <w:moveFromRangeEnd w:id="200"/>
+    <w:moveFromRangeEnd w:id="199"/>
     <w:p>
       <w:pPr>
         <w:rPr>
@@ -12626,7 +12624,7 @@
         </w:rPr>
         <w:t xml:space="preserve">If the directory does not exist, it </w:t>
       </w:r>
-      <w:del w:id="202" w:author="Pascal Heude" w:date="2026-07-29T22:52:00Z">
+      <w:del w:id="201" w:author="Pascal Heude" w:date="2026-07-29T22:52:00Z">
         <w:r>
           <w:rPr>
             <w:lang w:val="en-US"/>
@@ -12634,7 +12632,7 @@
           <w:delText xml:space="preserve">shall </w:delText>
         </w:r>
       </w:del>
-      <w:ins w:id="203" w:author="Pascal Heude" w:date="2026-07-29T22:52:00Z">
+      <w:ins w:id="202" w:author="Pascal Heude" w:date="2026-07-29T22:52:00Z">
         <w:r>
           <w:rPr>
             <w:lang w:val="en-US"/>
@@ -12654,7 +12652,7 @@
         </w:rPr>
         <w:t xml:space="preserve">already </w:t>
       </w:r>
-      <w:del w:id="204" w:author="Pascal Heude" w:date="2026-07-29T22:52:00Z">
+      <w:del w:id="203" w:author="Pascal Heude" w:date="2026-07-29T22:52:00Z">
         <w:r>
           <w:rPr>
             <w:lang w:val="en-US"/>
@@ -12668,7 +12666,7 @@
         </w:rPr>
         <w:t>files</w:t>
       </w:r>
-      <w:ins w:id="205" w:author="Pascal Heude" w:date="2026-07-29T22:52:00Z">
+      <w:ins w:id="204" w:author="Pascal Heude" w:date="2026-07-29T22:52:00Z">
         <w:r>
           <w:rPr>
             <w:lang w:val="en-US"/>
@@ -12682,7 +12680,7 @@
         </w:rPr>
         <w:t xml:space="preserve">, </w:t>
       </w:r>
-      <w:del w:id="206" w:author="Pascal Heude" w:date="2026-07-29T22:52:00Z">
+      <w:del w:id="205" w:author="Pascal Heude" w:date="2026-07-29T22:52:00Z">
         <w:r>
           <w:rPr>
             <w:lang w:val="en-US"/>
@@ -12708,7 +12706,7 @@
           <w:delText>Generate</w:delText>
         </w:r>
       </w:del>
-      <w:ins w:id="207" w:author="Pascal Heude" w:date="2026-07-29T22:52:00Z">
+      <w:ins w:id="206" w:author="Pascal Heude" w:date="2026-07-29T22:52:00Z">
         <w:r>
           <w:rPr>
             <w:lang w:val="en-US"/>
@@ -12774,31 +12772,130 @@
       <w:pPr>
         <w:pStyle w:val="Titre3"/>
       </w:pPr>
-      <w:bookmarkStart w:id="208" w:name="_Tag_THW_ID_LIST"/>
-      <w:bookmarkStart w:id="209" w:name="_Toc456106028"/>
+      <w:bookmarkStart w:id="207" w:name="_Tag_THW_ID_LIST"/>
+      <w:bookmarkStart w:id="208" w:name="_Toc456106028"/>
+      <w:bookmarkEnd w:id="207"/>
+      <w:r>
+        <w:t>Tag THW_ID_LIST</w:t>
+      </w:r>
       <w:bookmarkEnd w:id="208"/>
-      <w:r>
-        <w:t>Tag THW_ID_LIST</w:t>
-      </w:r>
+    </w:p>
+    <w:p>
+      <w:pPr>
+        <w:rPr>
+          <w:lang w:val="en-US"/>
+        </w:rPr>
+      </w:pPr>
+      <w:r>
+        <w:rPr>
+          <w:lang w:val="en-US"/>
+        </w:rPr>
+        <w:t xml:space="preserve">This tag is used to include the </w:t>
+      </w:r>
+      <w:r>
+        <w:rPr>
+          <w:lang w:val="en-US"/>
+        </w:rPr>
+        <w:t>target hardware identifiers</w:t>
+      </w:r>
+      <w:r>
+        <w:rPr>
+          <w:lang w:val="en-US"/>
+        </w:rPr>
+        <w:t>.</w:t>
+      </w:r>
+    </w:p>
+    <w:p>
+      <w:pPr>
+        <w:rPr>
+          <w:lang w:val="en-US"/>
+        </w:rPr>
+      </w:pPr>
+      <w:r>
+        <w:rPr>
+          <w:lang w:val="en-US"/>
+        </w:rPr>
+        <w:t xml:space="preserve">The content shall be the </w:t>
+      </w:r>
+      <w:r>
+        <w:rPr>
+          <w:lang w:val="en-US"/>
+        </w:rPr>
+        <w:t xml:space="preserve">at least one </w:t>
+      </w:r>
+      <w:r>
+        <w:rPr>
+          <w:lang w:val="en-US"/>
+        </w:rPr>
+        <w:t xml:space="preserve">tag </w:t>
+      </w:r>
+      <w:hyperlink w:anchor="_Tag_THW_ID" w:history="1">
+        <w:r>
+          <w:rPr>
+            <w:rStyle w:val="Lienhypertexte"/>
+            <w:lang w:val="en-US"/>
+          </w:rPr>
+          <w:t>THW_ID</w:t>
+        </w:r>
+      </w:hyperlink>
+      <w:r>
+        <w:rPr>
+          <w:lang w:val="en-US"/>
+        </w:rPr>
+        <w:t>.</w:t>
+      </w:r>
+    </w:p>
+    <w:p>
+      <w:pPr>
+        <w:rPr>
+          <w:lang w:val="en-US"/>
+        </w:rPr>
+      </w:pPr>
+      <w:r>
+        <w:rPr>
+          <w:lang w:val="en-US"/>
+        </w:rPr>
+        <w:t>This tag is mandatory.</w:t>
+      </w:r>
+    </w:p>
+    <w:p>
+      <w:pPr>
+        <w:rPr>
+          <w:lang w:val="en-US"/>
+        </w:rPr>
+      </w:pPr>
+    </w:p>
+    <w:p>
+      <w:pPr>
+        <w:rPr>
+          <w:lang w:val="en-US"/>
+        </w:rPr>
+      </w:pPr>
+      <w:bookmarkStart w:id="209" w:name="_Tag_THW_ID"/>
       <w:bookmarkEnd w:id="209"/>
-    </w:p>
-    <w:p>
-      <w:pPr>
-        <w:rPr>
-          <w:lang w:val="en-US"/>
-        </w:rPr>
-      </w:pPr>
-      <w:r>
-        <w:rPr>
-          <w:lang w:val="en-US"/>
-        </w:rPr>
-        <w:t xml:space="preserve">This tag is used to include the </w:t>
-      </w:r>
-      <w:r>
-        <w:rPr>
-          <w:lang w:val="en-US"/>
-        </w:rPr>
-        <w:t>target hardware identifiers</w:t>
+      <w:r>
+        <w:rPr>
+          <w:lang w:val="en-US"/>
+        </w:rPr>
+        <w:t xml:space="preserve">The attribute </w:t>
+      </w:r>
+      <w:r>
+        <w:rPr>
+          <w:lang w:val="en-US"/>
+        </w:rPr>
+        <w:t>number</w:t>
+      </w:r>
+      <w:r>
+        <w:rPr>
+          <w:lang w:val="en-US"/>
+        </w:rPr>
+        <w:t xml:space="preserve"> is used to indicate the </w:t>
+      </w:r>
+      <w:r>
+        <w:rPr>
+          <w:lang w:val="en-US"/>
+        </w:rPr>
+        <w:t>amount of target hardware identifiers</w:t>
       </w:r>
       <w:r>
         <w:rPr>
@@ -12810,110 +12907,11 @@
     <w:p>
       <w:pPr>
         <w:rPr>
-          <w:lang w:val="en-US"/>
-        </w:rPr>
-      </w:pPr>
-      <w:r>
-        <w:rPr>
-          <w:lang w:val="en-US"/>
-        </w:rPr>
-        <w:t xml:space="preserve">The content shall be the </w:t>
-      </w:r>
-      <w:r>
-        <w:rPr>
-          <w:lang w:val="en-US"/>
-        </w:rPr>
-        <w:t xml:space="preserve">at least one </w:t>
-      </w:r>
-      <w:r>
-        <w:rPr>
-          <w:lang w:val="en-US"/>
-        </w:rPr>
-        <w:t xml:space="preserve">tag </w:t>
-      </w:r>
-      <w:hyperlink w:anchor="_Tag_THW_ID" w:history="1">
-        <w:r>
-          <w:rPr>
-            <w:rStyle w:val="Lienhypertexte"/>
-            <w:lang w:val="en-US"/>
-          </w:rPr>
-          <w:t>THW_ID</w:t>
-        </w:r>
-      </w:hyperlink>
-      <w:r>
-        <w:rPr>
-          <w:lang w:val="en-US"/>
-        </w:rPr>
-        <w:t>.</w:t>
-      </w:r>
-    </w:p>
-    <w:p>
-      <w:pPr>
-        <w:rPr>
-          <w:lang w:val="en-US"/>
-        </w:rPr>
-      </w:pPr>
-      <w:r>
-        <w:rPr>
-          <w:lang w:val="en-US"/>
-        </w:rPr>
-        <w:t>This tag is mandatory.</w:t>
-      </w:r>
-    </w:p>
-    <w:p>
-      <w:pPr>
-        <w:rPr>
-          <w:lang w:val="en-US"/>
-        </w:rPr>
-      </w:pPr>
-    </w:p>
-    <w:p>
-      <w:pPr>
-        <w:rPr>
-          <w:lang w:val="en-US"/>
-        </w:rPr>
-      </w:pPr>
-      <w:bookmarkStart w:id="210" w:name="_Tag_THW_ID"/>
-      <w:bookmarkEnd w:id="210"/>
-      <w:r>
-        <w:rPr>
-          <w:lang w:val="en-US"/>
-        </w:rPr>
-        <w:t xml:space="preserve">The attribute </w:t>
-      </w:r>
-      <w:r>
-        <w:rPr>
-          <w:lang w:val="en-US"/>
-        </w:rPr>
-        <w:t>number</w:t>
-      </w:r>
-      <w:r>
-        <w:rPr>
-          <w:lang w:val="en-US"/>
-        </w:rPr>
-        <w:t xml:space="preserve"> is used to indicate the </w:t>
-      </w:r>
-      <w:r>
-        <w:rPr>
-          <w:lang w:val="en-US"/>
-        </w:rPr>
-        <w:t>amount of target hardware identifiers</w:t>
-      </w:r>
-      <w:r>
-        <w:rPr>
-          <w:lang w:val="en-US"/>
-        </w:rPr>
-        <w:t>.</w:t>
-      </w:r>
-    </w:p>
-    <w:p>
-      <w:pPr>
-        <w:rPr>
-          <w:moveTo w:id="211" w:author="Pascal Heude" w:date="2026-08-01T19:48:00Z"/>
-          <w:lang w:val="en-US"/>
-        </w:rPr>
-      </w:pPr>
-      <w:ins w:id="212" w:author="Pascal Heude" w:date="2026-08-01T19:48:00Z">
+          <w:moveTo w:id="210" w:author="Pascal Heude" w:date="2026-08-01T19:48:00Z"/>
+          <w:lang w:val="en-US"/>
+        </w:rPr>
+      </w:pPr>
+      <w:ins w:id="211" w:author="Pascal Heude" w:date="2026-08-01T19:48:00Z">
         <w:r>
           <w:rPr>
             <w:b/>
@@ -12937,9 +12935,9 @@
           <w:t xml:space="preserve">: </w:t>
         </w:r>
       </w:ins>
-      <w:moveToRangeStart w:id="213" w:author="Pascal Heude" w:date="2026-08-01T19:48:00Z" w:name="move236506110"/>
-      <w:moveTo w:id="214" w:author="Pascal Heude" w:date="2026-08-01T19:48:00Z">
-        <w:del w:id="215" w:author="Pascal Heude" w:date="2026-08-01T19:48:00Z">
+      <w:moveToRangeStart w:id="212" w:author="Pascal Heude" w:date="2026-08-01T19:48:00Z" w:name="move236506110"/>
+      <w:moveTo w:id="213" w:author="Pascal Heude" w:date="2026-08-01T19:48:00Z">
+        <w:del w:id="214" w:author="Pascal Heude" w:date="2026-08-01T19:48:00Z">
           <w:r>
             <w:rPr>
               <w:lang w:val="en-US"/>
@@ -12948,7 +12946,7 @@
           </w:r>
         </w:del>
       </w:moveTo>
-      <w:ins w:id="216" w:author="Pascal Heude" w:date="2026-08-01T19:48:00Z">
+      <w:ins w:id="215" w:author="Pascal Heude" w:date="2026-08-01T19:48:00Z">
         <w:r>
           <w:rPr>
             <w:lang w:val="en-US"/>
@@ -12956,14 +12954,14 @@
           <w:t>t</w:t>
         </w:r>
       </w:ins>
-      <w:moveTo w:id="217" w:author="Pascal Heude" w:date="2026-08-01T19:48:00Z">
+      <w:moveTo w:id="216" w:author="Pascal Heude" w:date="2026-08-01T19:48:00Z">
         <w:r>
           <w:rPr>
             <w:lang w:val="en-US"/>
           </w:rPr>
           <w:t xml:space="preserve">he attribute </w:t>
         </w:r>
-        <w:del w:id="218" w:author="Pascal Heude" w:date="2026-08-01T19:48:00Z">
+        <w:del w:id="217" w:author="Pascal Heude" w:date="2026-08-01T19:48:00Z">
           <w:r>
             <w:rPr>
               <w:lang w:val="en-US"/>
@@ -12972,7 +12970,7 @@
           </w:r>
         </w:del>
       </w:moveTo>
-      <w:ins w:id="219" w:author="Pascal Heude" w:date="2026-08-01T19:48:00Z">
+      <w:ins w:id="218" w:author="Pascal Heude" w:date="2026-08-01T19:48:00Z">
         <w:r>
           <w:rPr>
             <w:lang w:val="en-US"/>
@@ -12980,7 +12978,7 @@
           <w:t>shall be</w:t>
         </w:r>
       </w:ins>
-      <w:moveTo w:id="220" w:author="Pascal Heude" w:date="2026-08-01T19:48:00Z">
+      <w:moveTo w:id="219" w:author="Pascal Heude" w:date="2026-08-01T19:48:00Z">
         <w:r>
           <w:rPr>
             <w:lang w:val="en-US"/>
@@ -12989,14 +12987,14 @@
         </w:r>
       </w:moveTo>
     </w:p>
-    <w:moveToRangeEnd w:id="213"/>
-    <w:p>
-      <w:pPr>
-        <w:rPr>
-          <w:lang w:val="en-US"/>
-        </w:rPr>
-      </w:pPr>
-      <w:ins w:id="221" w:author="Pascal Heude" w:date="2026-08-01T19:48:00Z">
+    <w:moveToRangeEnd w:id="212"/>
+    <w:p>
+      <w:pPr>
+        <w:rPr>
+          <w:lang w:val="en-US"/>
+        </w:rPr>
+      </w:pPr>
+      <w:ins w:id="220" w:author="Pascal Heude" w:date="2026-08-01T19:48:00Z">
         <w:r>
           <w:rPr>
             <w:b/>
@@ -13020,7 +13018,7 @@
           <w:t xml:space="preserve">: </w:t>
         </w:r>
       </w:ins>
-      <w:del w:id="222" w:author="Pascal Heude" w:date="2026-08-03T17:54:00Z">
+      <w:del w:id="221" w:author="Pascal Heude" w:date="2026-08-03T17:54:00Z">
         <w:r>
           <w:rPr>
             <w:lang w:val="en-US"/>
@@ -13028,7 +13026,7 @@
           <w:delText>T</w:delText>
         </w:r>
       </w:del>
-      <w:ins w:id="223" w:author="Pascal Heude" w:date="2026-08-03T17:54:00Z">
+      <w:ins w:id="222" w:author="Pascal Heude" w:date="2026-08-03T17:54:00Z">
         <w:r>
           <w:rPr>
             <w:lang w:val="en-US"/>
@@ -13052,12 +13050,12 @@
     <w:p>
       <w:pPr>
         <w:rPr>
-          <w:moveFrom w:id="224" w:author="Pascal Heude" w:date="2026-08-01T19:48:00Z"/>
-          <w:lang w:val="en-US"/>
-        </w:rPr>
-      </w:pPr>
-      <w:moveFromRangeStart w:id="225" w:author="Pascal Heude" w:date="2026-08-01T19:48:00Z" w:name="move236506110"/>
-      <w:moveFrom w:id="226" w:author="Pascal Heude" w:date="2026-08-01T19:48:00Z">
+          <w:moveFrom w:id="223" w:author="Pascal Heude" w:date="2026-08-01T19:48:00Z"/>
+          <w:lang w:val="en-US"/>
+        </w:rPr>
+      </w:pPr>
+      <w:moveFromRangeStart w:id="224" w:author="Pascal Heude" w:date="2026-08-01T19:48:00Z" w:name="move236506110"/>
+      <w:moveFrom w:id="225" w:author="Pascal Heude" w:date="2026-08-01T19:48:00Z">
         <w:r>
           <w:rPr>
             <w:lang w:val="en-US"/>
@@ -13072,7 +13070,7 @@
         </w:r>
       </w:moveFrom>
     </w:p>
-    <w:moveFromRangeEnd w:id="225"/>
+    <w:moveFromRangeEnd w:id="224"/>
     <w:p>
       <w:pPr>
         <w:rPr>
@@ -13148,13 +13146,13 @@
       <w:pPr>
         <w:pStyle w:val="Titre3"/>
       </w:pPr>
-      <w:bookmarkStart w:id="227" w:name="_Tag_THW_ID_1"/>
-      <w:bookmarkStart w:id="228" w:name="_Toc456106029"/>
+      <w:bookmarkStart w:id="226" w:name="_Tag_THW_ID_1"/>
+      <w:bookmarkStart w:id="227" w:name="_Toc456106029"/>
+      <w:bookmarkEnd w:id="226"/>
+      <w:r>
+        <w:t>Tag THW_ID</w:t>
+      </w:r>
       <w:bookmarkEnd w:id="227"/>
-      <w:r>
-        <w:t>Tag THW_ID</w:t>
-      </w:r>
-      <w:bookmarkEnd w:id="228"/>
     </w:p>
     <w:p>
       <w:pPr>
@@ -13208,17 +13206,17 @@
     <w:p>
       <w:pPr>
         <w:rPr>
-          <w:moveTo w:id="229" w:author="Pascal Heude" w:date="2026-08-01T21:11:00Z"/>
-          <w:lang w:val="en-US"/>
-        </w:rPr>
-      </w:pPr>
-      <w:ins w:id="230" w:author="Pascal Heude" w:date="2026-08-01T21:11:00Z">
+          <w:moveTo w:id="228" w:author="Pascal Heude" w:date="2026-08-01T21:11:00Z"/>
+          <w:lang w:val="en-US"/>
+        </w:rPr>
+      </w:pPr>
+      <w:ins w:id="229" w:author="Pascal Heude" w:date="2026-08-01T21:11:00Z">
         <w:r>
           <w:rPr>
             <w:b/>
             <w:color w:val="0070C0"/>
             <w:lang w:val="en-US"/>
-            <w:rPrChange w:id="231" w:author="Pascal Heude" w:date="2026-08-01T21:11:00Z">
+            <w:rPrChange w:id="230" w:author="Pascal Heude" w:date="2026-08-01T21:11:00Z">
               <w:rPr>
                 <w:lang w:val="en-US"/>
               </w:rPr>
@@ -13233,9 +13231,9 @@
           <w:t xml:space="preserve">: </w:t>
         </w:r>
       </w:ins>
-      <w:moveToRangeStart w:id="232" w:author="Pascal Heude" w:date="2026-08-01T21:11:00Z" w:name="move236511099"/>
-      <w:moveTo w:id="233" w:author="Pascal Heude" w:date="2026-08-01T21:11:00Z">
-        <w:del w:id="234" w:author="Pascal Heude" w:date="2026-08-03T17:54:00Z">
+      <w:moveToRangeStart w:id="231" w:author="Pascal Heude" w:date="2026-08-01T21:11:00Z" w:name="move236511099"/>
+      <w:moveTo w:id="232" w:author="Pascal Heude" w:date="2026-08-01T21:11:00Z">
+        <w:del w:id="233" w:author="Pascal Heude" w:date="2026-08-03T17:54:00Z">
           <w:r>
             <w:rPr>
               <w:lang w:val="en-US"/>
@@ -13244,7 +13242,7 @@
           </w:r>
         </w:del>
       </w:moveTo>
-      <w:ins w:id="235" w:author="Pascal Heude" w:date="2026-08-03T17:54:00Z">
+      <w:ins w:id="234" w:author="Pascal Heude" w:date="2026-08-03T17:54:00Z">
         <w:r>
           <w:rPr>
             <w:lang w:val="en-US"/>
@@ -13252,14 +13250,14 @@
           <w:t>t</w:t>
         </w:r>
       </w:ins>
-      <w:moveTo w:id="236" w:author="Pascal Heude" w:date="2026-08-01T21:11:00Z">
+      <w:moveTo w:id="235" w:author="Pascal Heude" w:date="2026-08-01T21:11:00Z">
         <w:r>
           <w:rPr>
             <w:lang w:val="en-US"/>
           </w:rPr>
           <w:t xml:space="preserve">his tag </w:t>
         </w:r>
-        <w:del w:id="237" w:author="Pascal Heude" w:date="2026-08-01T21:12:00Z">
+        <w:del w:id="236" w:author="Pascal Heude" w:date="2026-08-01T21:12:00Z">
           <w:r>
             <w:rPr>
               <w:lang w:val="en-US"/>
@@ -13268,7 +13266,7 @@
           </w:r>
         </w:del>
       </w:moveTo>
-      <w:ins w:id="238" w:author="Pascal Heude" w:date="2026-08-01T21:12:00Z">
+      <w:ins w:id="237" w:author="Pascal Heude" w:date="2026-08-01T21:12:00Z">
         <w:r>
           <w:rPr>
             <w:lang w:val="en-US"/>
@@ -13276,7 +13274,7 @@
           <w:t>shall be</w:t>
         </w:r>
       </w:ins>
-      <w:moveTo w:id="239" w:author="Pascal Heude" w:date="2026-08-01T21:11:00Z">
+      <w:moveTo w:id="238" w:author="Pascal Heude" w:date="2026-08-01T21:11:00Z">
         <w:r>
           <w:rPr>
             <w:lang w:val="en-US"/>
@@ -13326,20 +13324,20 @@
         </w:r>
       </w:moveTo>
     </w:p>
-    <w:moveToRangeEnd w:id="232"/>
-    <w:p>
-      <w:pPr>
-        <w:rPr>
-          <w:lang w:val="en-US"/>
-        </w:rPr>
-      </w:pPr>
-      <w:ins w:id="240" w:author="Pascal Heude" w:date="2026-08-01T21:11:00Z">
+    <w:moveToRangeEnd w:id="231"/>
+    <w:p>
+      <w:pPr>
+        <w:rPr>
+          <w:lang w:val="en-US"/>
+        </w:rPr>
+      </w:pPr>
+      <w:ins w:id="239" w:author="Pascal Heude" w:date="2026-08-01T21:11:00Z">
         <w:r>
           <w:rPr>
             <w:b/>
             <w:color w:val="0070C0"/>
             <w:lang w:val="en-US"/>
-            <w:rPrChange w:id="241" w:author="Pascal Heude" w:date="2026-08-01T21:11:00Z">
+            <w:rPrChange w:id="240" w:author="Pascal Heude" w:date="2026-08-01T21:11:00Z">
               <w:rPr>
                 <w:lang w:val="en-US"/>
               </w:rPr>
@@ -13354,7 +13352,7 @@
           <w:t xml:space="preserve">: </w:t>
         </w:r>
       </w:ins>
-      <w:ins w:id="242" w:author="Pascal Heude" w:date="2026-08-03T17:54:00Z">
+      <w:ins w:id="241" w:author="Pascal Heude" w:date="2026-08-03T17:54:00Z">
         <w:r>
           <w:rPr>
             <w:lang w:val="en-US"/>
@@ -13362,7 +13360,7 @@
           <w:t>t</w:t>
         </w:r>
       </w:ins>
-      <w:del w:id="243" w:author="Pascal Heude" w:date="2026-08-03T17:54:00Z">
+      <w:del w:id="242" w:author="Pascal Heude" w:date="2026-08-03T17:54:00Z">
         <w:r>
           <w:rPr>
             <w:lang w:val="en-US"/>
@@ -13380,12 +13378,12 @@
     <w:p>
       <w:pPr>
         <w:rPr>
-          <w:moveFrom w:id="244" w:author="Pascal Heude" w:date="2026-08-01T21:11:00Z"/>
-          <w:lang w:val="en-US"/>
-        </w:rPr>
-      </w:pPr>
-      <w:moveFromRangeStart w:id="245" w:author="Pascal Heude" w:date="2026-08-01T21:11:00Z" w:name="move236511099"/>
-      <w:moveFrom w:id="246" w:author="Pascal Heude" w:date="2026-08-01T21:11:00Z">
+          <w:moveFrom w:id="243" w:author="Pascal Heude" w:date="2026-08-01T21:11:00Z"/>
+          <w:lang w:val="en-US"/>
+        </w:rPr>
+      </w:pPr>
+      <w:moveFromRangeStart w:id="244" w:author="Pascal Heude" w:date="2026-08-01T21:11:00Z" w:name="move236511099"/>
+      <w:moveFrom w:id="245" w:author="Pascal Heude" w:date="2026-08-01T21:11:00Z">
         <w:r>
           <w:rPr>
             <w:lang w:val="en-US"/>
@@ -13447,7 +13445,7 @@
         </w:r>
       </w:moveFrom>
     </w:p>
-    <w:moveFromRangeEnd w:id="245"/>
+    <w:moveFromRangeEnd w:id="244"/>
     <w:p>
       <w:pPr>
         <w:rPr>
@@ -13625,13 +13623,13 @@
       <w:pPr>
         <w:pStyle w:val="Titre3"/>
       </w:pPr>
-      <w:bookmarkStart w:id="247" w:name="_Tag_SUPPORT_FILE_LIST"/>
-      <w:bookmarkStart w:id="248" w:name="_Toc456106030"/>
+      <w:bookmarkStart w:id="246" w:name="_Tag_SUPPORT_FILE_LIST"/>
+      <w:bookmarkStart w:id="247" w:name="_Toc456106030"/>
+      <w:bookmarkEnd w:id="246"/>
+      <w:r>
+        <w:t>Tag SUPPORT_FILE_LIST</w:t>
+      </w:r>
       <w:bookmarkEnd w:id="247"/>
-      <w:r>
-        <w:t>Tag SUPPORT_FILE_LIST</w:t>
-      </w:r>
-      <w:bookmarkEnd w:id="248"/>
     </w:p>
     <w:p>
       <w:pPr>
@@ -13661,20 +13659,20 @@
     <w:p>
       <w:pPr>
         <w:rPr>
-          <w:moveTo w:id="249" w:author="Pascal Heude" w:date="2026-08-03T17:51:00Z"/>
+          <w:moveTo w:id="248" w:author="Pascal Heude" w:date="2026-08-03T17:51:00Z"/>
           <w:b/>
           <w:color w:val="0070C0"/>
           <w:lang w:val="en-US"/>
-          <w:rPrChange w:id="250" w:author="Pascal Heude" w:date="2026-08-03T17:52:00Z">
+          <w:rPrChange w:id="249" w:author="Pascal Heude" w:date="2026-08-03T17:52:00Z">
             <w:rPr>
-              <w:moveTo w:id="251" w:author="Pascal Heude" w:date="2026-08-03T17:51:00Z"/>
+              <w:moveTo w:id="250" w:author="Pascal Heude" w:date="2026-08-03T17:51:00Z"/>
               <w:lang w:val="en-US"/>
             </w:rPr>
           </w:rPrChange>
         </w:rPr>
       </w:pPr>
-      <w:moveToRangeStart w:id="252" w:author="Pascal Heude" w:date="2026-08-03T17:51:00Z" w:name="move236671916"/>
-      <w:moveTo w:id="253" w:author="Pascal Heude" w:date="2026-08-03T17:51:00Z">
+      <w:moveToRangeStart w:id="251" w:author="Pascal Heude" w:date="2026-08-03T17:51:00Z" w:name="move236671916"/>
+      <w:moveTo w:id="252" w:author="Pascal Heude" w:date="2026-08-03T17:51:00Z">
         <w:r>
           <w:rPr>
             <w:lang w:val="en-US"/>
@@ -13683,20 +13681,20 @@
         </w:r>
       </w:moveTo>
     </w:p>
-    <w:moveToRangeEnd w:id="252"/>
-    <w:p>
-      <w:pPr>
-        <w:rPr>
-          <w:lang w:val="en-US"/>
-        </w:rPr>
-      </w:pPr>
-      <w:ins w:id="254" w:author="Pascal Heude" w:date="2026-08-03T17:51:00Z">
+    <w:moveToRangeEnd w:id="251"/>
+    <w:p>
+      <w:pPr>
+        <w:rPr>
+          <w:lang w:val="en-US"/>
+        </w:rPr>
+      </w:pPr>
+      <w:ins w:id="253" w:author="Pascal Heude" w:date="2026-08-03T17:51:00Z">
         <w:r>
           <w:rPr>
             <w:b/>
             <w:color w:val="0070C0"/>
             <w:lang w:val="en-US"/>
-            <w:rPrChange w:id="255" w:author="Pascal Heude" w:date="2026-08-03T17:52:00Z">
+            <w:rPrChange w:id="254" w:author="Pascal Heude" w:date="2026-08-03T17:52:00Z">
               <w:rPr>
                 <w:lang w:val="en-US"/>
               </w:rPr>
@@ -13711,7 +13709,7 @@
           <w:t xml:space="preserve">: </w:t>
         </w:r>
       </w:ins>
-      <w:del w:id="256" w:author="Pascal Heude" w:date="2026-08-03T17:54:00Z">
+      <w:del w:id="255" w:author="Pascal Heude" w:date="2026-08-03T17:54:00Z">
         <w:r>
           <w:rPr>
             <w:lang w:val="en-US"/>
@@ -13719,7 +13717,7 @@
           <w:delText>T</w:delText>
         </w:r>
       </w:del>
-      <w:ins w:id="257" w:author="Pascal Heude" w:date="2026-08-03T17:54:00Z">
+      <w:ins w:id="256" w:author="Pascal Heude" w:date="2026-08-03T17:54:00Z">
         <w:r>
           <w:rPr>
             <w:lang w:val="en-US"/>
@@ -13752,12 +13750,12 @@
     <w:p>
       <w:pPr>
         <w:rPr>
-          <w:moveFrom w:id="258" w:author="Pascal Heude" w:date="2026-08-03T17:51:00Z"/>
-          <w:lang w:val="en-US"/>
-        </w:rPr>
-      </w:pPr>
-      <w:moveFromRangeStart w:id="259" w:author="Pascal Heude" w:date="2026-08-03T17:51:00Z" w:name="move236671916"/>
-      <w:moveFrom w:id="260" w:author="Pascal Heude" w:date="2026-08-03T17:51:00Z">
+          <w:moveFrom w:id="257" w:author="Pascal Heude" w:date="2026-08-03T17:51:00Z"/>
+          <w:lang w:val="en-US"/>
+        </w:rPr>
+      </w:pPr>
+      <w:moveFromRangeStart w:id="258" w:author="Pascal Heude" w:date="2026-08-03T17:51:00Z" w:name="move236671916"/>
+      <w:moveFrom w:id="259" w:author="Pascal Heude" w:date="2026-08-03T17:51:00Z">
         <w:r>
           <w:rPr>
             <w:lang w:val="en-US"/>
@@ -13766,7 +13764,7 @@
         </w:r>
       </w:moveFrom>
     </w:p>
-    <w:moveFromRangeEnd w:id="259"/>
+    <w:moveFromRangeEnd w:id="258"/>
     <w:p>
       <w:pPr>
         <w:rPr>
@@ -13944,11 +13942,11 @@
     <w:p>
       <w:pPr>
         <w:rPr>
-          <w:moveTo w:id="261" w:author="Pascal Heude" w:date="2026-08-01T21:12:00Z"/>
-          <w:lang w:val="en-US"/>
-        </w:rPr>
-      </w:pPr>
-      <w:ins w:id="262" w:author="Pascal Heude" w:date="2026-08-01T21:13:00Z">
+          <w:moveTo w:id="260" w:author="Pascal Heude" w:date="2026-08-01T21:12:00Z"/>
+          <w:lang w:val="en-US"/>
+        </w:rPr>
+      </w:pPr>
+      <w:ins w:id="261" w:author="Pascal Heude" w:date="2026-08-01T21:13:00Z">
         <w:r>
           <w:rPr>
             <w:b/>
@@ -13958,7 +13956,7 @@
           <w:t>URQT_</w:t>
         </w:r>
       </w:ins>
-      <w:ins w:id="263" w:author="Pascal Heude" w:date="2026-08-01T22:10:00Z">
+      <w:ins w:id="262" w:author="Pascal Heude" w:date="2026-08-01T22:10:00Z">
         <w:r>
           <w:rPr>
             <w:b/>
@@ -13968,7 +13966,7 @@
           <w:t>2</w:t>
         </w:r>
       </w:ins>
-      <w:ins w:id="264" w:author="Pascal Heude" w:date="2026-08-03T17:52:00Z">
+      <w:ins w:id="263" w:author="Pascal Heude" w:date="2026-08-03T17:52:00Z">
         <w:r>
           <w:rPr>
             <w:b/>
@@ -13978,9 +13976,9 @@
           <w:t>6</w:t>
         </w:r>
       </w:ins>
-      <w:moveToRangeStart w:id="265" w:author="Pascal Heude" w:date="2026-08-01T21:12:00Z" w:name="move236511174"/>
-      <w:moveTo w:id="266" w:author="Pascal Heude" w:date="2026-08-01T21:12:00Z">
-        <w:del w:id="267" w:author="Pascal Heude" w:date="2026-08-01T21:13:00Z">
+      <w:moveToRangeStart w:id="264" w:author="Pascal Heude" w:date="2026-08-01T21:12:00Z" w:name="move236511174"/>
+      <w:moveTo w:id="265" w:author="Pascal Heude" w:date="2026-08-01T21:12:00Z">
+        <w:del w:id="266" w:author="Pascal Heude" w:date="2026-08-01T21:13:00Z">
           <w:r>
             <w:rPr>
               <w:lang w:val="en-US"/>
@@ -13989,7 +13987,7 @@
           </w:r>
         </w:del>
       </w:moveTo>
-      <w:ins w:id="268" w:author="Pascal Heude" w:date="2026-08-01T21:13:00Z">
+      <w:ins w:id="267" w:author="Pascal Heude" w:date="2026-08-01T21:13:00Z">
         <w:r>
           <w:rPr>
             <w:lang w:val="en-US"/>
@@ -13997,14 +13995,14 @@
           <w:t>: t</w:t>
         </w:r>
       </w:ins>
-      <w:moveTo w:id="269" w:author="Pascal Heude" w:date="2026-08-01T21:12:00Z">
+      <w:moveTo w:id="268" w:author="Pascal Heude" w:date="2026-08-01T21:12:00Z">
         <w:r>
           <w:rPr>
             <w:lang w:val="en-US"/>
           </w:rPr>
           <w:t xml:space="preserve">he attribute </w:t>
         </w:r>
-        <w:del w:id="270" w:author="Pascal Heude" w:date="2026-08-01T21:13:00Z">
+        <w:del w:id="269" w:author="Pascal Heude" w:date="2026-08-01T21:13:00Z">
           <w:r>
             <w:rPr>
               <w:lang w:val="en-US"/>
@@ -14013,7 +14011,7 @@
           </w:r>
         </w:del>
       </w:moveTo>
-      <w:ins w:id="271" w:author="Pascal Heude" w:date="2026-08-01T21:13:00Z">
+      <w:ins w:id="270" w:author="Pascal Heude" w:date="2026-08-01T21:13:00Z">
         <w:r>
           <w:rPr>
             <w:lang w:val="en-US"/>
@@ -14021,7 +14019,7 @@
           <w:t>shall be</w:t>
         </w:r>
       </w:ins>
-      <w:moveTo w:id="272" w:author="Pascal Heude" w:date="2026-08-01T21:12:00Z">
+      <w:moveTo w:id="271" w:author="Pascal Heude" w:date="2026-08-01T21:12:00Z">
         <w:r>
           <w:rPr>
             <w:lang w:val="en-US"/>
@@ -14030,20 +14028,20 @@
         </w:r>
       </w:moveTo>
     </w:p>
-    <w:moveToRangeEnd w:id="265"/>
-    <w:p>
-      <w:pPr>
-        <w:rPr>
-          <w:lang w:val="en-US"/>
-        </w:rPr>
-      </w:pPr>
-      <w:ins w:id="273" w:author="Pascal Heude" w:date="2026-08-01T21:12:00Z">
+    <w:moveToRangeEnd w:id="264"/>
+    <w:p>
+      <w:pPr>
+        <w:rPr>
+          <w:lang w:val="en-US"/>
+        </w:rPr>
+      </w:pPr>
+      <w:ins w:id="272" w:author="Pascal Heude" w:date="2026-08-01T21:12:00Z">
         <w:r>
           <w:rPr>
             <w:b/>
             <w:color w:val="0070C0"/>
             <w:lang w:val="en-US"/>
-            <w:rPrChange w:id="274" w:author="Pascal Heude" w:date="2026-08-01T21:13:00Z">
+            <w:rPrChange w:id="273" w:author="Pascal Heude" w:date="2026-08-01T21:13:00Z">
               <w:rPr>
                 <w:lang w:val="en-US"/>
               </w:rPr>
@@ -14052,7 +14050,7 @@
           <w:t>URQT_2</w:t>
         </w:r>
       </w:ins>
-      <w:ins w:id="275" w:author="Pascal Heude" w:date="2026-08-01T22:10:00Z">
+      <w:ins w:id="274" w:author="Pascal Heude" w:date="2026-08-01T22:10:00Z">
         <w:r>
           <w:rPr>
             <w:b/>
@@ -14062,7 +14060,7 @@
           <w:t>7</w:t>
         </w:r>
       </w:ins>
-      <w:ins w:id="276" w:author="Pascal Heude" w:date="2026-08-01T21:12:00Z">
+      <w:ins w:id="275" w:author="Pascal Heude" w:date="2026-08-01T21:12:00Z">
         <w:r>
           <w:rPr>
             <w:lang w:val="en-US"/>
@@ -14070,7 +14068,7 @@
           <w:t xml:space="preserve">: </w:t>
         </w:r>
       </w:ins>
-      <w:ins w:id="277" w:author="Pascal Heude" w:date="2026-08-03T17:54:00Z">
+      <w:ins w:id="276" w:author="Pascal Heude" w:date="2026-08-03T17:54:00Z">
         <w:r>
           <w:rPr>
             <w:lang w:val="en-US"/>
@@ -14078,7 +14076,7 @@
           <w:t>t</w:t>
         </w:r>
       </w:ins>
-      <w:del w:id="278" w:author="Pascal Heude" w:date="2026-08-03T17:54:00Z">
+      <w:del w:id="277" w:author="Pascal Heude" w:date="2026-08-03T17:54:00Z">
         <w:r>
           <w:rPr>
             <w:lang w:val="en-US"/>
@@ -14096,12 +14094,12 @@
     <w:p>
       <w:pPr>
         <w:rPr>
-          <w:moveFrom w:id="279" w:author="Pascal Heude" w:date="2026-08-01T21:12:00Z"/>
-          <w:lang w:val="en-US"/>
-        </w:rPr>
-      </w:pPr>
-      <w:moveFromRangeStart w:id="280" w:author="Pascal Heude" w:date="2026-08-01T21:12:00Z" w:name="move236511174"/>
-      <w:moveFrom w:id="281" w:author="Pascal Heude" w:date="2026-08-01T21:12:00Z">
+          <w:moveFrom w:id="278" w:author="Pascal Heude" w:date="2026-08-01T21:12:00Z"/>
+          <w:lang w:val="en-US"/>
+        </w:rPr>
+      </w:pPr>
+      <w:moveFromRangeStart w:id="279" w:author="Pascal Heude" w:date="2026-08-01T21:12:00Z" w:name="move236511174"/>
+      <w:moveFrom w:id="280" w:author="Pascal Heude" w:date="2026-08-01T21:12:00Z">
         <w:r>
           <w:rPr>
             <w:lang w:val="en-US"/>
@@ -14110,7 +14108,7 @@
         </w:r>
       </w:moveFrom>
     </w:p>
-    <w:moveFromRangeEnd w:id="280"/>
+    <w:moveFromRangeEnd w:id="279"/>
     <w:p>
       <w:pPr>
         <w:rPr>
@@ -14210,13 +14208,13 @@
       <w:pPr>
         <w:pStyle w:val="Titre3"/>
       </w:pPr>
-      <w:bookmarkStart w:id="282" w:name="_Tag_SUPPORT_FILE"/>
-      <w:bookmarkStart w:id="283" w:name="_Toc456106031"/>
+      <w:bookmarkStart w:id="281" w:name="_Tag_SUPPORT_FILE"/>
+      <w:bookmarkStart w:id="282" w:name="_Toc456106031"/>
+      <w:bookmarkEnd w:id="281"/>
+      <w:r>
+        <w:t>Tag SUPPORT_FILE</w:t>
+      </w:r>
       <w:bookmarkEnd w:id="282"/>
-      <w:r>
-        <w:t>Tag SUPPORT_FILE</w:t>
-      </w:r>
-      <w:bookmarkEnd w:id="283"/>
     </w:p>
     <w:p>
       <w:pPr>
@@ -14252,11 +14250,11 @@
     <w:p>
       <w:pPr>
         <w:rPr>
-          <w:ins w:id="284" w:author="Pascal Heude" w:date="2026-07-29T22:59:00Z"/>
-          <w:lang w:val="en-US"/>
-        </w:rPr>
-      </w:pPr>
-      <w:ins w:id="285" w:author="Pascal Heude" w:date="2026-08-01T21:16:00Z">
+          <w:ins w:id="283" w:author="Pascal Heude" w:date="2026-07-29T22:59:00Z"/>
+          <w:lang w:val="en-US"/>
+        </w:rPr>
+      </w:pPr>
+      <w:ins w:id="284" w:author="Pascal Heude" w:date="2026-08-01T21:16:00Z">
         <w:r>
           <w:rPr>
             <w:b/>
@@ -14266,7 +14264,7 @@
           <w:t>URQT_2</w:t>
         </w:r>
       </w:ins>
-      <w:ins w:id="286" w:author="Pascal Heude" w:date="2026-08-01T22:11:00Z">
+      <w:ins w:id="285" w:author="Pascal Heude" w:date="2026-08-01T22:11:00Z">
         <w:r>
           <w:rPr>
             <w:b/>
@@ -14276,7 +14274,7 @@
           <w:t>8</w:t>
         </w:r>
       </w:ins>
-      <w:ins w:id="287" w:author="Pascal Heude" w:date="2026-08-01T21:16:00Z">
+      <w:ins w:id="286" w:author="Pascal Heude" w:date="2026-08-01T21:16:00Z">
         <w:r>
           <w:rPr>
             <w:lang w:val="en-US"/>
@@ -14284,7 +14282,7 @@
           <w:t xml:space="preserve">: </w:t>
         </w:r>
       </w:ins>
-      <w:ins w:id="288" w:author="Pascal Heude" w:date="2026-08-03T17:54:00Z">
+      <w:ins w:id="287" w:author="Pascal Heude" w:date="2026-08-03T17:54:00Z">
         <w:r>
           <w:rPr>
             <w:lang w:val="en-US"/>
@@ -14292,7 +14290,7 @@
           <w:t>t</w:t>
         </w:r>
       </w:ins>
-      <w:del w:id="289" w:author="Pascal Heude" w:date="2026-08-03T17:54:00Z">
+      <w:del w:id="288" w:author="Pascal Heude" w:date="2026-08-03T17:54:00Z">
         <w:r>
           <w:rPr>
             <w:lang w:val="en-US"/>
@@ -14306,7 +14304,7 @@
         </w:rPr>
         <w:t xml:space="preserve">he content shall be a </w:t>
       </w:r>
-      <w:del w:id="290" w:author="Pascal Heude" w:date="2026-08-01T21:16:00Z">
+      <w:del w:id="289" w:author="Pascal Heude" w:date="2026-08-01T21:16:00Z">
         <w:r>
           <w:rPr>
             <w:lang w:val="en-US"/>
@@ -14314,7 +14312,7 @@
           <w:delText>list of characters</w:delText>
         </w:r>
       </w:del>
-      <w:ins w:id="291" w:author="Pascal Heude" w:date="2026-08-01T21:16:00Z">
+      <w:ins w:id="290" w:author="Pascal Heude" w:date="2026-08-01T21:16:00Z">
         <w:r>
           <w:rPr>
             <w:lang w:val="en-US"/>
@@ -14322,7 +14320,7 @@
           <w:t>readable fil</w:t>
         </w:r>
       </w:ins>
-      <w:ins w:id="292" w:author="Pascal Heude" w:date="2026-08-01T21:17:00Z">
+      <w:ins w:id="291" w:author="Pascal Heude" w:date="2026-08-01T21:17:00Z">
         <w:r>
           <w:rPr>
             <w:lang w:val="en-US"/>
@@ -14336,7 +14334,7 @@
         </w:rPr>
         <w:t>.</w:t>
       </w:r>
-      <w:ins w:id="293" w:author="Pascal Heude" w:date="2026-07-29T23:20:00Z">
+      <w:ins w:id="292" w:author="Pascal Heude" w:date="2026-07-29T23:20:00Z">
         <w:r>
           <w:rPr>
             <w:lang w:val="en-US"/>
@@ -14344,13 +14342,83 @@
           <w:t xml:space="preserve"> The name of support file shall not be identical to the name of data files (</w:t>
         </w:r>
       </w:ins>
+      <w:ins w:id="293" w:author="Pascal Heude" w:date="2026-07-29T23:22:00Z">
+        <w:r>
+          <w:rPr>
+            <w:lang w:val="en-US"/>
+          </w:rPr>
+          <w:t>cf. §</w:t>
+        </w:r>
+        <w:r>
+          <w:rPr>
+            <w:lang w:val="en-US"/>
+          </w:rPr>
+          <w:fldChar w:fldCharType="begin"/>
+        </w:r>
+        <w:r>
+          <w:rPr>
+            <w:lang w:val="en-US"/>
+          </w:rPr>
+          <w:instrText xml:space="preserve"> REF _Ref236259785 \r \h </w:instrText>
+        </w:r>
+      </w:ins>
+      <w:r>
+        <w:rPr>
+          <w:lang w:val="en-US"/>
+        </w:rPr>
+      </w:r>
+      <w:r>
+        <w:rPr>
+          <w:lang w:val="en-US"/>
+        </w:rPr>
+        <w:fldChar w:fldCharType="separate"/>
+      </w:r>
       <w:ins w:id="294" w:author="Pascal Heude" w:date="2026-07-29T23:22:00Z">
         <w:r>
           <w:rPr>
             <w:lang w:val="en-US"/>
           </w:rPr>
-          <w:t>cf. §</w:t>
-        </w:r>
+          <w:t>7.1.2</w:t>
+        </w:r>
+        <w:r>
+          <w:rPr>
+            <w:lang w:val="en-US"/>
+          </w:rPr>
+          <w:fldChar w:fldCharType="end"/>
+        </w:r>
+      </w:ins>
+      <w:ins w:id="295" w:author="Pascal Heude" w:date="2026-07-29T23:23:00Z">
+        <w:r>
+          <w:rPr>
+            <w:lang w:val="en-US"/>
+          </w:rPr>
+          <w:t>)</w:t>
+        </w:r>
+      </w:ins>
+      <w:ins w:id="296" w:author="Pascal Heude" w:date="2026-07-29T23:22:00Z">
+        <w:r>
+          <w:rPr>
+            <w:lang w:val="en-US"/>
+          </w:rPr>
+          <w:t>.</w:t>
+        </w:r>
+      </w:ins>
+    </w:p>
+    <w:p>
+      <w:pPr>
+        <w:rPr>
+          <w:lang w:val="en-US"/>
+        </w:rPr>
+      </w:pPr>
+      <w:ins w:id="297" w:author="Pascal Heude" w:date="2026-07-29T22:59:00Z">
+        <w:r>
+          <w:rPr>
+            <w:lang w:val="en-US"/>
+          </w:rPr>
+          <w:t xml:space="preserve">The support files will be copied in the directory provided by the tag </w:t>
+        </w:r>
+      </w:ins>
+      <w:ins w:id="298" w:author="Pascal Heude" w:date="2026-07-29T23:02:00Z">
         <w:r>
           <w:rPr>
             <w:lang w:val="en-US"/>
@@ -14361,43 +14429,53 @@
           <w:rPr>
             <w:lang w:val="en-US"/>
           </w:rPr>
-          <w:instrText xml:space="preserve"> REF _Ref236259785 \r \h </w:instrText>
+          <w:instrText xml:space="preserve"> HYPERLINK  \l "_Tag_DIRECTORY" </w:instrText>
+        </w:r>
+        <w:r>
+          <w:rPr>
+            <w:lang w:val="en-US"/>
+          </w:rPr>
+          <w:fldChar w:fldCharType="separate"/>
+        </w:r>
+        <w:r>
+          <w:rPr>
+            <w:rStyle w:val="Lienhypertexte"/>
+            <w:lang w:val="en-US"/>
+          </w:rPr>
+          <w:t>DIRECTORY</w:t>
+        </w:r>
+        <w:r>
+          <w:rPr>
+            <w:lang w:val="en-US"/>
+          </w:rPr>
+          <w:fldChar w:fldCharType="end"/>
         </w:r>
       </w:ins>
-      <w:r>
-        <w:rPr>
-          <w:lang w:val="en-US"/>
-        </w:rPr>
-      </w:r>
-      <w:r>
-        <w:rPr>
-          <w:lang w:val="en-US"/>
-        </w:rPr>
-        <w:fldChar w:fldCharType="separate"/>
-      </w:r>
-      <w:ins w:id="295" w:author="Pascal Heude" w:date="2026-07-29T23:22:00Z">
-        <w:r>
-          <w:rPr>
-            <w:lang w:val="en-US"/>
-          </w:rPr>
-          <w:t>7.1.2</w:t>
-        </w:r>
-        <w:r>
-          <w:rPr>
-            <w:lang w:val="en-US"/>
-          </w:rPr>
-          <w:fldChar w:fldCharType="end"/>
+      <w:ins w:id="299" w:author="Pascal Heude" w:date="2026-07-29T23:24:00Z">
+        <w:r>
+          <w:rPr>
+            <w:lang w:val="en-US"/>
+          </w:rPr>
+          <w:t>, with the dat</w:t>
         </w:r>
       </w:ins>
-      <w:ins w:id="296" w:author="Pascal Heude" w:date="2026-07-29T23:23:00Z">
-        <w:r>
-          <w:rPr>
-            <w:lang w:val="en-US"/>
-          </w:rPr>
-          <w:t>)</w:t>
+      <w:ins w:id="300" w:author="Pascal Heude" w:date="2026-07-29T23:26:00Z">
+        <w:r>
+          <w:rPr>
+            <w:lang w:val="en-US"/>
+          </w:rPr>
+          <w:t>a</w:t>
         </w:r>
       </w:ins>
-      <w:ins w:id="297" w:author="Pascal Heude" w:date="2026-07-29T23:22:00Z">
+      <w:ins w:id="301" w:author="Pascal Heude" w:date="2026-07-29T23:24:00Z">
+        <w:r>
+          <w:rPr>
+            <w:lang w:val="en-US"/>
+          </w:rPr>
+          <w:t xml:space="preserve"> files</w:t>
+        </w:r>
+      </w:ins>
+      <w:ins w:id="302" w:author="Pascal Heude" w:date="2026-07-29T23:01:00Z">
         <w:r>
           <w:rPr>
             <w:lang w:val="en-US"/>
@@ -14412,87 +14490,7 @@
           <w:lang w:val="en-US"/>
         </w:rPr>
       </w:pPr>
-      <w:ins w:id="298" w:author="Pascal Heude" w:date="2026-07-29T22:59:00Z">
-        <w:r>
-          <w:rPr>
-            <w:lang w:val="en-US"/>
-          </w:rPr>
-          <w:t xml:space="preserve">The support files will be copied in the directory provided by the tag </w:t>
-        </w:r>
-      </w:ins>
-      <w:ins w:id="299" w:author="Pascal Heude" w:date="2026-07-29T23:02:00Z">
-        <w:r>
-          <w:rPr>
-            <w:lang w:val="en-US"/>
-          </w:rPr>
-          <w:fldChar w:fldCharType="begin"/>
-        </w:r>
-        <w:r>
-          <w:rPr>
-            <w:lang w:val="en-US"/>
-          </w:rPr>
-          <w:instrText xml:space="preserve"> HYPERLINK  \l "_Tag_DIRECTORY" </w:instrText>
-        </w:r>
-        <w:r>
-          <w:rPr>
-            <w:lang w:val="en-US"/>
-          </w:rPr>
-          <w:fldChar w:fldCharType="separate"/>
-        </w:r>
-        <w:r>
-          <w:rPr>
-            <w:rStyle w:val="Lienhypertexte"/>
-            <w:lang w:val="en-US"/>
-          </w:rPr>
-          <w:t>DIRECTORY</w:t>
-        </w:r>
-        <w:r>
-          <w:rPr>
-            <w:lang w:val="en-US"/>
-          </w:rPr>
-          <w:fldChar w:fldCharType="end"/>
-        </w:r>
-      </w:ins>
-      <w:ins w:id="300" w:author="Pascal Heude" w:date="2026-07-29T23:24:00Z">
-        <w:r>
-          <w:rPr>
-            <w:lang w:val="en-US"/>
-          </w:rPr>
-          <w:t>, with the dat</w:t>
-        </w:r>
-      </w:ins>
-      <w:ins w:id="301" w:author="Pascal Heude" w:date="2026-07-29T23:26:00Z">
-        <w:r>
-          <w:rPr>
-            <w:lang w:val="en-US"/>
-          </w:rPr>
-          <w:t>a</w:t>
-        </w:r>
-      </w:ins>
-      <w:ins w:id="302" w:author="Pascal Heude" w:date="2026-07-29T23:24:00Z">
-        <w:r>
-          <w:rPr>
-            <w:lang w:val="en-US"/>
-          </w:rPr>
-          <w:t xml:space="preserve"> files</w:t>
-        </w:r>
-      </w:ins>
-      <w:ins w:id="303" w:author="Pascal Heude" w:date="2026-07-29T23:01:00Z">
-        <w:r>
-          <w:rPr>
-            <w:lang w:val="en-US"/>
-          </w:rPr>
-          <w:t>.</w:t>
-        </w:r>
-      </w:ins>
-    </w:p>
-    <w:p>
-      <w:pPr>
-        <w:rPr>
-          <w:lang w:val="en-US"/>
-        </w:rPr>
-      </w:pPr>
-      <w:ins w:id="304" w:author="Pascal Heude" w:date="2026-08-01T21:17:00Z">
+      <w:ins w:id="303" w:author="Pascal Heude" w:date="2026-08-01T21:17:00Z">
         <w:r>
           <w:rPr>
             <w:b/>
@@ -14502,7 +14500,7 @@
           <w:t>URQT_2</w:t>
         </w:r>
       </w:ins>
-      <w:ins w:id="305" w:author="Pascal Heude" w:date="2026-08-01T22:11:00Z">
+      <w:ins w:id="304" w:author="Pascal Heude" w:date="2026-08-01T22:11:00Z">
         <w:r>
           <w:rPr>
             <w:b/>
@@ -14512,7 +14510,7 @@
           <w:t>9</w:t>
         </w:r>
       </w:ins>
-      <w:ins w:id="306" w:author="Pascal Heude" w:date="2026-08-01T21:17:00Z">
+      <w:ins w:id="305" w:author="Pascal Heude" w:date="2026-08-01T21:17:00Z">
         <w:r>
           <w:rPr>
             <w:lang w:val="en-US"/>
@@ -14520,7 +14518,7 @@
           <w:t xml:space="preserve">: </w:t>
         </w:r>
       </w:ins>
-      <w:del w:id="307" w:author="Pascal Heude" w:date="2026-08-03T17:54:00Z">
+      <w:del w:id="306" w:author="Pascal Heude" w:date="2026-08-03T17:54:00Z">
         <w:r>
           <w:rPr>
             <w:lang w:val="en-US"/>
@@ -14528,7 +14526,7 @@
           <w:delText>T</w:delText>
         </w:r>
       </w:del>
-      <w:ins w:id="308" w:author="Pascal Heude" w:date="2026-08-03T17:54:00Z">
+      <w:ins w:id="307" w:author="Pascal Heude" w:date="2026-08-03T17:54:00Z">
         <w:r>
           <w:rPr>
             <w:lang w:val="en-US"/>
@@ -14751,7 +14749,7 @@
         </w:rPr>
         <w:t>&lt;SUPPORT_FILE&gt;c:\temp\</w:t>
       </w:r>
-      <w:del w:id="309" w:author="Pascal Heude" w:date="2026-07-29T22:54:00Z">
+      <w:del w:id="308" w:author="Pascal Heude" w:date="2026-07-29T22:54:00Z">
         <w:r>
           <w:rPr>
             <w:lang w:val="en-US"/>
@@ -14759,7 +14757,7 @@
           <w:delText>file1</w:delText>
         </w:r>
       </w:del>
-      <w:ins w:id="310" w:author="Pascal Heude" w:date="2026-07-29T22:54:00Z">
+      <w:ins w:id="309" w:author="Pascal Heude" w:date="2026-07-29T22:54:00Z">
         <w:r>
           <w:rPr>
             <w:lang w:val="en-US"/>
@@ -14817,13 +14815,13 @@
       <w:pPr>
         <w:pStyle w:val="Titre3"/>
       </w:pPr>
-      <w:bookmarkStart w:id="311" w:name="_Tag_USER_DATA"/>
-      <w:bookmarkStart w:id="312" w:name="_Toc456106032"/>
+      <w:bookmarkStart w:id="310" w:name="_Tag_USER_DATA"/>
+      <w:bookmarkStart w:id="311" w:name="_Toc456106032"/>
+      <w:bookmarkEnd w:id="310"/>
+      <w:r>
+        <w:t>Tag USER_DATA</w:t>
+      </w:r>
       <w:bookmarkEnd w:id="311"/>
-      <w:r>
-        <w:t>Tag USER_DATA</w:t>
-      </w:r>
-      <w:bookmarkEnd w:id="312"/>
     </w:p>
     <w:p>
       <w:pPr>
@@ -14899,7 +14897,7 @@
           <w:lang w:val="en-US"/>
         </w:rPr>
       </w:pPr>
-      <w:ins w:id="313" w:author="Pascal Heude" w:date="2026-08-01T21:19:00Z">
+      <w:ins w:id="312" w:author="Pascal Heude" w:date="2026-08-01T21:19:00Z">
         <w:r>
           <w:rPr>
             <w:b/>
@@ -14909,7 +14907,7 @@
           <w:t>URQT_</w:t>
         </w:r>
       </w:ins>
-      <w:ins w:id="314" w:author="Pascal Heude" w:date="2026-08-01T22:11:00Z">
+      <w:ins w:id="313" w:author="Pascal Heude" w:date="2026-08-01T22:11:00Z">
         <w:r>
           <w:rPr>
             <w:b/>
@@ -14919,7 +14917,7 @@
           <w:t>30</w:t>
         </w:r>
       </w:ins>
-      <w:ins w:id="315" w:author="Pascal Heude" w:date="2026-08-01T21:19:00Z">
+      <w:ins w:id="314" w:author="Pascal Heude" w:date="2026-08-01T21:19:00Z">
         <w:r>
           <w:rPr>
             <w:lang w:val="en-US"/>
@@ -14927,7 +14925,7 @@
           <w:t xml:space="preserve">: </w:t>
         </w:r>
       </w:ins>
-      <w:del w:id="316" w:author="Pascal Heude" w:date="2026-08-03T17:54:00Z">
+      <w:del w:id="315" w:author="Pascal Heude" w:date="2026-08-03T17:54:00Z">
         <w:r>
           <w:rPr>
             <w:lang w:val="en-US"/>
@@ -14935,7 +14933,7 @@
           <w:delText>T</w:delText>
         </w:r>
       </w:del>
-      <w:ins w:id="317" w:author="Pascal Heude" w:date="2026-08-03T17:54:00Z">
+      <w:ins w:id="316" w:author="Pascal Heude" w:date="2026-08-03T17:54:00Z">
         <w:r>
           <w:rPr>
             <w:lang w:val="en-US"/>
@@ -14998,21 +14996,21 @@
           <w:lang w:val="en-US"/>
         </w:rPr>
       </w:pPr>
-      <w:bookmarkStart w:id="318" w:name="_Tag_USER_DATA_FILE"/>
+      <w:bookmarkStart w:id="317" w:name="_Tag_USER_DATA_FILE"/>
+      <w:bookmarkEnd w:id="317"/>
+    </w:p>
+    <w:p>
+      <w:pPr>
+        <w:pStyle w:val="Titre3"/>
+      </w:pPr>
+      <w:bookmarkStart w:id="318" w:name="_Toc456106033"/>
+      <w:r>
+        <w:t>Tag USER_DATA_FILE</w:t>
+      </w:r>
       <w:bookmarkEnd w:id="318"/>
     </w:p>
     <w:p>
       <w:pPr>
-        <w:pStyle w:val="Titre3"/>
-      </w:pPr>
-      <w:bookmarkStart w:id="319" w:name="_Toc456106033"/>
-      <w:r>
-        <w:t>Tag USER_DATA_FILE</w:t>
-      </w:r>
-      <w:bookmarkEnd w:id="319"/>
-    </w:p>
-    <w:p>
-      <w:pPr>
         <w:rPr>
           <w:lang w:val="en-US"/>
         </w:rPr>
@@ -15043,7 +15041,7 @@
           <w:lang w:val="en-US"/>
         </w:rPr>
       </w:pPr>
-      <w:ins w:id="320" w:author="Pascal Heude" w:date="2026-08-01T21:20:00Z">
+      <w:ins w:id="319" w:author="Pascal Heude" w:date="2026-08-01T21:20:00Z">
         <w:r>
           <w:rPr>
             <w:b/>
@@ -15062,7 +15060,7 @@
           <w:t>3</w:t>
         </w:r>
       </w:ins>
-      <w:ins w:id="321" w:author="Pascal Heude" w:date="2026-08-01T22:11:00Z">
+      <w:ins w:id="320" w:author="Pascal Heude" w:date="2026-08-01T22:11:00Z">
         <w:r>
           <w:rPr>
             <w:b/>
@@ -15072,7 +15070,7 @@
           <w:t>1</w:t>
         </w:r>
       </w:ins>
-      <w:ins w:id="322" w:author="Pascal Heude" w:date="2026-08-01T21:20:00Z">
+      <w:ins w:id="321" w:author="Pascal Heude" w:date="2026-08-01T21:20:00Z">
         <w:r>
           <w:rPr>
             <w:lang w:val="en-US"/>
@@ -15080,7 +15078,7 @@
           <w:t xml:space="preserve">: </w:t>
         </w:r>
       </w:ins>
-      <w:ins w:id="323" w:author="Pascal Heude" w:date="2026-08-03T17:55:00Z">
+      <w:ins w:id="322" w:author="Pascal Heude" w:date="2026-08-03T17:55:00Z">
         <w:r>
           <w:rPr>
             <w:lang w:val="en-US"/>
@@ -15088,7 +15086,7 @@
           <w:t>i</w:t>
         </w:r>
       </w:ins>
-      <w:ins w:id="324" w:author="Pascal Heude" w:date="2026-08-01T21:20:00Z">
+      <w:ins w:id="323" w:author="Pascal Heude" w:date="2026-08-01T21:20:00Z">
         <w:r>
           <w:rPr>
             <w:lang w:val="en-US"/>
@@ -15096,7 +15094,7 @@
           <w:t>f used, t</w:t>
         </w:r>
       </w:ins>
-      <w:del w:id="325" w:author="Pascal Heude" w:date="2026-08-01T21:20:00Z">
+      <w:del w:id="324" w:author="Pascal Heude" w:date="2026-08-01T21:20:00Z">
         <w:r>
           <w:rPr>
             <w:lang w:val="en-US"/>
@@ -15110,7 +15108,7 @@
         </w:rPr>
         <w:t xml:space="preserve">he content shall be </w:t>
       </w:r>
-      <w:ins w:id="326" w:author="Pascal Heude" w:date="2026-08-01T21:20:00Z">
+      <w:ins w:id="325" w:author="Pascal Heude" w:date="2026-08-01T21:20:00Z">
         <w:r>
           <w:rPr>
             <w:lang w:val="en-US"/>
@@ -15118,7 +15116,7 @@
           <w:t>a readable filename, including or not a path, absolute or relative.</w:t>
         </w:r>
       </w:ins>
-      <w:del w:id="327" w:author="Pascal Heude" w:date="2026-08-01T21:20:00Z">
+      <w:del w:id="326" w:author="Pascal Heude" w:date="2026-08-01T21:20:00Z">
         <w:r>
           <w:rPr>
             <w:lang w:val="en-US"/>
@@ -15278,13 +15276,13 @@
       <w:pPr>
         <w:pStyle w:val="Titre3"/>
       </w:pPr>
-      <w:bookmarkStart w:id="328" w:name="_Tag_USER_DATA_TEXT"/>
-      <w:bookmarkStart w:id="329" w:name="_Toc456106034"/>
+      <w:bookmarkStart w:id="327" w:name="_Tag_USER_DATA_TEXT"/>
+      <w:bookmarkStart w:id="328" w:name="_Toc456106034"/>
+      <w:bookmarkEnd w:id="327"/>
+      <w:r>
+        <w:t>Tag USER_DATA_TEXT</w:t>
+      </w:r>
       <w:bookmarkEnd w:id="328"/>
-      <w:r>
-        <w:t>Tag USER_DATA_TEXT</w:t>
-      </w:r>
-      <w:bookmarkEnd w:id="329"/>
     </w:p>
     <w:p>
       <w:pPr>
@@ -15318,7 +15316,7 @@
           <w:lang w:val="en-US"/>
         </w:rPr>
       </w:pPr>
-      <w:ins w:id="330" w:author="Pascal Heude" w:date="2026-08-01T21:21:00Z">
+      <w:ins w:id="329" w:author="Pascal Heude" w:date="2026-08-01T21:21:00Z">
         <w:r>
           <w:rPr>
             <w:b/>
@@ -15336,7 +15334,7 @@
           <w:t>3</w:t>
         </w:r>
       </w:ins>
-      <w:ins w:id="331" w:author="Pascal Heude" w:date="2026-08-01T22:11:00Z">
+      <w:ins w:id="330" w:author="Pascal Heude" w:date="2026-08-01T22:11:00Z">
         <w:r>
           <w:rPr>
             <w:b/>
@@ -15346,7 +15344,7 @@
           <w:t>2</w:t>
         </w:r>
       </w:ins>
-      <w:ins w:id="332" w:author="Pascal Heude" w:date="2026-08-01T21:21:00Z">
+      <w:ins w:id="331" w:author="Pascal Heude" w:date="2026-08-01T21:21:00Z">
         <w:r>
           <w:rPr>
             <w:lang w:val="en-US"/>
@@ -15354,7 +15352,7 @@
           <w:t xml:space="preserve">: </w:t>
         </w:r>
       </w:ins>
-      <w:ins w:id="333" w:author="Pascal Heude" w:date="2026-08-03T17:55:00Z">
+      <w:ins w:id="332" w:author="Pascal Heude" w:date="2026-08-03T17:55:00Z">
         <w:r>
           <w:rPr>
             <w:lang w:val="en-US"/>
@@ -15362,7 +15360,7 @@
           <w:t>i</w:t>
         </w:r>
       </w:ins>
-      <w:ins w:id="334" w:author="Pascal Heude" w:date="2026-08-01T21:21:00Z">
+      <w:ins w:id="333" w:author="Pascal Heude" w:date="2026-08-01T21:21:00Z">
         <w:r>
           <w:rPr>
             <w:lang w:val="en-US"/>
@@ -15370,7 +15368,7 @@
           <w:t xml:space="preserve">f used, </w:t>
         </w:r>
       </w:ins>
-      <w:del w:id="335" w:author="Pascal Heude" w:date="2026-08-01T21:21:00Z">
+      <w:del w:id="334" w:author="Pascal Heude" w:date="2026-08-01T21:21:00Z">
         <w:r>
           <w:rPr>
             <w:lang w:val="en-US"/>
@@ -15378,7 +15376,7 @@
           <w:delText>T</w:delText>
         </w:r>
       </w:del>
-      <w:ins w:id="336" w:author="Pascal Heude" w:date="2026-08-01T21:21:00Z">
+      <w:ins w:id="335" w:author="Pascal Heude" w:date="2026-08-01T21:21:00Z">
         <w:r>
           <w:rPr>
             <w:lang w:val="en-US"/>
@@ -15456,57 +15454,57 @@
       <w:pPr>
         <w:pStyle w:val="Titre3"/>
       </w:pPr>
-      <w:bookmarkStart w:id="337" w:name="_Toc456106035"/>
+      <w:bookmarkStart w:id="336" w:name="_Toc456106035"/>
       <w:r>
         <w:t>Tag USER_DATA_BCC</w:t>
       </w:r>
+      <w:bookmarkEnd w:id="336"/>
+    </w:p>
+    <w:p>
+      <w:pPr>
+        <w:rPr>
+          <w:lang w:val="en-US"/>
+        </w:rPr>
+      </w:pPr>
+      <w:r>
+        <w:rPr>
+          <w:lang w:val="en-US"/>
+        </w:rPr>
+        <w:t>Not documented</w:t>
+      </w:r>
+    </w:p>
+    <w:p>
+      <w:pPr>
+        <w:pStyle w:val="cach"/>
+        <w:rPr>
+          <w:sz w:val="22"/>
+        </w:rPr>
+      </w:pPr>
+      <w:r>
+        <w:rPr>
+          <w:sz w:val="22"/>
+        </w:rPr>
+        <w:t>This tag consists in 2 sub tags: HW_FUNCTIONAL_DESIGNATION and HW_SW_COMPATIBILITY_INDEX.  For the first one, you can use free text. For the second one, you can use a number between 0 and 254.</w:t>
+      </w:r>
+    </w:p>
+    <w:p>
+      <w:pPr>
+        <w:rPr>
+          <w:lang w:val="en-US"/>
+        </w:rPr>
+      </w:pPr>
+    </w:p>
+    <w:p>
+      <w:pPr>
+        <w:pStyle w:val="Titre3"/>
+      </w:pPr>
+      <w:bookmarkStart w:id="337" w:name="_Tag_MEDIA"/>
+      <w:bookmarkStart w:id="338" w:name="_Toc456106036"/>
       <w:bookmarkEnd w:id="337"/>
-    </w:p>
-    <w:p>
-      <w:pPr>
-        <w:rPr>
-          <w:lang w:val="en-US"/>
-        </w:rPr>
-      </w:pPr>
-      <w:r>
-        <w:rPr>
-          <w:lang w:val="en-US"/>
-        </w:rPr>
-        <w:t>Not documented</w:t>
-      </w:r>
-    </w:p>
-    <w:p>
-      <w:pPr>
-        <w:pStyle w:val="cach"/>
-        <w:rPr>
-          <w:sz w:val="22"/>
-        </w:rPr>
-      </w:pPr>
-      <w:r>
-        <w:rPr>
-          <w:sz w:val="22"/>
-        </w:rPr>
-        <w:t>This tag consists in 2 sub tags: HW_FUNCTIONAL_DESIGNATION and HW_SW_COMPATIBILITY_INDEX.  For the first one, you can use free text. For the second one, you can use a number between 0 and 254.</w:t>
-      </w:r>
-    </w:p>
-    <w:p>
-      <w:pPr>
-        <w:rPr>
-          <w:lang w:val="en-US"/>
-        </w:rPr>
-      </w:pPr>
-    </w:p>
-    <w:p>
-      <w:pPr>
-        <w:pStyle w:val="Titre3"/>
-      </w:pPr>
-      <w:bookmarkStart w:id="338" w:name="_Tag_MEDIA"/>
-      <w:bookmarkStart w:id="339" w:name="_Toc456106036"/>
+      <w:r>
+        <w:t>Tag MEDIA</w:t>
+      </w:r>
       <w:bookmarkEnd w:id="338"/>
-      <w:r>
-        <w:t>Tag MEDIA</w:t>
-      </w:r>
-      <w:bookmarkEnd w:id="339"/>
     </w:p>
     <w:p>
       <w:pPr>
@@ -15641,13 +15639,43 @@
           <w:lang w:val="en-US"/>
         </w:rPr>
       </w:pPr>
-      <w:bookmarkStart w:id="340" w:name="_Toc456106037"/>
+      <w:bookmarkStart w:id="339" w:name="_Toc456106037"/>
       <w:r>
         <w:rPr>
           <w:lang w:val="en-US"/>
         </w:rPr>
         <w:t>LIMITATIONS</w:t>
       </w:r>
+      <w:bookmarkEnd w:id="339"/>
+    </w:p>
+    <w:p>
+      <w:pPr>
+        <w:rPr>
+          <w:lang w:val="en-US"/>
+        </w:rPr>
+      </w:pPr>
+      <w:r>
+        <w:rPr>
+          <w:lang w:val="en-US"/>
+        </w:rPr>
+        <w:t>The limitations are sorted by report version and files.</w:t>
+      </w:r>
+    </w:p>
+    <w:p>
+      <w:pPr>
+        <w:rPr>
+          <w:lang w:val="en-US"/>
+        </w:rPr>
+      </w:pPr>
+    </w:p>
+    <w:p>
+      <w:pPr>
+        <w:pStyle w:val="Titre2"/>
+      </w:pPr>
+      <w:bookmarkStart w:id="340" w:name="_Toc456106038"/>
+      <w:r>
+        <w:t>ARINC665-1</w:t>
+      </w:r>
       <w:bookmarkEnd w:id="340"/>
     </w:p>
     <w:p>
@@ -15660,7 +15688,43 @@
         <w:rPr>
           <w:lang w:val="en-US"/>
         </w:rPr>
-        <w:t>The limitations are sorted by report version and files.</w:t>
+        <w:t>This r</w:t>
+      </w:r>
+      <w:r>
+        <w:rPr>
+          <w:lang w:val="en-US"/>
+        </w:rPr>
+        <w:t xml:space="preserve">eport </w:t>
+      </w:r>
+      <w:r>
+        <w:rPr>
+          <w:lang w:val="en-US"/>
+        </w:rPr>
+        <w:t xml:space="preserve">is </w:t>
+      </w:r>
+      <w:r>
+        <w:rPr>
+          <w:lang w:val="en-US"/>
+        </w:rPr>
+        <w:t xml:space="preserve">not </w:t>
+      </w:r>
+      <w:r>
+        <w:rPr>
+          <w:lang w:val="en-US"/>
+        </w:rPr>
+        <w:t xml:space="preserve">yet </w:t>
+      </w:r>
+      <w:r>
+        <w:rPr>
+          <w:lang w:val="en-US"/>
+        </w:rPr>
+        <w:t>supported</w:t>
+      </w:r>
+      <w:r>
+        <w:rPr>
+          <w:lang w:val="en-US"/>
+        </w:rPr>
+        <w:t>.</w:t>
       </w:r>
     </w:p>
     <w:p>
@@ -15674,87 +15738,21 @@
       <w:pPr>
         <w:pStyle w:val="Titre2"/>
       </w:pPr>
-      <w:bookmarkStart w:id="341" w:name="_Toc456106038"/>
-      <w:r>
-        <w:t>ARINC665-1</w:t>
+      <w:bookmarkStart w:id="341" w:name="_Toc456106039"/>
+      <w:r>
+        <w:t>ARINC665-2</w:t>
       </w:r>
       <w:bookmarkEnd w:id="341"/>
     </w:p>
     <w:p>
       <w:pPr>
-        <w:rPr>
-          <w:lang w:val="en-US"/>
-        </w:rPr>
-      </w:pPr>
-      <w:r>
-        <w:rPr>
-          <w:lang w:val="en-US"/>
-        </w:rPr>
-        <w:t>This r</w:t>
-      </w:r>
-      <w:r>
-        <w:rPr>
-          <w:lang w:val="en-US"/>
-        </w:rPr>
-        <w:t xml:space="preserve">eport </w:t>
-      </w:r>
-      <w:r>
-        <w:rPr>
-          <w:lang w:val="en-US"/>
-        </w:rPr>
-        <w:t xml:space="preserve">is </w:t>
-      </w:r>
-      <w:r>
-        <w:rPr>
-          <w:lang w:val="en-US"/>
-        </w:rPr>
-        <w:t xml:space="preserve">not </w:t>
-      </w:r>
-      <w:r>
-        <w:rPr>
-          <w:lang w:val="en-US"/>
-        </w:rPr>
-        <w:t xml:space="preserve">yet </w:t>
-      </w:r>
-      <w:r>
-        <w:rPr>
-          <w:lang w:val="en-US"/>
-        </w:rPr>
-        <w:t>supported</w:t>
-      </w:r>
-      <w:r>
-        <w:rPr>
-          <w:lang w:val="en-US"/>
-        </w:rPr>
-        <w:t>.</w:t>
-      </w:r>
-    </w:p>
-    <w:p>
-      <w:pPr>
-        <w:rPr>
-          <w:lang w:val="en-US"/>
-        </w:rPr>
-      </w:pPr>
-    </w:p>
-    <w:p>
-      <w:pPr>
-        <w:pStyle w:val="Titre2"/>
-      </w:pPr>
-      <w:bookmarkStart w:id="342" w:name="_Toc456106039"/>
-      <w:r>
-        <w:t>ARINC665-2</w:t>
+        <w:pStyle w:val="Titre3"/>
+      </w:pPr>
+      <w:bookmarkStart w:id="342" w:name="_Toc456106040"/>
+      <w:r>
+        <w:t>General</w:t>
       </w:r>
       <w:bookmarkEnd w:id="342"/>
-    </w:p>
-    <w:p>
-      <w:pPr>
-        <w:pStyle w:val="Titre3"/>
-      </w:pPr>
-      <w:bookmarkStart w:id="343" w:name="_Toc456106040"/>
-      <w:r>
-        <w:t>General</w:t>
-      </w:r>
-      <w:bookmarkEnd w:id="343"/>
     </w:p>
     <w:p>
       <w:pPr>
@@ -15813,14 +15811,14 @@
           <w:numId w:val="22"/>
         </w:numPr>
         <w:rPr>
-          <w:ins w:id="344" w:author="Pascal Heude" w:date="2026-08-03T17:45:00Z"/>
-          <w:lang w:val="en-US"/>
-        </w:rPr>
-        <w:pPrChange w:id="345" w:author="Pascal Heude" w:date="2026-08-03T17:46:00Z">
+          <w:ins w:id="343" w:author="Pascal Heude" w:date="2026-08-03T17:45:00Z"/>
+          <w:lang w:val="en-US"/>
+        </w:rPr>
+        <w:pPrChange w:id="344" w:author="Pascal Heude" w:date="2026-08-03T17:46:00Z">
           <w:pPr/>
         </w:pPrChange>
       </w:pPr>
-      <w:ins w:id="346" w:author="Pascal Heude" w:date="2026-08-03T17:45:00Z">
+      <w:ins w:id="345" w:author="Pascal Heude" w:date="2026-08-03T17:45:00Z">
         <w:r>
           <w:rPr>
             <w:lang w:val="en-US"/>
@@ -15840,11 +15838,11 @@
       <w:pPr>
         <w:pStyle w:val="Titre3"/>
       </w:pPr>
-      <w:bookmarkStart w:id="347" w:name="_Toc456106041"/>
+      <w:bookmarkStart w:id="346" w:name="_Toc456106041"/>
       <w:r>
         <w:t>Data files</w:t>
       </w:r>
-      <w:bookmarkEnd w:id="347"/>
+      <w:bookmarkEnd w:id="346"/>
     </w:p>
     <w:p>
       <w:pPr>
@@ -15882,14 +15880,14 @@
       <w:pPr>
         <w:pStyle w:val="Titre3"/>
       </w:pPr>
-      <w:bookmarkStart w:id="348" w:name="_Toc456106042"/>
+      <w:bookmarkStart w:id="347" w:name="_Toc456106042"/>
       <w:r>
         <w:t>List</w:t>
       </w:r>
       <w:r>
         <w:t>-of-Files file</w:t>
       </w:r>
-      <w:bookmarkEnd w:id="348"/>
+      <w:bookmarkEnd w:id="347"/>
     </w:p>
     <w:p>
       <w:pPr>
@@ -15968,11 +15966,11 @@
       <w:pPr>
         <w:pStyle w:val="Titre3"/>
       </w:pPr>
-      <w:bookmarkStart w:id="349" w:name="_Toc456106043"/>
+      <w:bookmarkStart w:id="348" w:name="_Toc456106043"/>
       <w:r>
         <w:t>List-of-Loads file</w:t>
       </w:r>
-      <w:bookmarkEnd w:id="349"/>
+      <w:bookmarkEnd w:id="348"/>
     </w:p>
     <w:p>
       <w:pPr>
@@ -16063,11 +16061,11 @@
       <w:pPr>
         <w:pStyle w:val="Titre3"/>
       </w:pPr>
-      <w:bookmarkStart w:id="350" w:name="_Toc456106044"/>
+      <w:bookmarkStart w:id="349" w:name="_Toc456106044"/>
       <w:r>
         <w:t>List-of-Batch file</w:t>
       </w:r>
-      <w:bookmarkEnd w:id="350"/>
+      <w:bookmarkEnd w:id="349"/>
     </w:p>
     <w:p>
       <w:pPr>
@@ -16236,11 +16234,11 @@
       <w:pPr>
         <w:pStyle w:val="Titre3"/>
       </w:pPr>
-      <w:bookmarkStart w:id="351" w:name="_Toc456106045"/>
+      <w:bookmarkStart w:id="350" w:name="_Toc456106045"/>
       <w:r>
         <w:t>Batch file</w:t>
       </w:r>
-      <w:bookmarkEnd w:id="351"/>
+      <w:bookmarkEnd w:id="350"/>
     </w:p>
     <w:p>
       <w:pPr>
@@ -16281,21 +16279,21 @@
       <w:pPr>
         <w:pStyle w:val="Titre2"/>
       </w:pPr>
-      <w:bookmarkStart w:id="352" w:name="_Toc456106046"/>
+      <w:bookmarkStart w:id="351" w:name="_Toc456106046"/>
       <w:r>
         <w:t>ARINC665-3</w:t>
       </w:r>
+      <w:bookmarkEnd w:id="351"/>
+    </w:p>
+    <w:p>
+      <w:pPr>
+        <w:pStyle w:val="Titre3"/>
+      </w:pPr>
+      <w:bookmarkStart w:id="352" w:name="_Toc456106047"/>
+      <w:r>
+        <w:t>General</w:t>
+      </w:r>
       <w:bookmarkEnd w:id="352"/>
-    </w:p>
-    <w:p>
-      <w:pPr>
-        <w:pStyle w:val="Titre3"/>
-      </w:pPr>
-      <w:bookmarkStart w:id="353" w:name="_Toc456106047"/>
-      <w:r>
-        <w:t>General</w:t>
-      </w:r>
-      <w:bookmarkEnd w:id="353"/>
     </w:p>
     <w:p>
       <w:pPr>
@@ -16356,11 +16354,11 @@
       <w:pPr>
         <w:pStyle w:val="Titre3"/>
       </w:pPr>
-      <w:bookmarkStart w:id="354" w:name="_Toc456106048"/>
+      <w:bookmarkStart w:id="353" w:name="_Toc456106048"/>
       <w:r>
         <w:t>Header file</w:t>
       </w:r>
-      <w:bookmarkEnd w:id="354"/>
+      <w:bookmarkEnd w:id="353"/>
     </w:p>
     <w:p>
       <w:pPr>
@@ -16469,11 +16467,11 @@
       <w:pPr>
         <w:pStyle w:val="Titre3"/>
       </w:pPr>
-      <w:bookmarkStart w:id="355" w:name="_Toc456106049"/>
+      <w:bookmarkStart w:id="354" w:name="_Toc456106049"/>
       <w:r>
         <w:t>Data files</w:t>
       </w:r>
-      <w:bookmarkEnd w:id="355"/>
+      <w:bookmarkEnd w:id="354"/>
     </w:p>
     <w:p>
       <w:pPr>
@@ -16530,14 +16528,14 @@
       <w:pPr>
         <w:pStyle w:val="Titre3"/>
       </w:pPr>
-      <w:bookmarkStart w:id="356" w:name="_Toc456106050"/>
+      <w:bookmarkStart w:id="355" w:name="_Toc456106050"/>
       <w:r>
         <w:t>List</w:t>
       </w:r>
       <w:r>
         <w:t>-of-Files file</w:t>
       </w:r>
-      <w:bookmarkEnd w:id="356"/>
+      <w:bookmarkEnd w:id="355"/>
     </w:p>
     <w:p>
       <w:pPr>
@@ -16712,11 +16710,11 @@
       <w:pPr>
         <w:pStyle w:val="Titre3"/>
       </w:pPr>
-      <w:bookmarkStart w:id="357" w:name="_Toc456106051"/>
+      <w:bookmarkStart w:id="356" w:name="_Toc456106051"/>
       <w:r>
         <w:t>List-of-Loads file</w:t>
       </w:r>
-      <w:bookmarkEnd w:id="357"/>
+      <w:bookmarkEnd w:id="356"/>
     </w:p>
     <w:p>
       <w:pPr>
@@ -16879,11 +16877,11 @@
       <w:pPr>
         <w:pStyle w:val="Titre3"/>
       </w:pPr>
-      <w:bookmarkStart w:id="358" w:name="_Toc456106052"/>
+      <w:bookmarkStart w:id="357" w:name="_Toc456106052"/>
       <w:r>
         <w:t>List-of-Batch file</w:t>
       </w:r>
-      <w:bookmarkEnd w:id="358"/>
+      <w:bookmarkEnd w:id="357"/>
     </w:p>
     <w:p>
       <w:pPr>
@@ -17010,11 +17008,11 @@
       <w:pPr>
         <w:pStyle w:val="Titre3"/>
       </w:pPr>
-      <w:bookmarkStart w:id="359" w:name="_Toc456106053"/>
+      <w:bookmarkStart w:id="358" w:name="_Toc456106053"/>
       <w:r>
         <w:t>Batch file</w:t>
       </w:r>
-      <w:bookmarkEnd w:id="359"/>
+      <w:bookmarkEnd w:id="358"/>
     </w:p>
     <w:p>
       <w:pPr>
@@ -17074,14 +17072,16 @@
           <w:lang w:val="en-US"/>
         </w:rPr>
       </w:pPr>
-      <w:bookmarkStart w:id="360" w:name="_Toc456106054"/>
+      <w:bookmarkStart w:id="359" w:name="_Toc456106054"/>
+      <w:bookmarkStart w:id="360" w:name="_GoBack"/>
+      <w:bookmarkEnd w:id="360"/>
       <w:r>
         <w:rPr>
           <w:lang w:val="en-US"/>
         </w:rPr>
         <w:t>LOAD STRUCTURE</w:t>
       </w:r>
-      <w:bookmarkEnd w:id="360"/>
+      <w:bookmarkEnd w:id="359"/>
     </w:p>
     <w:p>
       <w:pPr>
@@ -17456,6 +17456,22 @@
     <w:p>
       <w:pPr>
         <w:rPr>
+          <w:ins w:id="372" w:author="Pascal Heude" w:date="2026-08-05T22:48:00Z"/>
+          <w:lang w:val="en-US"/>
+        </w:rPr>
+      </w:pPr>
+      <w:ins w:id="373" w:author="Pascal Heude" w:date="2026-08-05T22:44:00Z">
+        <w:r>
+          <w:rPr>
+            <w:lang w:val="en-US"/>
+          </w:rPr>
+          <w:t>All the files are created in the directory in which the LSPB is launched.</w:t>
+        </w:r>
+      </w:ins>
+    </w:p>
+    <w:p>
+      <w:pPr>
+        <w:rPr>
           <w:lang w:val="en-US"/>
         </w:rPr>
       </w:pPr>
@@ -17464,21 +17480,21 @@
       <w:pPr>
         <w:pStyle w:val="Titre2"/>
       </w:pPr>
-      <w:bookmarkStart w:id="372" w:name="_Toc456106055"/>
+      <w:bookmarkStart w:id="374" w:name="_Toc456106055"/>
       <w:r>
         <w:t>Filenames</w:t>
       </w:r>
-      <w:bookmarkEnd w:id="372"/>
+      <w:bookmarkEnd w:id="374"/>
     </w:p>
     <w:p>
       <w:pPr>
         <w:pStyle w:val="Titre3"/>
       </w:pPr>
-      <w:bookmarkStart w:id="373" w:name="_Toc456106056"/>
+      <w:bookmarkStart w:id="375" w:name="_Toc456106056"/>
       <w:r>
         <w:t>Header file</w:t>
       </w:r>
-      <w:bookmarkEnd w:id="373"/>
+      <w:bookmarkEnd w:id="375"/>
     </w:p>
     <w:p>
       <w:pPr>
@@ -17573,13 +17589,13 @@
       <w:pPr>
         <w:pStyle w:val="Titre3"/>
       </w:pPr>
-      <w:bookmarkStart w:id="374" w:name="_Toc456106057"/>
-      <w:bookmarkStart w:id="375" w:name="_Ref236259785"/>
+      <w:bookmarkStart w:id="376" w:name="_Toc456106057"/>
+      <w:bookmarkStart w:id="377" w:name="_Ref236259785"/>
       <w:r>
         <w:t>Data files</w:t>
       </w:r>
-      <w:bookmarkEnd w:id="374"/>
-      <w:bookmarkEnd w:id="375"/>
+      <w:bookmarkEnd w:id="376"/>
+      <w:bookmarkEnd w:id="377"/>
     </w:p>
     <w:p>
       <w:pPr>
@@ -17670,11 +17686,11 @@
       <w:pPr>
         <w:pStyle w:val="Titre3"/>
       </w:pPr>
-      <w:bookmarkStart w:id="376" w:name="_Toc456106058"/>
+      <w:bookmarkStart w:id="378" w:name="_Toc456106058"/>
       <w:r>
         <w:t>Batch file</w:t>
       </w:r>
-      <w:bookmarkEnd w:id="376"/>
+      <w:bookmarkEnd w:id="378"/>
     </w:p>
     <w:p>
       <w:pPr>
@@ -17879,7 +17895,7 @@
       <w:rPr>
         <w:noProof/>
       </w:rPr>
-      <w:t>11</w:t>
+      <w:t>17</w:t>
     </w:r>
     <w:r>
       <w:fldChar w:fldCharType="end"/>
@@ -22298,7 +22314,7 @@
 </file>
 
 <file path=customXml/itemProps1.xml><?xml version="1.0" encoding="utf-8"?>
-<ds:datastoreItem xmlns:ds="http://schemas.openxmlformats.org/officeDocument/2006/customXml" ds:itemID="{418ACE4E-FE3B-4222-954F-8B6FB3B3C39D}">
+<ds:datastoreItem xmlns:ds="http://schemas.openxmlformats.org/officeDocument/2006/customXml" ds:itemID="{7D7821C7-8286-45CE-80AB-C1F96CF7FAE7}">
   <ds:schemaRefs>
     <ds:schemaRef ds:uri="http://schemas.openxmlformats.org/officeDocument/2006/bibliography"/>
   </ds:schemaRefs>

</xml_diff>